<commit_message>
fix: render R1 DOCX tables and section numbers correctly in Word
Expand multicolumn sub-headers into cells, drop cmidrule specs that Pandoc
printed as text, and number sections so in-text section references resolve.
Checked by exporting the DOCX to PDF with Microsoft Word.
</commit_message>
<xml_diff>
--- a/paper/r1/KEYSTONE_R1.docx
+++ b/paper/r1/KEYSTONE_R1.docx
@@ -269,6 +269,15 @@
       <w:pPr>
         <w:pStyle w:val="Heading1"/>
       </w:pPr>
+      <w:r>
+        <w:rPr>
+          <w:rStyle w:val="SectionNumber"/>
+        </w:rPr>
+        <w:t xml:space="preserve">1</w:t>
+      </w:r>
+      <w:r>
+        <w:tab/>
+      </w:r>
       <w:r>
         <w:t xml:space="preserve">Introduction</w:t>
       </w:r>
@@ -431,6 +440,15 @@
         <w:pStyle w:val="Heading1"/>
       </w:pPr>
       <w:r>
+        <w:rPr>
+          <w:rStyle w:val="SectionNumber"/>
+        </w:rPr>
+        <w:t xml:space="preserve">2</w:t>
+      </w:r>
+      <w:r>
+        <w:tab/>
+      </w:r>
+      <w:r>
         <w:t xml:space="preserve">Background and Related Work</w:t>
       </w:r>
     </w:p>
@@ -519,6 +537,15 @@
         <w:pStyle w:val="Heading1"/>
       </w:pPr>
       <w:r>
+        <w:rPr>
+          <w:rStyle w:val="SectionNumber"/>
+        </w:rPr>
+        <w:t xml:space="preserve">3</w:t>
+      </w:r>
+      <w:r>
+        <w:tab/>
+      </w:r>
+      <w:r>
         <w:t xml:space="preserve">System and Threat Model</w:t>
       </w:r>
     </w:p>
@@ -527,6 +554,15 @@
       <w:pPr>
         <w:pStyle w:val="Heading2"/>
       </w:pPr>
+      <w:r>
+        <w:rPr>
+          <w:rStyle w:val="SectionNumber"/>
+        </w:rPr>
+        <w:t xml:space="preserve">3.1</w:t>
+      </w:r>
+      <w:r>
+        <w:tab/>
+      </w:r>
       <w:r>
         <w:t xml:space="preserve">Entities and records</w:t>
       </w:r>
@@ -828,6 +864,15 @@
       <w:pPr>
         <w:pStyle w:val="Heading2"/>
       </w:pPr>
+      <w:r>
+        <w:rPr>
+          <w:rStyle w:val="SectionNumber"/>
+        </w:rPr>
+        <w:t xml:space="preserve">3.2</w:t>
+      </w:r>
+      <w:r>
+        <w:tab/>
+      </w:r>
       <w:r>
         <w:t xml:space="preserve">Readiness and security properties</w:t>
       </w:r>
@@ -1909,6 +1954,15 @@
         <w:pStyle w:val="Heading2"/>
       </w:pPr>
       <w:r>
+        <w:rPr>
+          <w:rStyle w:val="SectionNumber"/>
+        </w:rPr>
+        <w:t xml:space="preserve">3.3</w:t>
+      </w:r>
+      <w:r>
+        <w:tab/>
+      </w:r>
+      <w:r>
         <w:t xml:space="preserve">Adversaries and exclusions</w:t>
       </w:r>
     </w:p>
@@ -1942,6 +1996,15 @@
         <w:pStyle w:val="Heading1"/>
       </w:pPr>
       <w:r>
+        <w:rPr>
+          <w:rStyle w:val="SectionNumber"/>
+        </w:rPr>
+        <w:t xml:space="preserve">4</w:t>
+      </w:r>
+      <w:r>
+        <w:tab/>
+      </w:r>
+      <w:r>
         <w:t xml:space="preserve">KEYSTONE Protocol</w:t>
       </w:r>
     </w:p>
@@ -1950,6 +2013,15 @@
       <w:pPr>
         <w:pStyle w:val="Heading4"/>
       </w:pPr>
+      <w:r>
+        <w:rPr>
+          <w:rStyle w:val="SectionNumber"/>
+        </w:rPr>
+        <w:t xml:space="preserve">4.0.0.1</w:t>
+      </w:r>
+      <w:r>
+        <w:tab/>
+      </w:r>
       <w:r>
         <w:t xml:space="preserve">Epoch setup and sealing.</w:t>
       </w:r>
@@ -2089,6 +2161,15 @@
       <w:pPr>
         <w:pStyle w:val="Heading4"/>
       </w:pPr>
+      <w:r>
+        <w:rPr>
+          <w:rStyle w:val="SectionNumber"/>
+        </w:rPr>
+        <w:t xml:space="preserve">4.0.0.2</w:t>
+      </w:r>
+      <w:r>
+        <w:tab/>
+      </w:r>
       <w:r>
         <w:t xml:space="preserve">Non-production readiness audit.</w:t>
       </w:r>
@@ -2532,6 +2613,15 @@
         <w:pStyle w:val="Heading4"/>
       </w:pPr>
       <w:r>
+        <w:rPr>
+          <w:rStyle w:val="SectionNumber"/>
+        </w:rPr>
+        <w:t xml:space="preserve">4.0.0.3</w:t>
+      </w:r>
+      <w:r>
+        <w:tab/>
+      </w:r>
+      <w:r>
         <w:t xml:space="preserve">Authorized dispute release.</w:t>
       </w:r>
     </w:p>
@@ -2764,6 +2854,15 @@
         <w:pStyle w:val="Heading1"/>
       </w:pPr>
       <w:r>
+        <w:rPr>
+          <w:rStyle w:val="SectionNumber"/>
+        </w:rPr>
+        <w:t xml:space="preserve">5</w:t>
+      </w:r>
+      <w:r>
+        <w:tab/>
+      </w:r>
+      <w:r>
         <w:t xml:space="preserve">Analysis</w:t>
       </w:r>
     </w:p>
@@ -2772,6 +2871,15 @@
       <w:pPr>
         <w:pStyle w:val="Heading2"/>
       </w:pPr>
+      <w:r>
+        <w:rPr>
+          <w:rStyle w:val="SectionNumber"/>
+        </w:rPr>
+        <w:t xml:space="preserve">5.1</w:t>
+      </w:r>
+      <w:r>
+        <w:tab/>
+      </w:r>
       <w:r>
         <w:t xml:space="preserve">Static catastrophic false acceptance</w:t>
       </w:r>
@@ -3993,6 +4101,15 @@
         <w:pStyle w:val="Heading2"/>
       </w:pPr>
       <w:r>
+        <w:rPr>
+          <w:rStyle w:val="SectionNumber"/>
+        </w:rPr>
+        <w:t xml:space="preserve">5.2</w:t>
+      </w:r>
+      <w:r>
+        <w:tab/>
+      </w:r>
+      <w:r>
         <w:t xml:space="preserve">Three non-implication witnesses</w:t>
       </w:r>
     </w:p>
@@ -4192,6 +4309,15 @@
         <w:pStyle w:val="Heading2"/>
       </w:pPr>
       <w:r>
+        <w:rPr>
+          <w:rStyle w:val="SectionNumber"/>
+        </w:rPr>
+        <w:t xml:space="preserve">5.3</w:t>
+      </w:r>
+      <w:r>
+        <w:tab/>
+      </w:r>
+      <w:r>
         <w:t xml:space="preserve">The acceptance-rule trade-off</w:t>
       </w:r>
     </w:p>
@@ -4642,7 +4768,7 @@
       <w:tblPr>
         <w:tblStyle w:val="Table"/>
         <w:tblW w:type="auto" w:w="0"/>
-        <w:tblLook w:firstRow="1" w:lastRow="0" w:firstColumn="0" w:lastColumn="0" w:noHBand="0" w:noVBand="0" w:val="0020"/>
+        <w:tblLook w:firstRow="0" w:lastRow="0" w:firstColumn="0" w:lastColumn="0" w:noHBand="0" w:noVBand="0" w:val="0000"/>
         <w:tblCaption w:val="Table 2. Exact acceptance-rule trade-off at n=32, t=22: worst-case catastrophic detection (r=t-1) versus the probability that a healthy committee passes under IID unavailability f. Post hoc analysis."/>
       </w:tblPr>
       <w:tblGrid>
@@ -4654,9 +4780,6 @@
         <w:gridCol w:w="1320"/>
       </w:tblGrid>
       <w:tr>
-        <w:trPr>
-          <w:tblHeader w:val="on"/>
-        </w:trPr>
         <w:tc>
           <w:tcPr/>
           <w:p>
@@ -4686,17 +4809,31 @@
           </w:p>
         </w:tc>
         <w:tc>
-          <w:tcPr>
-            <w:gridSpan w:val="3"/>
-          </w:tcPr>
-          <w:p>
-            <w:pPr>
-              <w:pStyle w:val="Compact"/>
-              <w:jc w:val="center"/>
+          <w:tcPr/>
+          <w:p>
+            <w:pPr>
+              <w:pStyle w:val="Compact"/>
+              <w:jc w:val="right"/>
             </w:pPr>
             <w:r>
               <w:t xml:space="preserve">Benign audit pass under IID unavailability</w:t>
             </w:r>
+          </w:p>
+        </w:tc>
+        <w:tc>
+          <w:tcPr/>
+          <w:p>
+            <w:pPr>
+              <w:pStyle w:val="Compact"/>
+            </w:pPr>
+          </w:p>
+        </w:tc>
+        <w:tc>
+          <w:tcPr/>
+          <w:p>
+            <w:pPr>
+              <w:pStyle w:val="Compact"/>
+            </w:pPr>
           </w:p>
         </w:tc>
       </w:tr>
@@ -4708,17 +4845,14 @@
               <w:pStyle w:val="Compact"/>
               <w:jc w:val="right"/>
             </w:pPr>
-            <w:r>
-              <w:t xml:space="preserve">4-6</w:t>
-            </w:r>
-            <w:r>
-              <w:t xml:space="preserve"> </w:t>
-            </w:r>
             <m:oMath>
               <m:r>
                 <m:t>s</m:t>
               </m:r>
             </m:oMath>
+            <w:r>
+              <w:t xml:space="preserve">​</w:t>
+            </w:r>
           </w:p>
         </w:tc>
         <w:tc>
@@ -5505,6 +5639,15 @@
         <w:pStyle w:val="Heading1"/>
       </w:pPr>
       <w:r>
+        <w:rPr>
+          <w:rStyle w:val="SectionNumber"/>
+        </w:rPr>
+        <w:t xml:space="preserve">6</w:t>
+      </w:r>
+      <w:r>
+        <w:tab/>
+      </w:r>
+      <w:r>
         <w:t xml:space="preserve">Evaluation</w:t>
       </w:r>
     </w:p>
@@ -5513,6 +5656,15 @@
       <w:pPr>
         <w:pStyle w:val="Heading2"/>
       </w:pPr>
+      <w:r>
+        <w:rPr>
+          <w:rStyle w:val="SectionNumber"/>
+        </w:rPr>
+        <w:t xml:space="preserve">6.1</w:t>
+      </w:r>
+      <w:r>
+        <w:tab/>
+      </w:r>
       <w:r>
         <w:t xml:space="preserve">Method and evidence labels</w:t>
       </w:r>
@@ -7014,6 +7166,15 @@
         <w:pStyle w:val="Heading2"/>
       </w:pPr>
       <w:r>
+        <w:rPr>
+          <w:rStyle w:val="SectionNumber"/>
+        </w:rPr>
+        <w:t xml:space="preserve">6.2</w:t>
+      </w:r>
+      <w:r>
+        <w:tab/>
+      </w:r>
+      <w:r>
         <w:t xml:space="preserve">Comparison with readiness baselines</w:t>
       </w:r>
     </w:p>
@@ -7589,6 +7750,15 @@
       <w:pPr>
         <w:pStyle w:val="Heading2"/>
       </w:pPr>
+      <w:r>
+        <w:rPr>
+          <w:rStyle w:val="SectionNumber"/>
+        </w:rPr>
+        <w:t xml:space="preserve">6.3</w:t>
+      </w:r>
+      <w:r>
+        <w:tab/>
+      </w:r>
       <w:r>
         <w:t xml:space="preserve">Robustness under failure scenarios</w:t>
       </w:r>
@@ -7795,7 +7965,29 @@
           <w:p>
             <w:pPr>
               <w:pStyle w:val="Compact"/>
-            </w:pPr>
+              <w:jc w:val="left"/>
+            </w:pPr>
+            <w:r>
+              <w:rPr>
+                <w:i/>
+                <w:iCs/>
+              </w:rPr>
+              <w:t xml:space="preserve">(a) PC03 prespecified simulation, 131</w:t>
+            </w:r>
+            <w:r>
+              <w:rPr>
+                <w:i/>
+                <w:iCs/>
+              </w:rPr>
+              <w:t xml:space="preserve">,</w:t>
+            </w:r>
+            <w:r>
+              <w:rPr>
+                <w:i/>
+                <w:iCs/>
+              </w:rPr>
+              <w:t xml:space="preserve">072 draws per cell, 95% Wilson intervals</w:t>
+            </w:r>
           </w:p>
         </w:tc>
         <w:tc>
@@ -8141,7 +8333,55 @@
           <w:p>
             <w:pPr>
               <w:pStyle w:val="Compact"/>
-            </w:pPr>
+              <w:jc w:val="left"/>
+            </w:pPr>
+            <w:r>
+              <w:rPr>
+                <w:i/>
+                <w:iCs/>
+              </w:rPr>
+              <w:t xml:space="preserve">(b) Emulated deadline testbed, ffdhe2048; dispute success by the primary</w:t>
+            </w:r>
+            <w:r>
+              <w:rPr>
+                <w:i/>
+                <w:iCs/>
+              </w:rPr>
+              <w:t xml:space="preserve"> </w:t>
+            </w:r>
+            <m:oMath>
+              <m:sSub>
+                <m:e>
+                  <m:r>
+                    <m:rPr>
+                      <m:sty m:val="p"/>
+                    </m:rPr>
+                    <m:t>Δ</m:t>
+                  </m:r>
+                </m:e>
+                <m:sub>
+                  <m:r>
+                    <m:t>d</m:t>
+                  </m:r>
+                </m:sub>
+              </m:sSub>
+              <m:r>
+                <m:rPr>
+                  <m:sty m:val="p"/>
+                </m:rPr>
+                <m:t>=</m:t>
+              </m:r>
+              <m:r>
+                <m:t>2</m:t>
+              </m:r>
+            </m:oMath>
+            <w:r>
+              <w:rPr>
+                <w:i/>
+                <w:iCs/>
+              </w:rPr>
+              <w:t xml:space="preserve"> s and by 5 s, 95% Wilson intervals</w:t>
+            </w:r>
           </w:p>
         </w:tc>
         <w:tc>
@@ -9111,6 +9351,15 @@
         <w:pStyle w:val="Heading2"/>
       </w:pPr>
       <w:r>
+        <w:rPr>
+          <w:rStyle w:val="SectionNumber"/>
+        </w:rPr>
+        <w:t xml:space="preserve">6.4</w:t>
+      </w:r>
+      <w:r>
+        <w:tab/>
+      </w:r>
+      <w:r>
         <w:t xml:space="preserve">Deadline liveness in an emulated testbed</w:t>
       </w:r>
     </w:p>
@@ -9396,6 +9645,15 @@
         <w:pStyle w:val="Heading2"/>
       </w:pPr>
       <w:r>
+        <w:rPr>
+          <w:rStyle w:val="SectionNumber"/>
+        </w:rPr>
+        <w:t xml:space="preserve">6.5</w:t>
+      </w:r>
+      <w:r>
+        <w:tab/>
+      </w:r>
+      <w:r>
         <w:t xml:space="preserve">Performance and scalability</w:t>
       </w:r>
     </w:p>
@@ -9600,7 +9858,7 @@
       <w:tblPr>
         <w:tblStyle w:val="Table"/>
         <w:tblW w:type="auto" w:w="0"/>
-        <w:tblLook w:firstRow="1" w:lastRow="0" w:firstColumn="0" w:lastColumn="0" w:noHBand="0" w:noVBand="0" w:val="0020"/>
+        <w:tblLook w:firstRow="0" w:lastRow="0" w:firstColumn="0" w:lastColumn="0" w:noHBand="0" w:noVBand="0" w:val="0000"/>
         <w:tblCaption w:val="Table 6. Scalability with t=n-\lfloor(n-1)/3\rfloor. Detection is exact (Eq. (2), q=s). Audit CPU is s proofs plus s verifications; bytes are one request plus s responses. Dispute time is measured verification of t partials plus combination."/>
       </w:tblPr>
       <w:tblGrid>
@@ -9614,49 +9872,44 @@
         <w:gridCol w:w="990"/>
       </w:tblGrid>
       <w:tr>
-        <w:trPr>
-          <w:tblHeader w:val="on"/>
-        </w:trPr>
-        <w:tc>
-          <w:tcPr/>
-          <w:p>
-            <w:pPr>
-              <w:pStyle w:val="Compact"/>
-            </w:pPr>
-          </w:p>
-        </w:tc>
-        <w:tc>
-          <w:tcPr/>
-          <w:p>
-            <w:pPr>
-              <w:pStyle w:val="Compact"/>
-            </w:pPr>
-          </w:p>
-        </w:tc>
-        <w:tc>
-          <w:tcPr/>
-          <w:p>
-            <w:pPr>
-              <w:pStyle w:val="Compact"/>
-            </w:pPr>
-          </w:p>
-        </w:tc>
-        <w:tc>
-          <w:tcPr/>
-          <w:p>
-            <w:pPr>
-              <w:pStyle w:val="Compact"/>
-            </w:pPr>
-          </w:p>
-        </w:tc>
-        <w:tc>
-          <w:tcPr>
-            <w:gridSpan w:val="2"/>
-          </w:tcPr>
-          <w:p>
-            <w:pPr>
-              <w:pStyle w:val="Compact"/>
-              <w:jc w:val="center"/>
+        <w:tc>
+          <w:tcPr/>
+          <w:p>
+            <w:pPr>
+              <w:pStyle w:val="Compact"/>
+            </w:pPr>
+          </w:p>
+        </w:tc>
+        <w:tc>
+          <w:tcPr/>
+          <w:p>
+            <w:pPr>
+              <w:pStyle w:val="Compact"/>
+            </w:pPr>
+          </w:p>
+        </w:tc>
+        <w:tc>
+          <w:tcPr/>
+          <w:p>
+            <w:pPr>
+              <w:pStyle w:val="Compact"/>
+            </w:pPr>
+          </w:p>
+        </w:tc>
+        <w:tc>
+          <w:tcPr/>
+          <w:p>
+            <w:pPr>
+              <w:pStyle w:val="Compact"/>
+            </w:pPr>
+          </w:p>
+        </w:tc>
+        <w:tc>
+          <w:tcPr/>
+          <w:p>
+            <w:pPr>
+              <w:pStyle w:val="Compact"/>
+              <w:jc w:val="right"/>
             </w:pPr>
             <w:r>
               <w:t xml:space="preserve">Audit, ffdhe2048</w:t>
@@ -9664,13 +9917,19 @@
           </w:p>
         </w:tc>
         <w:tc>
-          <w:tcPr>
-            <w:gridSpan w:val="2"/>
-          </w:tcPr>
-          <w:p>
-            <w:pPr>
-              <w:pStyle w:val="Compact"/>
-              <w:jc w:val="center"/>
+          <w:tcPr/>
+          <w:p>
+            <w:pPr>
+              <w:pStyle w:val="Compact"/>
+            </w:pPr>
+          </w:p>
+        </w:tc>
+        <w:tc>
+          <w:tcPr/>
+          <w:p>
+            <w:pPr>
+              <w:pStyle w:val="Compact"/>
+              <w:jc w:val="right"/>
             </w:pPr>
             <w:r>
               <w:t xml:space="preserve">Dispute: verify</w:t>
@@ -9689,6 +9948,14 @@
             <w:r>
               <w:t xml:space="preserve">+ combine</w:t>
             </w:r>
+          </w:p>
+        </w:tc>
+        <w:tc>
+          <w:tcPr/>
+          <w:p>
+            <w:pPr>
+              <w:pStyle w:val="Compact"/>
+            </w:pPr>
           </w:p>
         </w:tc>
       </w:tr>
@@ -9700,23 +9967,14 @@
               <w:pStyle w:val="Compact"/>
               <w:jc w:val="right"/>
             </w:pPr>
-            <w:r>
-              <w:t xml:space="preserve">5-6</w:t>
-            </w:r>
-            <w:r>
-              <w:t xml:space="preserve">(lr)</w:t>
-            </w:r>
-            <w:r>
-              <w:t xml:space="preserve">7-8</w:t>
-            </w:r>
-            <w:r>
-              <w:t xml:space="preserve"> </w:t>
-            </w:r>
             <m:oMath>
               <m:r>
                 <m:t>n</m:t>
               </m:r>
             </m:oMath>
+            <w:r>
+              <w:t xml:space="preserve">​</w:t>
+            </w:r>
           </w:p>
         </w:tc>
         <w:tc>
@@ -10995,6 +11253,15 @@
         <w:pStyle w:val="Heading1"/>
       </w:pPr>
       <w:r>
+        <w:rPr>
+          <w:rStyle w:val="SectionNumber"/>
+        </w:rPr>
+        <w:t xml:space="preserve">7</w:t>
+      </w:r>
+      <w:r>
+        <w:tab/>
+      </w:r>
+      <w:r>
         <w:t xml:space="preserve">Discussion</w:t>
       </w:r>
     </w:p>
@@ -11114,6 +11381,15 @@
       <w:pPr>
         <w:pStyle w:val="Heading1"/>
       </w:pPr>
+      <w:r>
+        <w:rPr>
+          <w:rStyle w:val="SectionNumber"/>
+        </w:rPr>
+        <w:t xml:space="preserve">8</w:t>
+      </w:r>
+      <w:r>
+        <w:tab/>
+      </w:r>
       <w:r>
         <w:t xml:space="preserve">Limitations</w:t>
       </w:r>
@@ -11279,6 +11555,15 @@
       <w:pPr>
         <w:pStyle w:val="Heading1"/>
       </w:pPr>
+      <w:r>
+        <w:rPr>
+          <w:rStyle w:val="SectionNumber"/>
+        </w:rPr>
+        <w:t xml:space="preserve">9</w:t>
+      </w:r>
+      <w:r>
+        <w:tab/>
+      </w:r>
       <w:r>
         <w:t xml:space="preserve">Conclusion</w:t>
       </w:r>

</xml_diff>

<commit_message>
fix: keep R1 DOCX tables on one page and add Word-rendered PDFs
Mark table rows unsplittable and keep-with-next, keep run-in paragraph
headings unnumbered, correct the deviation count in the response letter,
and add PDFs exported by Microsoft Word from the DOCX files.
</commit_message>
<xml_diff>
--- a/paper/r1/KEYSTONE_R1.docx
+++ b/paper/r1/KEYSTONE_R1.docx
@@ -1154,6 +1154,7 @@
     <w:p>
       <w:pPr>
         <w:pStyle w:val="TableCaption"/>
+        <w:keepNext/>
       </w:pPr>
       <w:r>
         <w:t xml:space="preserve">Table 1. Properties separated by KEYSTONE, how each is assessed in this paper, and the evidence type.</w:t>
@@ -1175,6 +1176,7 @@
       <w:tr>
         <w:trPr>
           <w:tblHeader w:val="on"/>
+          <w:cantSplit/>
         </w:trPr>
         <w:tc>
           <w:tcPr/>
@@ -1182,6 +1184,7 @@
             <w:pPr>
               <w:pStyle w:val="Compact"/>
               <w:jc w:val="left"/>
+              <w:keepNext/>
             </w:pPr>
             <w:r>
               <w:t xml:space="preserve">Property</w:t>
@@ -1194,6 +1197,7 @@
             <w:pPr>
               <w:pStyle w:val="Compact"/>
               <w:jc w:val="left"/>
+              <w:keepNext/>
             </w:pPr>
             <w:r>
               <w:t xml:space="preserve">Meaning</w:t>
@@ -1206,6 +1210,7 @@
             <w:pPr>
               <w:pStyle w:val="Compact"/>
               <w:jc w:val="left"/>
+              <w:keepNext/>
             </w:pPr>
             <w:r>
               <w:t xml:space="preserve">Assessed by</w:t>
@@ -1218,6 +1223,7 @@
             <w:pPr>
               <w:pStyle w:val="Compact"/>
               <w:jc w:val="left"/>
+              <w:keepNext/>
             </w:pPr>
             <w:r>
               <w:t xml:space="preserve">Evidence type</w:t>
@@ -1226,12 +1232,16 @@
         </w:tc>
       </w:tr>
       <w:tr>
+        <w:trPr>
+          <w:cantSplit/>
+        </w:trPr>
         <w:tc>
           <w:tcPr/>
           <w:p>
             <w:pPr>
               <w:pStyle w:val="Compact"/>
               <w:jc w:val="left"/>
+              <w:keepNext/>
             </w:pPr>
             <w:r>
               <w:t xml:space="preserve">Ciphertext availability (</w:t>
@@ -1261,6 +1271,7 @@
             <w:pPr>
               <w:pStyle w:val="Compact"/>
               <w:jc w:val="left"/>
+              <w:keepNext/>
             </w:pPr>
             <w:r>
               <w:t xml:space="preserve">Encrypted record and receipt bytes are retrievable from the DA layer</w:t>
@@ -1273,6 +1284,7 @@
             <w:pPr>
               <w:pStyle w:val="Compact"/>
               <w:jc w:val="left"/>
+              <w:keepNext/>
             </w:pPr>
             <w:r>
               <w:t xml:space="preserve">Assumed (provided by the DA layer); contrast class</w:t>
@@ -1285,6 +1297,7 @@
             <w:pPr>
               <w:pStyle w:val="Compact"/>
               <w:jc w:val="left"/>
+              <w:keepNext/>
             </w:pPr>
             <w:r>
               <w:t xml:space="preserve">Assumption</w:t>
@@ -1293,12 +1306,16 @@
         </w:tc>
       </w:tr>
       <w:tr>
+        <w:trPr>
+          <w:cantSplit/>
+        </w:trPr>
         <w:tc>
           <w:tcPr/>
           <w:p>
             <w:pPr>
               <w:pStyle w:val="Compact"/>
               <w:jc w:val="left"/>
+              <w:keepNext/>
             </w:pPr>
             <w:r>
               <w:t xml:space="preserve">Valid-share registration</w:t>
@@ -1311,6 +1328,7 @@
             <w:pPr>
               <w:pStyle w:val="Compact"/>
               <w:jc w:val="left"/>
+              <w:keepNext/>
             </w:pPr>
             <w:r>
               <w:t xml:space="preserve">Registered shares are consistent with one epoch key (DKG/VSS/PVSS)</w:t>
@@ -1323,6 +1341,7 @@
             <w:pPr>
               <w:pStyle w:val="Compact"/>
               <w:jc w:val="left"/>
+              <w:keepNext/>
             </w:pPr>
             <w:r>
               <w:t xml:space="preserve">Feldman commitment checks at keygen</w:t>
@@ -1335,6 +1354,7 @@
             <w:pPr>
               <w:pStyle w:val="Compact"/>
               <w:jc w:val="left"/>
+              <w:keepNext/>
             </w:pPr>
             <w:r>
               <w:t xml:space="preserve">Prototype tests</w:t>
@@ -1343,12 +1363,16 @@
         </w:tc>
       </w:tr>
       <w:tr>
+        <w:trPr>
+          <w:cantSplit/>
+        </w:trPr>
         <w:tc>
           <w:tcPr/>
           <w:p>
             <w:pPr>
               <w:pStyle w:val="Compact"/>
               <w:jc w:val="left"/>
+              <w:keepNext/>
             </w:pPr>
             <w:r>
               <w:t xml:space="preserve">Audit-time readiness (</w:t>
@@ -1384,6 +1408,7 @@
             <w:pPr>
               <w:pStyle w:val="Compact"/>
               <w:jc w:val="left"/>
+              <w:keepNext/>
             </w:pPr>
             <w:r>
               <w:t xml:space="preserve">At least</w:t>
@@ -1424,6 +1449,7 @@
             <w:pPr>
               <w:pStyle w:val="Compact"/>
               <w:jc w:val="left"/>
+              <w:keepNext/>
             </w:pPr>
             <w:r>
               <w:t xml:space="preserve">Eq. (1); Tables 5, 2</w:t>
@@ -1436,6 +1462,7 @@
             <w:pPr>
               <w:pStyle w:val="Compact"/>
               <w:jc w:val="left"/>
+              <w:keepNext/>
             </w:pPr>
             <w:r>
               <w:t xml:space="preserve">Exact; simulation; emulation</w:t>
@@ -1444,12 +1471,16 @@
         </w:tc>
       </w:tr>
       <w:tr>
+        <w:trPr>
+          <w:cantSplit/>
+        </w:trPr>
         <w:tc>
           <w:tcPr/>
           <w:p>
             <w:pPr>
               <w:pStyle w:val="Compact"/>
               <w:jc w:val="left"/>
+              <w:keepNext/>
             </w:pPr>
             <w:r>
               <w:t xml:space="preserve">Authorized decryptability</w:t>
@@ -1462,6 +1493,7 @@
             <w:pPr>
               <w:pStyle w:val="Compact"/>
               <w:jc w:val="left"/>
+              <w:keepNext/>
             </w:pPr>
             <w:r>
               <w:t xml:space="preserve">After authorization, the combiner obtains</w:t>
@@ -1505,6 +1537,7 @@
             <w:pPr>
               <w:pStyle w:val="Compact"/>
               <w:jc w:val="left"/>
+              <w:keepNext/>
             </w:pPr>
             <w:r>
               <w:t xml:space="preserve">Prototype open path; Table 5</w:t>
@@ -1517,6 +1550,7 @@
             <w:pPr>
               <w:pStyle w:val="Compact"/>
               <w:jc w:val="left"/>
+              <w:keepNext/>
             </w:pPr>
             <w:r>
               <w:t xml:space="preserve">Tests; emulation</w:t>
@@ -1525,12 +1559,16 @@
         </w:tc>
       </w:tr>
       <w:tr>
+        <w:trPr>
+          <w:cantSplit/>
+        </w:trPr>
         <w:tc>
           <w:tcPr/>
           <w:p>
             <w:pPr>
               <w:pStyle w:val="Compact"/>
               <w:jc w:val="left"/>
+              <w:keepNext/>
             </w:pPr>
             <w:r>
               <w:t xml:space="preserve">Deadline liveness (</w:t>
@@ -1566,6 +1604,7 @@
             <w:pPr>
               <w:pStyle w:val="Compact"/>
               <w:jc w:val="left"/>
+              <w:keepNext/>
             </w:pPr>
             <w:r>
               <w:t xml:space="preserve">Authorized decryptability completes by</w:t>
@@ -1598,6 +1637,7 @@
             <w:pPr>
               <w:pStyle w:val="Compact"/>
               <w:jc w:val="left"/>
+              <w:keepNext/>
             </w:pPr>
             <w:r>
               <w:t xml:space="preserve">Figure 3; Table 5(b)</w:t>
@@ -1610,6 +1650,7 @@
             <w:pPr>
               <w:pStyle w:val="Compact"/>
               <w:jc w:val="left"/>
+              <w:keepNext/>
             </w:pPr>
             <w:r>
               <w:t xml:space="preserve">Single-host emulation</w:t>
@@ -1618,12 +1659,16 @@
         </w:tc>
       </w:tr>
       <w:tr>
+        <w:trPr>
+          <w:cantSplit/>
+        </w:trPr>
         <w:tc>
           <w:tcPr/>
           <w:p>
             <w:pPr>
               <w:pStyle w:val="Compact"/>
               <w:jc w:val="left"/>
+              <w:keepNext/>
             </w:pPr>
             <w:r>
               <w:t xml:space="preserve">Pre-authorization confidentiality (</w:t>
@@ -1659,6 +1704,7 @@
             <w:pPr>
               <w:pStyle w:val="Compact"/>
               <w:jc w:val="left"/>
+              <w:keepNext/>
             </w:pPr>
             <w:r>
               <w:t xml:space="preserve">With fewer than</w:t>
@@ -1708,6 +1754,7 @@
             <w:pPr>
               <w:pStyle w:val="Compact"/>
               <w:jc w:val="left"/>
+              <w:keepNext/>
             </w:pPr>
             <w:r>
               <w:t xml:space="preserve">Inherited from the threshold KEM</w:t>
@@ -1746,6 +1793,7 @@
             <w:pPr>
               <w:pStyle w:val="Compact"/>
               <w:jc w:val="left"/>
+              <w:keepNext/>
             </w:pPr>
             <w:r>
               <w:t xml:space="preserve">Design argument</w:t>
@@ -1754,6 +1802,9 @@
         </w:tc>
       </w:tr>
       <w:tr>
+        <w:trPr>
+          <w:cantSplit/>
+        </w:trPr>
         <w:tc>
           <w:tcPr/>
           <w:p>
@@ -1990,7 +2041,7 @@
     </w:p>
     <w:bookmarkEnd w:id="19"/>
     <w:bookmarkEnd w:id="20"/>
-    <w:bookmarkStart w:id="24" w:name="sec:protocol"/>
+    <w:bookmarkStart w:id="21" w:name="sec:protocol"/>
     <w:p>
       <w:pPr>
         <w:pStyle w:val="Heading1"/>
@@ -2006,30 +2057,22 @@
       </w:r>
       <w:r>
         <w:t xml:space="preserve">KEYSTONE Protocol</w:t>
-      </w:r>
-    </w:p>
-    <w:bookmarkStart w:id="21" w:name="epoch-setup-and-sealing."/>
-    <w:p>
-      <w:pPr>
-        <w:pStyle w:val="Heading4"/>
-      </w:pPr>
-      <w:r>
-        <w:rPr>
-          <w:rStyle w:val="SectionNumber"/>
-        </w:rPr>
-        <w:t xml:space="preserve">4.0.0.1</w:t>
-      </w:r>
-      <w:r>
-        <w:tab/>
-      </w:r>
-      <w:r>
-        <w:t xml:space="preserve">Epoch setup and sealing.</w:t>
       </w:r>
     </w:p>
     <w:p>
       <w:pPr>
         <w:pStyle w:val="FirstParagraph"/>
       </w:pPr>
+      <w:r>
+        <w:rPr>
+          <w:b/>
+          <w:bCs/>
+        </w:rPr>
+        <w:t xml:space="preserve">Epoch setup and sealing.</w:t>
+      </w:r>
+      <w:r>
+        <w:t xml:space="preserve"> </w:t>
+      </w:r>
       <w:r>
         <w:t xml:space="preserve">The committee is formed under identity, stake and failure-domain placement policy. A production system would use an authenticated DKG or PVSS; the prototype uses a dealer with Feldman commitments</w:t>
       </w:r>
@@ -2155,29 +2198,20 @@
         <w:t xml:space="preserve">. The envelope binds epoch, record identifier, ciphertext, metadata and DA pointer.</w:t>
       </w:r>
     </w:p>
-    <w:bookmarkEnd w:id="21"/>
-    <w:bookmarkStart w:id="22" w:name="non-production-readiness-audit."/>
     <w:p>
       <w:pPr>
-        <w:pStyle w:val="Heading4"/>
+        <w:pStyle w:val="BodyText"/>
       </w:pPr>
       <w:r>
         <w:rPr>
-          <w:rStyle w:val="SectionNumber"/>
+          <w:b/>
+          <w:bCs/>
         </w:rPr>
-        <w:t xml:space="preserve">4.0.0.2</w:t>
-      </w:r>
-      <w:r>
-        <w:tab/>
-      </w:r>
-      <w:r>
         <w:t xml:space="preserve">Non-production readiness audit.</w:t>
       </w:r>
-    </w:p>
-    <w:p>
-      <w:pPr>
-        <w:pStyle w:val="FirstParagraph"/>
-      </w:pPr>
+      <w:r>
+        <w:t xml:space="preserve"> </w:t>
+      </w:r>
       <w:r>
         <w:t xml:space="preserve">The coordinator commits epoch and audit slot before the beacon is known. The finalized beacon then fixes a uniform or domain-stratified sample</w:t>
       </w:r>
@@ -2606,29 +2640,20 @@
         <w:t xml:space="preserve">as a challenge.</w:t>
       </w:r>
     </w:p>
-    <w:bookmarkEnd w:id="22"/>
-    <w:bookmarkStart w:id="23" w:name="authorized-dispute-release."/>
     <w:p>
       <w:pPr>
-        <w:pStyle w:val="Heading4"/>
+        <w:pStyle w:val="BodyText"/>
       </w:pPr>
       <w:r>
         <w:rPr>
-          <w:rStyle w:val="SectionNumber"/>
+          <w:b/>
+          <w:bCs/>
         </w:rPr>
-        <w:t xml:space="preserve">4.0.0.3</w:t>
-      </w:r>
-      <w:r>
-        <w:tab/>
-      </w:r>
-      <w:r>
         <w:t xml:space="preserve">Authorized dispute release.</w:t>
       </w:r>
-    </w:p>
-    <w:p>
-      <w:pPr>
-        <w:pStyle w:val="FirstParagraph"/>
-      </w:pPr>
+      <w:r>
+        <w:t xml:space="preserve"> </w:t>
+      </w:r>
       <w:r>
         <w:t xml:space="preserve">A dispute starts only after the policy contract binds a record, epoch, authorized verifier set and deadline. Custodians verify the authorization and return</w:t>
       </w:r>
@@ -2846,9 +2871,8 @@
         <w:t xml:space="preserve">, decrypts and runs the authorized verification. The public transcript records valid, invalid, equivocal, stale, unauthorized and missing responses; plaintext release policy stays separate.</w:t>
       </w:r>
     </w:p>
-    <w:bookmarkEnd w:id="23"/>
-    <w:bookmarkEnd w:id="24"/>
-    <w:bookmarkStart w:id="33" w:name="sec:analysis"/>
+    <w:bookmarkEnd w:id="21"/>
+    <w:bookmarkStart w:id="30" w:name="sec:analysis"/>
     <w:p>
       <w:pPr>
         <w:pStyle w:val="Heading1"/>
@@ -2866,7 +2890,7 @@
         <w:t xml:space="preserve">Analysis</w:t>
       </w:r>
     </w:p>
-    <w:bookmarkStart w:id="29" w:name="static-catastrophic-false-acceptance"/>
+    <w:bookmarkStart w:id="26" w:name="static-catastrophic-false-acceptance"/>
     <w:p>
       <w:pPr>
         <w:pStyle w:val="Heading2"/>
@@ -3630,7 +3654,7 @@
         <w:t xml:space="preserve">.</w:t>
       </w:r>
     </w:p>
-    <w:bookmarkStart w:id="28" w:name="fig:detection"/>
+    <w:bookmarkStart w:id="25" w:name="fig:detection"/>
     <w:p>
       <w:pPr>
         <w:pStyle w:val="CaptionedFigure"/>
@@ -3640,18 +3664,18 @@
           <wp:inline>
             <wp:extent cx="5334000" cy="2462530"/>
             <wp:effectExtent b="0" l="0" r="0" t="0"/>
-            <wp:docPr descr="" title="" id="26" name="Picture"/>
+            <wp:docPr descr="" title="" id="23" name="Picture"/>
             <a:graphic>
               <a:graphicData uri="http://schemas.openxmlformats.org/drawingml/2006/picture">
                 <pic:pic>
                   <pic:nvPicPr>
-                    <pic:cNvPr descr="figures/fig2_detection_vs_sample.png" id="27" name="Picture"/>
+                    <pic:cNvPr descr="figures/fig2_detection_vs_sample.png" id="24" name="Picture"/>
                     <pic:cNvPicPr>
                       <a:picLocks noChangeArrowheads="1" noChangeAspect="1"/>
                     </pic:cNvPicPr>
                   </pic:nvPicPr>
                   <pic:blipFill>
-                    <a:blip r:embed="rId25"/>
+                    <a:blip r:embed="rId22"/>
                     <a:stretch>
                       <a:fillRect/>
                     </a:stretch>
@@ -4093,9 +4117,9 @@
         <w:t xml:space="preserve">are listed in Table 6.</w:t>
       </w:r>
     </w:p>
-    <w:bookmarkEnd w:id="28"/>
-    <w:bookmarkEnd w:id="29"/>
-    <w:bookmarkStart w:id="30" w:name="three-non-implication-witnesses"/>
+    <w:bookmarkEnd w:id="25"/>
+    <w:bookmarkEnd w:id="26"/>
+    <w:bookmarkStart w:id="27" w:name="three-non-implication-witnesses"/>
     <w:p>
       <w:pPr>
         <w:pStyle w:val="Heading2"/>
@@ -4302,8 +4326,8 @@
         <w:t xml:space="preserve">: enough custodians may become unavailable after the last audit.</w:t>
       </w:r>
     </w:p>
-    <w:bookmarkEnd w:id="30"/>
-    <w:bookmarkStart w:id="32" w:name="the-acceptance-rule-trade-off"/>
+    <w:bookmarkEnd w:id="27"/>
+    <w:bookmarkStart w:id="29" w:name="the-acceptance-rule-trade-off"/>
     <w:p>
       <w:pPr>
         <w:pStyle w:val="Heading2"/>
@@ -4678,10 +4702,11 @@
         <w:t xml:space="preserve">. This analysis was added after observing the high benign alarm rate in exploratory runs and is reported as design guidance, not as a prespecified result.</w:t>
       </w:r>
     </w:p>
-    <w:bookmarkStart w:id="31" w:name="tab:acceptance"/>
+    <w:bookmarkStart w:id="28" w:name="tab:acceptance"/>
     <w:p>
       <w:pPr>
         <w:pStyle w:val="TableCaption"/>
+        <w:keepNext/>
       </w:pPr>
       <w:r>
         <w:t xml:space="preserve">Table 2. Exact acceptance-rule trade-off at</w:t>
@@ -4780,28 +4805,34 @@
         <w:gridCol w:w="1320"/>
       </w:tblGrid>
       <w:tr>
-        <w:tc>
-          <w:tcPr/>
-          <w:p>
-            <w:pPr>
-              <w:pStyle w:val="Compact"/>
-            </w:pPr>
-          </w:p>
-        </w:tc>
-        <w:tc>
-          <w:tcPr/>
-          <w:p>
-            <w:pPr>
-              <w:pStyle w:val="Compact"/>
-            </w:pPr>
-          </w:p>
-        </w:tc>
-        <w:tc>
-          <w:tcPr/>
-          <w:p>
-            <w:pPr>
-              <w:pStyle w:val="Compact"/>
-              <w:jc w:val="right"/>
+        <w:trPr>
+          <w:cantSplit/>
+        </w:trPr>
+        <w:tc>
+          <w:tcPr/>
+          <w:p>
+            <w:pPr>
+              <w:pStyle w:val="Compact"/>
+              <w:keepNext/>
+            </w:pPr>
+          </w:p>
+        </w:tc>
+        <w:tc>
+          <w:tcPr/>
+          <w:p>
+            <w:pPr>
+              <w:pStyle w:val="Compact"/>
+              <w:keepNext/>
+            </w:pPr>
+          </w:p>
+        </w:tc>
+        <w:tc>
+          <w:tcPr/>
+          <w:p>
+            <w:pPr>
+              <w:pStyle w:val="Compact"/>
+              <w:jc w:val="right"/>
+              <w:keepNext/>
             </w:pPr>
             <w:r>
               <w:t xml:space="preserve">Worst-case</w:t>
@@ -4814,6 +4845,7 @@
             <w:pPr>
               <w:pStyle w:val="Compact"/>
               <w:jc w:val="right"/>
+              <w:keepNext/>
             </w:pPr>
             <w:r>
               <w:t xml:space="preserve">Benign audit pass under IID unavailability</w:t>
@@ -4825,25 +4857,31 @@
           <w:p>
             <w:pPr>
               <w:pStyle w:val="Compact"/>
-            </w:pPr>
-          </w:p>
-        </w:tc>
-        <w:tc>
-          <w:tcPr/>
-          <w:p>
-            <w:pPr>
-              <w:pStyle w:val="Compact"/>
+              <w:keepNext/>
+            </w:pPr>
+          </w:p>
+        </w:tc>
+        <w:tc>
+          <w:tcPr/>
+          <w:p>
+            <w:pPr>
+              <w:pStyle w:val="Compact"/>
+              <w:keepNext/>
             </w:pPr>
           </w:p>
         </w:tc>
       </w:tr>
       <w:tr>
-        <w:tc>
-          <w:tcPr/>
-          <w:p>
-            <w:pPr>
-              <w:pStyle w:val="Compact"/>
-              <w:jc w:val="right"/>
+        <w:trPr>
+          <w:cantSplit/>
+        </w:trPr>
+        <w:tc>
+          <w:tcPr/>
+          <w:p>
+            <w:pPr>
+              <w:pStyle w:val="Compact"/>
+              <w:jc w:val="right"/>
+              <w:keepNext/>
             </w:pPr>
             <m:oMath>
               <m:r>
@@ -4861,6 +4899,7 @@
             <w:pPr>
               <w:pStyle w:val="Compact"/>
               <w:jc w:val="right"/>
+              <w:keepNext/>
             </w:pPr>
             <m:oMath>
               <m:r>
@@ -4878,6 +4917,7 @@
             <w:pPr>
               <w:pStyle w:val="Compact"/>
               <w:jc w:val="right"/>
+              <w:keepNext/>
             </w:pPr>
             <w:r>
               <w:t xml:space="preserve">detection</w:t>
@@ -4890,6 +4930,7 @@
             <w:pPr>
               <w:pStyle w:val="Compact"/>
               <w:jc w:val="right"/>
+              <w:keepNext/>
             </w:pPr>
             <m:oMath>
               <m:r>
@@ -4916,6 +4957,7 @@
             <w:pPr>
               <w:pStyle w:val="Compact"/>
               <w:jc w:val="right"/>
+              <w:keepNext/>
             </w:pPr>
             <m:oMath>
               <m:r>
@@ -4942,6 +4984,7 @@
             <w:pPr>
               <w:pStyle w:val="Compact"/>
               <w:jc w:val="right"/>
+              <w:keepNext/>
             </w:pPr>
             <m:oMath>
               <m:r>
@@ -4964,12 +5007,16 @@
         </w:tc>
       </w:tr>
       <w:tr>
-        <w:tc>
-          <w:tcPr/>
-          <w:p>
-            <w:pPr>
-              <w:pStyle w:val="Compact"/>
-              <w:jc w:val="right"/>
+        <w:trPr>
+          <w:cantSplit/>
+        </w:trPr>
+        <w:tc>
+          <w:tcPr/>
+          <w:p>
+            <w:pPr>
+              <w:pStyle w:val="Compact"/>
+              <w:jc w:val="right"/>
+              <w:keepNext/>
             </w:pPr>
             <w:r>
               <w:t xml:space="preserve">8</w:t>
@@ -4982,6 +5029,7 @@
             <w:pPr>
               <w:pStyle w:val="Compact"/>
               <w:jc w:val="right"/>
+              <w:keepNext/>
             </w:pPr>
             <w:r>
               <w:t xml:space="preserve">6</w:t>
@@ -4994,6 +5042,7 @@
             <w:pPr>
               <w:pStyle w:val="Compact"/>
               <w:jc w:val="right"/>
+              <w:keepNext/>
             </w:pPr>
             <w:r>
               <w:t xml:space="preserve">57.5%</w:t>
@@ -5006,6 +5055,7 @@
             <w:pPr>
               <w:pStyle w:val="Compact"/>
               <w:jc w:val="right"/>
+              <w:keepNext/>
             </w:pPr>
             <w:r>
               <w:t xml:space="preserve">99.4%</w:t>
@@ -5018,6 +5068,7 @@
             <w:pPr>
               <w:pStyle w:val="Compact"/>
               <w:jc w:val="right"/>
+              <w:keepNext/>
             </w:pPr>
             <w:r>
               <w:t xml:space="preserve">96.2%</w:t>
@@ -5030,6 +5081,7 @@
             <w:pPr>
               <w:pStyle w:val="Compact"/>
               <w:jc w:val="right"/>
+              <w:keepNext/>
             </w:pPr>
             <w:r>
               <w:t xml:space="preserve">79.7%</w:t>
@@ -5038,12 +5090,16 @@
         </w:tc>
       </w:tr>
       <w:tr>
-        <w:tc>
-          <w:tcPr/>
-          <w:p>
-            <w:pPr>
-              <w:pStyle w:val="Compact"/>
-              <w:jc w:val="right"/>
+        <w:trPr>
+          <w:cantSplit/>
+        </w:trPr>
+        <w:tc>
+          <w:tcPr/>
+          <w:p>
+            <w:pPr>
+              <w:pStyle w:val="Compact"/>
+              <w:jc w:val="right"/>
+              <w:keepNext/>
             </w:pPr>
             <w:r>
               <w:t xml:space="preserve">8</w:t>
@@ -5056,6 +5112,7 @@
             <w:pPr>
               <w:pStyle w:val="Compact"/>
               <w:jc w:val="right"/>
+              <w:keepNext/>
             </w:pPr>
             <w:r>
               <w:t xml:space="preserve">7</w:t>
@@ -5068,6 +5125,7 @@
             <w:pPr>
               <w:pStyle w:val="Compact"/>
               <w:jc w:val="right"/>
+              <w:keepNext/>
             </w:pPr>
             <w:r>
               <w:t xml:space="preserve">85.9%</w:t>
@@ -5080,6 +5138,7 @@
             <w:pPr>
               <w:pStyle w:val="Compact"/>
               <w:jc w:val="right"/>
+              <w:keepNext/>
             </w:pPr>
             <w:r>
               <w:t xml:space="preserve">94.3%</w:t>
@@ -5092,6 +5151,7 @@
             <w:pPr>
               <w:pStyle w:val="Compact"/>
               <w:jc w:val="right"/>
+              <w:keepNext/>
             </w:pPr>
             <w:r>
               <w:t xml:space="preserve">81.3%</w:t>
@@ -5104,6 +5164,7 @@
             <w:pPr>
               <w:pStyle w:val="Compact"/>
               <w:jc w:val="right"/>
+              <w:keepNext/>
             </w:pPr>
             <w:r>
               <w:t xml:space="preserve">50.3%</w:t>
@@ -5112,12 +5173,16 @@
         </w:tc>
       </w:tr>
       <w:tr>
-        <w:tc>
-          <w:tcPr/>
-          <w:p>
-            <w:pPr>
-              <w:pStyle w:val="Compact"/>
-              <w:jc w:val="right"/>
+        <w:trPr>
+          <w:cantSplit/>
+        </w:trPr>
+        <w:tc>
+          <w:tcPr/>
+          <w:p>
+            <w:pPr>
+              <w:pStyle w:val="Compact"/>
+              <w:jc w:val="right"/>
+              <w:keepNext/>
             </w:pPr>
             <w:r>
               <w:t xml:space="preserve">8</w:t>
@@ -5130,6 +5195,7 @@
             <w:pPr>
               <w:pStyle w:val="Compact"/>
               <w:jc w:val="right"/>
+              <w:keepNext/>
             </w:pPr>
             <w:r>
               <w:t xml:space="preserve">8</w:t>
@@ -5142,6 +5208,7 @@
             <w:pPr>
               <w:pStyle w:val="Compact"/>
               <w:jc w:val="right"/>
+              <w:keepNext/>
             </w:pPr>
             <w:r>
               <w:t xml:space="preserve">98.1%</w:t>
@@ -5154,6 +5221,7 @@
             <w:pPr>
               <w:pStyle w:val="Compact"/>
               <w:jc w:val="right"/>
+              <w:keepNext/>
             </w:pPr>
             <w:r>
               <w:t xml:space="preserve">66.3%</w:t>
@@ -5166,6 +5234,7 @@
             <w:pPr>
               <w:pStyle w:val="Compact"/>
               <w:jc w:val="right"/>
+              <w:keepNext/>
             </w:pPr>
             <w:r>
               <w:t xml:space="preserve">43.0%</w:t>
@@ -5178,6 +5247,7 @@
             <w:pPr>
               <w:pStyle w:val="Compact"/>
               <w:jc w:val="right"/>
+              <w:keepNext/>
             </w:pPr>
             <w:r>
               <w:t xml:space="preserve">16.8%</w:t>
@@ -5186,12 +5256,16 @@
         </w:tc>
       </w:tr>
       <w:tr>
-        <w:tc>
-          <w:tcPr/>
-          <w:p>
-            <w:pPr>
-              <w:pStyle w:val="Compact"/>
-              <w:jc w:val="right"/>
+        <w:trPr>
+          <w:cantSplit/>
+        </w:trPr>
+        <w:tc>
+          <w:tcPr/>
+          <w:p>
+            <w:pPr>
+              <w:pStyle w:val="Compact"/>
+              <w:jc w:val="right"/>
+              <w:keepNext/>
             </w:pPr>
             <w:r>
               <w:t xml:space="preserve">12</w:t>
@@ -5204,6 +5278,7 @@
             <w:pPr>
               <w:pStyle w:val="Compact"/>
               <w:jc w:val="right"/>
+              <w:keepNext/>
             </w:pPr>
             <w:r>
               <w:t xml:space="preserve">10</w:t>
@@ -5216,6 +5291,7 @@
             <w:pPr>
               <w:pStyle w:val="Compact"/>
               <w:jc w:val="right"/>
+              <w:keepNext/>
             </w:pPr>
             <w:r>
               <w:t xml:space="preserve">89.6%</w:t>
@@ -5228,6 +5304,7 @@
             <w:pPr>
               <w:pStyle w:val="Compact"/>
               <w:jc w:val="right"/>
+              <w:keepNext/>
             </w:pPr>
             <w:r>
               <w:t xml:space="preserve">98.0%</w:t>
@@ -5240,6 +5317,7 @@
             <w:pPr>
               <w:pStyle w:val="Compact"/>
               <w:jc w:val="right"/>
+              <w:keepNext/>
             </w:pPr>
             <w:r>
               <w:t xml:space="preserve">88.9%</w:t>
@@ -5252,6 +5330,7 @@
             <w:pPr>
               <w:pStyle w:val="Compact"/>
               <w:jc w:val="right"/>
+              <w:keepNext/>
             </w:pPr>
             <w:r>
               <w:t xml:space="preserve">55.8%</w:t>
@@ -5260,12 +5339,16 @@
         </w:tc>
       </w:tr>
       <w:tr>
-        <w:tc>
-          <w:tcPr/>
-          <w:p>
-            <w:pPr>
-              <w:pStyle w:val="Compact"/>
-              <w:jc w:val="right"/>
+        <w:trPr>
+          <w:cantSplit/>
+        </w:trPr>
+        <w:tc>
+          <w:tcPr/>
+          <w:p>
+            <w:pPr>
+              <w:pStyle w:val="Compact"/>
+              <w:jc w:val="right"/>
+              <w:keepNext/>
             </w:pPr>
             <w:r>
               <w:t xml:space="preserve">12</w:t>
@@ -5278,6 +5361,7 @@
             <w:pPr>
               <w:pStyle w:val="Compact"/>
               <w:jc w:val="right"/>
+              <w:keepNext/>
             </w:pPr>
             <w:r>
               <w:t xml:space="preserve">11</w:t>
@@ -5290,6 +5374,7 @@
             <w:pPr>
               <w:pStyle w:val="Compact"/>
               <w:jc w:val="right"/>
+              <w:keepNext/>
             </w:pPr>
             <w:r>
               <w:t xml:space="preserve">98.2%</w:t>
@@ -5302,6 +5387,7 @@
             <w:pPr>
               <w:pStyle w:val="Compact"/>
               <w:jc w:val="right"/>
+              <w:keepNext/>
             </w:pPr>
             <w:r>
               <w:t xml:space="preserve">88.2%</w:t>
@@ -5314,6 +5400,7 @@
             <w:pPr>
               <w:pStyle w:val="Compact"/>
               <w:jc w:val="right"/>
+              <w:keepNext/>
             </w:pPr>
             <w:r>
               <w:t xml:space="preserve">65.9%</w:t>
@@ -5326,6 +5413,7 @@
             <w:pPr>
               <w:pStyle w:val="Compact"/>
               <w:jc w:val="right"/>
+              <w:keepNext/>
             </w:pPr>
             <w:r>
               <w:t xml:space="preserve">27.5%</w:t>
@@ -5334,12 +5422,16 @@
         </w:tc>
       </w:tr>
       <w:tr>
-        <w:tc>
-          <w:tcPr/>
-          <w:p>
-            <w:pPr>
-              <w:pStyle w:val="Compact"/>
-              <w:jc w:val="right"/>
+        <w:trPr>
+          <w:cantSplit/>
+        </w:trPr>
+        <w:tc>
+          <w:tcPr/>
+          <w:p>
+            <w:pPr>
+              <w:pStyle w:val="Compact"/>
+              <w:jc w:val="right"/>
+              <w:keepNext/>
             </w:pPr>
             <w:r>
               <w:t xml:space="preserve">12</w:t>
@@ -5352,6 +5444,7 @@
             <w:pPr>
               <w:pStyle w:val="Compact"/>
               <w:jc w:val="right"/>
+              <w:keepNext/>
             </w:pPr>
             <w:r>
               <w:t xml:space="preserve">12</w:t>
@@ -5364,6 +5457,7 @@
             <w:pPr>
               <w:pStyle w:val="Compact"/>
               <w:jc w:val="right"/>
+              <w:keepNext/>
             </w:pPr>
             <w:r>
               <w:t xml:space="preserve">99.9%</w:t>
@@ -5376,6 +5470,7 @@
             <w:pPr>
               <w:pStyle w:val="Compact"/>
               <w:jc w:val="right"/>
+              <w:keepNext/>
             </w:pPr>
             <w:r>
               <w:t xml:space="preserve">54.0%</w:t>
@@ -5388,6 +5483,7 @@
             <w:pPr>
               <w:pStyle w:val="Compact"/>
               <w:jc w:val="right"/>
+              <w:keepNext/>
             </w:pPr>
             <w:r>
               <w:t xml:space="preserve">28.2%</w:t>
@@ -5400,6 +5496,7 @@
             <w:pPr>
               <w:pStyle w:val="Compact"/>
               <w:jc w:val="right"/>
+              <w:keepNext/>
             </w:pPr>
             <w:r>
               <w:t xml:space="preserve">6.9%</w:t>
@@ -5408,12 +5505,16 @@
         </w:tc>
       </w:tr>
       <w:tr>
-        <w:tc>
-          <w:tcPr/>
-          <w:p>
-            <w:pPr>
-              <w:pStyle w:val="Compact"/>
-              <w:jc w:val="right"/>
+        <w:trPr>
+          <w:cantSplit/>
+        </w:trPr>
+        <w:tc>
+          <w:tcPr/>
+          <w:p>
+            <w:pPr>
+              <w:pStyle w:val="Compact"/>
+              <w:jc w:val="right"/>
+              <w:keepNext/>
             </w:pPr>
             <w:r>
               <w:t xml:space="preserve">16</w:t>
@@ -5426,6 +5527,7 @@
             <w:pPr>
               <w:pStyle w:val="Compact"/>
               <w:jc w:val="right"/>
+              <w:keepNext/>
             </w:pPr>
             <w:r>
               <w:t xml:space="preserve">13</w:t>
@@ -5438,6 +5540,7 @@
             <w:pPr>
               <w:pStyle w:val="Compact"/>
               <w:jc w:val="right"/>
+              <w:keepNext/>
             </w:pPr>
             <w:r>
               <w:t xml:space="preserve">93.2%</w:t>
@@ -5450,6 +5553,7 @@
             <w:pPr>
               <w:pStyle w:val="Compact"/>
               <w:jc w:val="right"/>
+              <w:keepNext/>
             </w:pPr>
             <w:r>
               <w:t xml:space="preserve">99.3%</w:t>
@@ -5462,6 +5566,7 @@
             <w:pPr>
               <w:pStyle w:val="Compact"/>
               <w:jc w:val="right"/>
+              <w:keepNext/>
             </w:pPr>
             <w:r>
               <w:t xml:space="preserve">93.2%</w:t>
@@ -5474,6 +5579,7 @@
             <w:pPr>
               <w:pStyle w:val="Compact"/>
               <w:jc w:val="right"/>
+              <w:keepNext/>
             </w:pPr>
             <w:r>
               <w:t xml:space="preserve">59.8%</w:t>
@@ -5482,12 +5588,16 @@
         </w:tc>
       </w:tr>
       <w:tr>
-        <w:tc>
-          <w:tcPr/>
-          <w:p>
-            <w:pPr>
-              <w:pStyle w:val="Compact"/>
-              <w:jc w:val="right"/>
+        <w:trPr>
+          <w:cantSplit/>
+        </w:trPr>
+        <w:tc>
+          <w:tcPr/>
+          <w:p>
+            <w:pPr>
+              <w:pStyle w:val="Compact"/>
+              <w:jc w:val="right"/>
+              <w:keepNext/>
             </w:pPr>
             <w:r>
               <w:t xml:space="preserve">16</w:t>
@@ -5500,6 +5610,7 @@
             <w:pPr>
               <w:pStyle w:val="Compact"/>
               <w:jc w:val="right"/>
+              <w:keepNext/>
             </w:pPr>
             <w:r>
               <w:t xml:space="preserve">14</w:t>
@@ -5512,6 +5623,7 @@
             <w:pPr>
               <w:pStyle w:val="Compact"/>
               <w:jc w:val="right"/>
+              <w:keepNext/>
             </w:pPr>
             <w:r>
               <w:t xml:space="preserve">98.8%</w:t>
@@ -5524,6 +5636,7 @@
             <w:pPr>
               <w:pStyle w:val="Compact"/>
               <w:jc w:val="right"/>
+              <w:keepNext/>
             </w:pPr>
             <w:r>
               <w:t xml:space="preserve">95.7%</w:t>
@@ -5536,6 +5649,7 @@
             <w:pPr>
               <w:pStyle w:val="Compact"/>
               <w:jc w:val="right"/>
+              <w:keepNext/>
             </w:pPr>
             <w:r>
               <w:t xml:space="preserve">78.9%</w:t>
@@ -5548,6 +5662,7 @@
             <w:pPr>
               <w:pStyle w:val="Compact"/>
               <w:jc w:val="right"/>
+              <w:keepNext/>
             </w:pPr>
             <w:r>
               <w:t xml:space="preserve">35.2%</w:t>
@@ -5556,6 +5671,9 @@
         </w:tc>
       </w:tr>
       <w:tr>
+        <w:trPr>
+          <w:cantSplit/>
+        </w:trPr>
         <w:tc>
           <w:tcPr/>
           <w:p>
@@ -5630,10 +5748,10 @@
         </w:tc>
       </w:tr>
     </w:tbl>
-    <w:bookmarkEnd w:id="31"/>
-    <w:bookmarkEnd w:id="32"/>
-    <w:bookmarkEnd w:id="33"/>
-    <w:bookmarkStart w:id="61" w:name="sec:evaluation"/>
+    <w:bookmarkEnd w:id="28"/>
+    <w:bookmarkEnd w:id="29"/>
+    <w:bookmarkEnd w:id="30"/>
+    <w:bookmarkStart w:id="58" w:name="sec:evaluation"/>
     <w:p>
       <w:pPr>
         <w:pStyle w:val="Heading1"/>
@@ -5651,7 +5769,7 @@
         <w:t xml:space="preserve">Evaluation</w:t>
       </w:r>
     </w:p>
-    <w:bookmarkStart w:id="39" w:name="method-and-evidence-labels"/>
+    <w:bookmarkStart w:id="36" w:name="method-and-evidence-labels"/>
     <w:p>
       <w:pPr>
         <w:pStyle w:val="Heading2"/>
@@ -5777,10 +5895,11 @@
         <w:t xml:space="preserve">. The emulated testbed is not a geo-distributed deployment.</w:t>
       </w:r>
     </w:p>
-    <w:bookmarkStart w:id="34" w:name="tab:config"/>
+    <w:bookmarkStart w:id="31" w:name="tab:config"/>
     <w:p>
       <w:pPr>
         <w:pStyle w:val="TableCaption"/>
+        <w:keepNext/>
       </w:pPr>
       <w:r>
         <w:t xml:space="preserve">Table 3. Experimental configuration. The baseline committee is</w:t>
@@ -5873,6 +5992,7 @@
       <w:tr>
         <w:trPr>
           <w:tblHeader w:val="on"/>
+          <w:cantSplit/>
         </w:trPr>
         <w:tc>
           <w:tcPr/>
@@ -5880,6 +6000,7 @@
             <w:pPr>
               <w:pStyle w:val="Compact"/>
               <w:jc w:val="left"/>
+              <w:keepNext/>
             </w:pPr>
             <w:r>
               <w:t xml:space="preserve">Experiment family</w:t>
@@ -5892,6 +6013,7 @@
             <w:pPr>
               <w:pStyle w:val="Compact"/>
               <w:jc w:val="left"/>
+              <w:keepNext/>
             </w:pPr>
             <w:r>
               <w:t xml:space="preserve">Parameters</w:t>
@@ -5904,6 +6026,7 @@
             <w:pPr>
               <w:pStyle w:val="Compact"/>
               <w:jc w:val="left"/>
+              <w:keepNext/>
             </w:pPr>
             <w:r>
               <w:t xml:space="preserve">Execution and evidence label</w:t>
@@ -5912,12 +6035,16 @@
         </w:tc>
       </w:tr>
       <w:tr>
+        <w:trPr>
+          <w:cantSplit/>
+        </w:trPr>
         <w:tc>
           <w:tcPr/>
           <w:p>
             <w:pPr>
               <w:pStyle w:val="Compact"/>
               <w:jc w:val="left"/>
+              <w:keepNext/>
             </w:pPr>
             <w:r>
               <w:t xml:space="preserve">Static bound (Eq. 2)</w:t>
@@ -5930,6 +6057,7 @@
             <w:pPr>
               <w:pStyle w:val="Compact"/>
               <w:jc w:val="left"/>
+              <w:keepNext/>
             </w:pPr>
             <m:oMath>
               <m:r>
@@ -6201,6 +6329,7 @@
             <w:pPr>
               <w:pStyle w:val="Compact"/>
               <w:jc w:val="left"/>
+              <w:keepNext/>
             </w:pPr>
             <w:r>
               <w:t xml:space="preserve">Exact closed form</w:t>
@@ -6209,12 +6338,16 @@
         </w:tc>
       </w:tr>
       <w:tr>
+        <w:trPr>
+          <w:cantSplit/>
+        </w:trPr>
         <w:tc>
           <w:tcPr/>
           <w:p>
             <w:pPr>
               <w:pStyle w:val="Compact"/>
               <w:jc w:val="left"/>
+              <w:keepNext/>
             </w:pPr>
             <w:r>
               <w:t xml:space="preserve">PC03 prespecified cells</w:t>
@@ -6227,6 +6360,7 @@
             <w:pPr>
               <w:pStyle w:val="Compact"/>
               <w:jc w:val="left"/>
+              <w:keepNext/>
             </w:pPr>
             <m:oMath>
               <m:r>
@@ -6447,6 +6581,7 @@
             <w:pPr>
               <w:pStyle w:val="Compact"/>
               <w:jc w:val="left"/>
+              <w:keepNext/>
             </w:pPr>
             <w:r>
               <w:t xml:space="preserve">32 seed blocks</w:t>
@@ -6507,12 +6642,16 @@
         </w:tc>
       </w:tr>
       <w:tr>
+        <w:trPr>
+          <w:cantSplit/>
+        </w:trPr>
         <w:tc>
           <w:tcPr/>
           <w:p>
             <w:pPr>
               <w:pStyle w:val="Compact"/>
               <w:jc w:val="left"/>
+              <w:keepNext/>
             </w:pPr>
             <w:r>
               <w:t xml:space="preserve">Correlation model</w:t>
@@ -6525,6 +6664,7 @@
             <w:pPr>
               <w:pStyle w:val="Compact"/>
               <w:jc w:val="left"/>
+              <w:keepNext/>
             </w:pPr>
             <m:oMath>
               <m:r>
@@ -6593,6 +6733,7 @@
             <w:pPr>
               <w:pStyle w:val="Compact"/>
               <w:jc w:val="left"/>
+              <w:keepNext/>
             </w:pPr>
             <w:r>
               <w:t xml:space="preserve">Exact; declared synthetic model</w:t>
@@ -6601,12 +6742,16 @@
         </w:tc>
       </w:tr>
       <w:tr>
+        <w:trPr>
+          <w:cantSplit/>
+        </w:trPr>
         <w:tc>
           <w:tcPr/>
           <w:p>
             <w:pPr>
               <w:pStyle w:val="Compact"/>
               <w:jc w:val="left"/>
+              <w:keepNext/>
             </w:pPr>
             <w:r>
               <w:t xml:space="preserve">Acceptance rule</w:t>
@@ -6619,6 +6764,7 @@
             <w:pPr>
               <w:pStyle w:val="Compact"/>
               <w:jc w:val="left"/>
+              <w:keepNext/>
             </w:pPr>
             <m:oMath>
               <m:r>
@@ -6784,6 +6930,7 @@
             <w:pPr>
               <w:pStyle w:val="Compact"/>
               <w:jc w:val="left"/>
+              <w:keepNext/>
             </w:pPr>
             <w:r>
               <w:t xml:space="preserve">Exact; post hoc</w:t>
@@ -6792,12 +6939,16 @@
         </w:tc>
       </w:tr>
       <w:tr>
+        <w:trPr>
+          <w:cantSplit/>
+        </w:trPr>
         <w:tc>
           <w:tcPr/>
           <w:p>
             <w:pPr>
               <w:pStyle w:val="Compact"/>
               <w:jc w:val="left"/>
+              <w:keepNext/>
             </w:pPr>
             <w:r>
               <w:t xml:space="preserve">Cryptographic cost</w:t>
@@ -6810,6 +6961,7 @@
             <w:pPr>
               <w:pStyle w:val="Compact"/>
               <w:jc w:val="left"/>
+              <w:keepNext/>
             </w:pPr>
             <w:r>
               <w:t xml:space="preserve">ffdhe2048, ffdhe3072 (RFC 7919) and the 256-bit prototype group;</w:t>
@@ -6839,6 +6991,7 @@
             <w:pPr>
               <w:pStyle w:val="Compact"/>
               <w:jc w:val="left"/>
+              <w:keepNext/>
             </w:pPr>
             <w:r>
               <w:t xml:space="preserve">Local microbenchmark, CPython 3.13, Apple M4 Pro</w:t>
@@ -6847,6 +7000,9 @@
         </w:tc>
       </w:tr>
       <w:tr>
+        <w:trPr>
+          <w:cantSplit/>
+        </w:trPr>
         <w:tc>
           <w:tcPr/>
           <w:p>
@@ -7020,8 +7176,8 @@
         </w:tc>
       </w:tr>
     </w:tbl>
-    <w:bookmarkEnd w:id="34"/>
-    <w:bookmarkStart w:id="38" w:name="fig:deadline"/>
+    <w:bookmarkEnd w:id="31"/>
+    <w:bookmarkStart w:id="35" w:name="fig:deadline"/>
     <w:p>
       <w:pPr>
         <w:pStyle w:val="CaptionedFigure"/>
@@ -7031,18 +7187,18 @@
           <wp:inline>
             <wp:extent cx="5334000" cy="2515315"/>
             <wp:effectExtent b="0" l="0" r="0" t="0"/>
-            <wp:docPr descr="" title="" id="36" name="Picture"/>
+            <wp:docPr descr="" title="" id="33" name="Picture"/>
             <a:graphic>
               <a:graphicData uri="http://schemas.openxmlformats.org/drawingml/2006/picture">
                 <pic:pic>
                   <pic:nvPicPr>
-                    <pic:cNvPr descr="figures/fig3_dispute_success_vs_deadline.png" id="37" name="Picture"/>
+                    <pic:cNvPr descr="figures/fig3_dispute_success_vs_deadline.png" id="34" name="Picture"/>
                     <pic:cNvPicPr>
                       <a:picLocks noChangeArrowheads="1" noChangeAspect="1"/>
                     </pic:cNvPicPr>
                   </pic:nvPicPr>
                   <pic:blipFill>
-                    <a:blip r:embed="rId35"/>
+                    <a:blip r:embed="rId32"/>
                     <a:stretch>
                       <a:fillRect/>
                     </a:stretch>
@@ -7158,9 +7314,9 @@
         <w:t xml:space="preserve"> s.</w:t>
       </w:r>
     </w:p>
-    <w:bookmarkEnd w:id="38"/>
-    <w:bookmarkEnd w:id="39"/>
-    <w:bookmarkStart w:id="41" w:name="comparison-with-readiness-baselines"/>
+    <w:bookmarkEnd w:id="35"/>
+    <w:bookmarkEnd w:id="36"/>
+    <w:bookmarkStart w:id="38" w:name="comparison-with-readiness-baselines"/>
     <w:p>
       <w:pPr>
         <w:pStyle w:val="Heading2"/>
@@ -7229,10 +7385,11 @@
         <w:t xml:space="preserve">; KEYSTONE trades that cost for the detection probability of Eq. (2).</w:t>
       </w:r>
     </w:p>
-    <w:bookmarkStart w:id="40" w:name="tab:baselines"/>
+    <w:bookmarkStart w:id="37" w:name="tab:baselines"/>
     <w:p>
       <w:pPr>
         <w:pStyle w:val="TableCaption"/>
+        <w:keepNext/>
       </w:pPr>
       <w:r>
         <w:t xml:space="preserve">Table 4. Readiness checks compared. Costs are measured medians for ffdhe2048 in the prototype (Table 7); bytes are canonical request plus response transcripts.</w:t>
@@ -7255,6 +7412,7 @@
       <w:tr>
         <w:trPr>
           <w:tblHeader w:val="on"/>
+          <w:cantSplit/>
         </w:trPr>
         <w:tc>
           <w:tcPr/>
@@ -7262,6 +7420,7 @@
             <w:pPr>
               <w:pStyle w:val="Compact"/>
               <w:jc w:val="left"/>
+              <w:keepNext/>
             </w:pPr>
             <w:r>
               <w:t xml:space="preserve">Readiness check</w:t>
@@ -7274,6 +7433,7 @@
             <w:pPr>
               <w:pStyle w:val="Compact"/>
               <w:jc w:val="left"/>
+              <w:keepNext/>
             </w:pPr>
             <w:r>
               <w:t xml:space="preserve">Exercises the secret share?</w:t>
@@ -7286,6 +7446,7 @@
             <w:pPr>
               <w:pStyle w:val="Compact"/>
               <w:jc w:val="left"/>
+              <w:keepNext/>
             </w:pPr>
             <w:r>
               <w:t xml:space="preserve">Touches production ciphertext?</w:t>
@@ -7298,6 +7459,7 @@
             <w:pPr>
               <w:pStyle w:val="Compact"/>
               <w:jc w:val="left"/>
+              <w:keepNext/>
             </w:pPr>
             <w:r>
               <w:t xml:space="preserve">Detects a static state with</w:t>
@@ -7342,6 +7504,7 @@
             <w:pPr>
               <w:pStyle w:val="Compact"/>
               <w:jc w:val="left"/>
+              <w:keepNext/>
             </w:pPr>
             <w:r>
               <w:t xml:space="preserve">Cost per check (</w:t>
@@ -7367,12 +7530,16 @@
         </w:tc>
       </w:tr>
       <w:tr>
+        <w:trPr>
+          <w:cantSplit/>
+        </w:trPr>
         <w:tc>
           <w:tcPr/>
           <w:p>
             <w:pPr>
               <w:pStyle w:val="Compact"/>
               <w:jc w:val="left"/>
+              <w:keepNext/>
             </w:pPr>
             <w:r>
               <w:t xml:space="preserve">Liveness heartbeat</w:t>
@@ -7385,6 +7552,7 @@
             <w:pPr>
               <w:pStyle w:val="Compact"/>
               <w:jc w:val="left"/>
+              <w:keepNext/>
             </w:pPr>
             <w:r>
               <w:t xml:space="preserve">No</w:t>
@@ -7397,6 +7565,7 @@
             <w:pPr>
               <w:pStyle w:val="Compact"/>
               <w:jc w:val="left"/>
+              <w:keepNext/>
             </w:pPr>
             <w:r>
               <w:t xml:space="preserve">No</w:t>
@@ -7409,6 +7578,7 @@
             <w:pPr>
               <w:pStyle w:val="Compact"/>
               <w:jc w:val="left"/>
+              <w:keepNext/>
             </w:pPr>
             <w:r>
               <w:t xml:space="preserve">No: a node that lost its share still answers</w:t>
@@ -7421,6 +7591,7 @@
             <w:pPr>
               <w:pStyle w:val="Compact"/>
               <w:jc w:val="left"/>
+              <w:keepNext/>
             </w:pPr>
             <w:r>
               <w:t xml:space="preserve">1 message per node; no group operations</w:t>
@@ -7429,12 +7600,16 @@
         </w:tc>
       </w:tr>
       <w:tr>
+        <w:trPr>
+          <w:cantSplit/>
+        </w:trPr>
         <w:tc>
           <w:tcPr/>
           <w:p>
             <w:pPr>
               <w:pStyle w:val="Compact"/>
               <w:jc w:val="left"/>
+              <w:keepNext/>
             </w:pPr>
             <w:r>
               <w:t xml:space="preserve">Share registration (Feldman/PVSS check)</w:t>
@@ -7447,6 +7622,7 @@
             <w:pPr>
               <w:pStyle w:val="Compact"/>
               <w:jc w:val="left"/>
+              <w:keepNext/>
             </w:pPr>
             <w:r>
               <w:t xml:space="preserve">Once, at setup</w:t>
@@ -7459,6 +7635,7 @@
             <w:pPr>
               <w:pStyle w:val="Compact"/>
               <w:jc w:val="left"/>
+              <w:keepNext/>
             </w:pPr>
             <w:r>
               <w:t xml:space="preserve">No</w:t>
@@ -7471,6 +7648,7 @@
             <w:pPr>
               <w:pStyle w:val="Compact"/>
               <w:jc w:val="left"/>
+              <w:keepNext/>
             </w:pPr>
             <w:r>
               <w:t xml:space="preserve">No: says nothing about later share loss</w:t>
@@ -7483,6 +7661,7 @@
             <w:pPr>
               <w:pStyle w:val="Compact"/>
               <w:jc w:val="left"/>
+              <w:keepNext/>
             </w:pPr>
             <w:r>
               <w:t xml:space="preserve">One-time</w:t>
@@ -7523,12 +7702,16 @@
         </w:tc>
       </w:tr>
       <w:tr>
+        <w:trPr>
+          <w:cantSplit/>
+        </w:trPr>
         <w:tc>
           <w:tcPr/>
           <w:p>
             <w:pPr>
               <w:pStyle w:val="Compact"/>
               <w:jc w:val="left"/>
+              <w:keepNext/>
             </w:pPr>
             <w:r>
               <w:t xml:space="preserve">Full-committee canary probe</w:t>
@@ -7541,6 +7724,7 @@
             <w:pPr>
               <w:pStyle w:val="Compact"/>
               <w:jc w:val="left"/>
+              <w:keepNext/>
             </w:pPr>
             <w:r>
               <w:t xml:space="preserve">Yes</w:t>
@@ -7553,6 +7737,7 @@
             <w:pPr>
               <w:pStyle w:val="Compact"/>
               <w:jc w:val="left"/>
+              <w:keepNext/>
             </w:pPr>
             <w:r>
               <w:t xml:space="preserve">No (canary)</w:t>
@@ -7565,6 +7750,7 @@
             <w:pPr>
               <w:pStyle w:val="Compact"/>
               <w:jc w:val="left"/>
+              <w:keepNext/>
             </w:pPr>
             <w:r>
               <w:t xml:space="preserve">Yes, with probability 1</w:t>
@@ -7577,6 +7763,7 @@
             <w:pPr>
               <w:pStyle w:val="Compact"/>
               <w:jc w:val="left"/>
+              <w:keepNext/>
             </w:pPr>
             <w:r>
               <w:t xml:space="preserve">32 proofs + 32 verifications; 8501 ms CPU; 36,991 B</w:t>
@@ -7585,12 +7772,16 @@
         </w:tc>
       </w:tr>
       <w:tr>
+        <w:trPr>
+          <w:cantSplit/>
+        </w:trPr>
         <w:tc>
           <w:tcPr/>
           <w:p>
             <w:pPr>
               <w:pStyle w:val="Compact"/>
               <w:jc w:val="left"/>
+              <w:keepNext/>
             </w:pPr>
             <w:r>
               <w:t xml:space="preserve">KEYSTONE sampled canary (</w:t>
@@ -7629,6 +7820,7 @@
             <w:pPr>
               <w:pStyle w:val="Compact"/>
               <w:jc w:val="left"/>
+              <w:keepNext/>
             </w:pPr>
             <w:r>
               <w:t xml:space="preserve">Yes, for the sampled members</w:t>
@@ -7641,6 +7833,7 @@
             <w:pPr>
               <w:pStyle w:val="Compact"/>
               <w:jc w:val="left"/>
+              <w:keepNext/>
             </w:pPr>
             <w:r>
               <w:t xml:space="preserve">No (canary)</w:t>
@@ -7653,6 +7846,7 @@
             <w:pPr>
               <w:pStyle w:val="Compact"/>
               <w:jc w:val="left"/>
+              <w:keepNext/>
             </w:pPr>
             <w:r>
               <w:t xml:space="preserve">Yes, with probability 0.9807 (Eq. 2)</w:t>
@@ -7665,6 +7859,7 @@
             <w:pPr>
               <w:pStyle w:val="Compact"/>
               <w:jc w:val="left"/>
+              <w:keepNext/>
             </w:pPr>
             <w:r>
               <w:t xml:space="preserve">8 proofs + 8 verifications; 2125 ms CPU; 9,415 B</w:t>
@@ -7673,6 +7868,9 @@
         </w:tc>
       </w:tr>
       <w:tr>
+        <w:trPr>
+          <w:cantSplit/>
+        </w:trPr>
         <w:tc>
           <w:tcPr/>
           <w:p>
@@ -7743,9 +7941,9 @@
         </w:tc>
       </w:tr>
     </w:tbl>
-    <w:bookmarkEnd w:id="40"/>
-    <w:bookmarkEnd w:id="41"/>
-    <w:bookmarkStart w:id="51" w:name="robustness-under-failure-scenarios"/>
+    <w:bookmarkEnd w:id="37"/>
+    <w:bookmarkEnd w:id="38"/>
+    <w:bookmarkStart w:id="48" w:name="robustness-under-failure-scenarios"/>
     <w:p>
       <w:pPr>
         <w:pStyle w:val="Heading2"/>
@@ -7771,10 +7969,11 @@
         <w:t xml:space="preserve">Table 5(a) reports the prespecified simulation cells. Under 10% independent unavailability the committee reconstructs in 99.98% of draws, yet the strict audit passes in only 43.1%: the audit is a sensitive alarm, not an accurate health score. Under 20% domain outages, fixed-quota stratified sampling raised conditional detection of catastrophic draws from 99.89% to 100.00% and lowered the benign pass rate from 37.3% to 34.9%. The prespecified primary endpoint, the paired difference in detected catastrophes per draw, was 0.00021 (Hoeffding half-width 0.0075; all 28 discordant pairs favored stratification), so stratification’s benefit is real but small in this cell. With eleven selective withholders, audits passed in 100.0% of draws and disputes succeeded in 0.0% (upper 95% bound 0.0029%), confirming the second non-implication witness at the prespecified sample size.</w:t>
       </w:r>
     </w:p>
-    <w:bookmarkStart w:id="42" w:name="tab:robustness"/>
+    <w:bookmarkStart w:id="39" w:name="tab:robustness"/>
     <w:p>
       <w:pPr>
         <w:pStyle w:val="TableCaption"/>
+        <w:keepNext/>
       </w:pPr>
       <w:r>
         <w:t xml:space="preserve">Table 5. Robustness under failure scenarios. (a) Prespecified simulation; dispute success equals reconstructability because the simulator has no network. (b) Emulated testbed: audit pass is</w:t>
@@ -7853,6 +8052,7 @@
       <w:tr>
         <w:trPr>
           <w:tblHeader w:val="on"/>
+          <w:cantSplit/>
         </w:trPr>
         <w:tc>
           <w:tcPr/>
@@ -7860,6 +8060,7 @@
             <w:pPr>
               <w:pStyle w:val="Compact"/>
               <w:jc w:val="left"/>
+              <w:keepNext/>
             </w:pPr>
             <w:r>
               <w:t xml:space="preserve">Scenario</w:t>
@@ -7872,6 +8073,7 @@
             <w:pPr>
               <w:pStyle w:val="Compact"/>
               <w:jc w:val="right"/>
+              <w:keepNext/>
             </w:pPr>
             <w:r>
               <w:t xml:space="preserve">Audit pass</w:t>
@@ -7884,6 +8086,7 @@
             <w:pPr>
               <w:pStyle w:val="Compact"/>
               <w:jc w:val="right"/>
+              <w:keepNext/>
             </w:pPr>
             <w:r>
               <w:t xml:space="preserve">Dispute success</w:t>
@@ -7896,6 +8099,7 @@
             <w:pPr>
               <w:pStyle w:val="Compact"/>
               <w:jc w:val="right"/>
+              <w:keepNext/>
             </w:pPr>
             <w:r>
               <w:t xml:space="preserve">By</w:t>
@@ -7940,6 +8144,7 @@
             <w:pPr>
               <w:pStyle w:val="Compact"/>
               <w:jc w:val="right"/>
+              <w:keepNext/>
             </w:pPr>
             <w:r>
               <w:t xml:space="preserve">Median time</w:t>
@@ -7952,6 +8157,7 @@
             <w:pPr>
               <w:pStyle w:val="Compact"/>
               <w:jc w:val="right"/>
+              <w:keepNext/>
             </w:pPr>
             <w:r>
               <w:t xml:space="preserve">p95 time</w:t>
@@ -7960,12 +8166,16 @@
         </w:tc>
       </w:tr>
       <w:tr>
+        <w:trPr>
+          <w:cantSplit/>
+        </w:trPr>
         <w:tc>
           <w:tcPr/>
           <w:p>
             <w:pPr>
               <w:pStyle w:val="Compact"/>
               <w:jc w:val="left"/>
+              <w:keepNext/>
             </w:pPr>
             <w:r>
               <w:rPr>
@@ -7995,49 +8205,58 @@
           <w:p>
             <w:pPr>
               <w:pStyle w:val="Compact"/>
-            </w:pPr>
-          </w:p>
-        </w:tc>
-        <w:tc>
-          <w:tcPr/>
-          <w:p>
-            <w:pPr>
-              <w:pStyle w:val="Compact"/>
-            </w:pPr>
-          </w:p>
-        </w:tc>
-        <w:tc>
-          <w:tcPr/>
-          <w:p>
-            <w:pPr>
-              <w:pStyle w:val="Compact"/>
-            </w:pPr>
-          </w:p>
-        </w:tc>
-        <w:tc>
-          <w:tcPr/>
-          <w:p>
-            <w:pPr>
-              <w:pStyle w:val="Compact"/>
-            </w:pPr>
-          </w:p>
-        </w:tc>
-        <w:tc>
-          <w:tcPr/>
-          <w:p>
-            <w:pPr>
-              <w:pStyle w:val="Compact"/>
+              <w:keepNext/>
+            </w:pPr>
+          </w:p>
+        </w:tc>
+        <w:tc>
+          <w:tcPr/>
+          <w:p>
+            <w:pPr>
+              <w:pStyle w:val="Compact"/>
+              <w:keepNext/>
+            </w:pPr>
+          </w:p>
+        </w:tc>
+        <w:tc>
+          <w:tcPr/>
+          <w:p>
+            <w:pPr>
+              <w:pStyle w:val="Compact"/>
+              <w:keepNext/>
+            </w:pPr>
+          </w:p>
+        </w:tc>
+        <w:tc>
+          <w:tcPr/>
+          <w:p>
+            <w:pPr>
+              <w:pStyle w:val="Compact"/>
+              <w:keepNext/>
+            </w:pPr>
+          </w:p>
+        </w:tc>
+        <w:tc>
+          <w:tcPr/>
+          <w:p>
+            <w:pPr>
+              <w:pStyle w:val="Compact"/>
+              <w:keepNext/>
             </w:pPr>
           </w:p>
         </w:tc>
       </w:tr>
       <w:tr>
+        <w:trPr>
+          <w:cantSplit/>
+        </w:trPr>
         <w:tc>
           <w:tcPr/>
           <w:p>
             <w:pPr>
               <w:pStyle w:val="Compact"/>
               <w:jc w:val="left"/>
+              <w:keepNext/>
             </w:pPr>
             <w:r>
               <w:t xml:space="preserve">IID 10% unavailable</w:t>
@@ -8050,6 +8269,7 @@
             <w:pPr>
               <w:pStyle w:val="Compact"/>
               <w:jc w:val="right"/>
+              <w:keepNext/>
             </w:pPr>
             <w:r>
               <w:t xml:space="preserve">43.1% [42.8, 43.3]</w:t>
@@ -8062,6 +8282,7 @@
             <w:pPr>
               <w:pStyle w:val="Compact"/>
               <w:jc w:val="right"/>
+              <w:keepNext/>
             </w:pPr>
             <w:r>
               <w:t xml:space="preserve">99.98% [99.97, 99.99]</w:t>
@@ -8074,6 +8295,7 @@
             <w:pPr>
               <w:pStyle w:val="Compact"/>
               <w:jc w:val="right"/>
+              <w:keepNext/>
             </w:pPr>
             <w:r>
               <w:t xml:space="preserve">–</w:t>
@@ -8086,6 +8308,7 @@
             <w:pPr>
               <w:pStyle w:val="Compact"/>
               <w:jc w:val="right"/>
+              <w:keepNext/>
             </w:pPr>
             <w:r>
               <w:t xml:space="preserve">–</w:t>
@@ -8098,6 +8321,7 @@
             <w:pPr>
               <w:pStyle w:val="Compact"/>
               <w:jc w:val="right"/>
+              <w:keepNext/>
             </w:pPr>
             <w:r>
               <w:t xml:space="preserve">–</w:t>
@@ -8106,12 +8330,16 @@
         </w:tc>
       </w:tr>
       <w:tr>
+        <w:trPr>
+          <w:cantSplit/>
+        </w:trPr>
         <w:tc>
           <w:tcPr/>
           <w:p>
             <w:pPr>
               <w:pStyle w:val="Compact"/>
               <w:jc w:val="left"/>
+              <w:keepNext/>
             </w:pPr>
             <w:r>
               <w:t xml:space="preserve">Domain outage 20%, uniform sample</w:t>
@@ -8124,6 +8352,7 @@
             <w:pPr>
               <w:pStyle w:val="Compact"/>
               <w:jc w:val="right"/>
+              <w:keepNext/>
             </w:pPr>
             <w:r>
               <w:t xml:space="preserve">37.3% [37.0, 37.6]</w:t>
@@ -8136,6 +8365,7 @@
             <w:pPr>
               <w:pStyle w:val="Compact"/>
               <w:jc w:val="right"/>
+              <w:keepNext/>
             </w:pPr>
             <w:r>
               <w:t xml:space="preserve">81.3% [81.1, 81.6]</w:t>
@@ -8148,6 +8378,7 @@
             <w:pPr>
               <w:pStyle w:val="Compact"/>
               <w:jc w:val="right"/>
+              <w:keepNext/>
             </w:pPr>
             <w:r>
               <w:t xml:space="preserve">–</w:t>
@@ -8160,6 +8391,7 @@
             <w:pPr>
               <w:pStyle w:val="Compact"/>
               <w:jc w:val="right"/>
+              <w:keepNext/>
             </w:pPr>
             <w:r>
               <w:t xml:space="preserve">–</w:t>
@@ -8172,6 +8404,7 @@
             <w:pPr>
               <w:pStyle w:val="Compact"/>
               <w:jc w:val="right"/>
+              <w:keepNext/>
             </w:pPr>
             <w:r>
               <w:t xml:space="preserve">–</w:t>
@@ -8180,12 +8413,16 @@
         </w:tc>
       </w:tr>
       <w:tr>
+        <w:trPr>
+          <w:cantSplit/>
+        </w:trPr>
         <w:tc>
           <w:tcPr/>
           <w:p>
             <w:pPr>
               <w:pStyle w:val="Compact"/>
               <w:jc w:val="left"/>
+              <w:keepNext/>
             </w:pPr>
             <w:r>
               <w:t xml:space="preserve">Domain outage 20%, stratified sample</w:t>
@@ -8198,6 +8435,7 @@
             <w:pPr>
               <w:pStyle w:val="Compact"/>
               <w:jc w:val="right"/>
+              <w:keepNext/>
             </w:pPr>
             <w:r>
               <w:t xml:space="preserve">34.9% [34.7, 35.2]</w:t>
@@ -8210,6 +8448,7 @@
             <w:pPr>
               <w:pStyle w:val="Compact"/>
               <w:jc w:val="right"/>
+              <w:keepNext/>
             </w:pPr>
             <w:r>
               <w:t xml:space="preserve">81.3% [81.1, 81.6]</w:t>
@@ -8222,6 +8461,7 @@
             <w:pPr>
               <w:pStyle w:val="Compact"/>
               <w:jc w:val="right"/>
+              <w:keepNext/>
             </w:pPr>
             <w:r>
               <w:t xml:space="preserve">–</w:t>
@@ -8234,6 +8474,7 @@
             <w:pPr>
               <w:pStyle w:val="Compact"/>
               <w:jc w:val="right"/>
+              <w:keepNext/>
             </w:pPr>
             <w:r>
               <w:t xml:space="preserve">–</w:t>
@@ -8246,6 +8487,7 @@
             <w:pPr>
               <w:pStyle w:val="Compact"/>
               <w:jc w:val="right"/>
+              <w:keepNext/>
             </w:pPr>
             <w:r>
               <w:t xml:space="preserve">–</w:t>
@@ -8254,12 +8496,16 @@
         </w:tc>
       </w:tr>
       <w:tr>
+        <w:trPr>
+          <w:cantSplit/>
+        </w:trPr>
         <w:tc>
           <w:tcPr/>
           <w:p>
             <w:pPr>
               <w:pStyle w:val="Compact"/>
               <w:jc w:val="left"/>
+              <w:keepNext/>
             </w:pPr>
             <w:r>
               <w:t xml:space="preserve">selective withholders</w:t>
@@ -8272,6 +8518,7 @@
             <w:pPr>
               <w:pStyle w:val="Compact"/>
               <w:jc w:val="right"/>
+              <w:keepNext/>
             </w:pPr>
             <w:r>
               <w:t xml:space="preserve">100.0% [99.997, 100.000]</w:t>
@@ -8284,6 +8531,7 @@
             <w:pPr>
               <w:pStyle w:val="Compact"/>
               <w:jc w:val="right"/>
+              <w:keepNext/>
             </w:pPr>
             <w:r>
               <w:t xml:space="preserve">0.0% [0.000, 0.003]</w:t>
@@ -8296,6 +8544,7 @@
             <w:pPr>
               <w:pStyle w:val="Compact"/>
               <w:jc w:val="right"/>
+              <w:keepNext/>
             </w:pPr>
             <w:r>
               <w:t xml:space="preserve">–</w:t>
@@ -8308,6 +8557,7 @@
             <w:pPr>
               <w:pStyle w:val="Compact"/>
               <w:jc w:val="right"/>
+              <w:keepNext/>
             </w:pPr>
             <w:r>
               <w:t xml:space="preserve">–</w:t>
@@ -8320,6 +8570,7 @@
             <w:pPr>
               <w:pStyle w:val="Compact"/>
               <w:jc w:val="right"/>
+              <w:keepNext/>
             </w:pPr>
             <w:r>
               <w:t xml:space="preserve">–</w:t>
@@ -8328,12 +8579,16 @@
         </w:tc>
       </w:tr>
       <w:tr>
+        <w:trPr>
+          <w:cantSplit/>
+        </w:trPr>
         <w:tc>
           <w:tcPr/>
           <w:p>
             <w:pPr>
               <w:pStyle w:val="Compact"/>
               <w:jc w:val="left"/>
+              <w:keepNext/>
             </w:pPr>
             <w:r>
               <w:rPr>
@@ -8389,49 +8644,58 @@
           <w:p>
             <w:pPr>
               <w:pStyle w:val="Compact"/>
-            </w:pPr>
-          </w:p>
-        </w:tc>
-        <w:tc>
-          <w:tcPr/>
-          <w:p>
-            <w:pPr>
-              <w:pStyle w:val="Compact"/>
-            </w:pPr>
-          </w:p>
-        </w:tc>
-        <w:tc>
-          <w:tcPr/>
-          <w:p>
-            <w:pPr>
-              <w:pStyle w:val="Compact"/>
-            </w:pPr>
-          </w:p>
-        </w:tc>
-        <w:tc>
-          <w:tcPr/>
-          <w:p>
-            <w:pPr>
-              <w:pStyle w:val="Compact"/>
-            </w:pPr>
-          </w:p>
-        </w:tc>
-        <w:tc>
-          <w:tcPr/>
-          <w:p>
-            <w:pPr>
-              <w:pStyle w:val="Compact"/>
+              <w:keepNext/>
+            </w:pPr>
+          </w:p>
+        </w:tc>
+        <w:tc>
+          <w:tcPr/>
+          <w:p>
+            <w:pPr>
+              <w:pStyle w:val="Compact"/>
+              <w:keepNext/>
+            </w:pPr>
+          </w:p>
+        </w:tc>
+        <w:tc>
+          <w:tcPr/>
+          <w:p>
+            <w:pPr>
+              <w:pStyle w:val="Compact"/>
+              <w:keepNext/>
+            </w:pPr>
+          </w:p>
+        </w:tc>
+        <w:tc>
+          <w:tcPr/>
+          <w:p>
+            <w:pPr>
+              <w:pStyle w:val="Compact"/>
+              <w:keepNext/>
+            </w:pPr>
+          </w:p>
+        </w:tc>
+        <w:tc>
+          <w:tcPr/>
+          <w:p>
+            <w:pPr>
+              <w:pStyle w:val="Compact"/>
+              <w:keepNext/>
             </w:pPr>
           </w:p>
         </w:tc>
       </w:tr>
       <w:tr>
+        <w:trPr>
+          <w:cantSplit/>
+        </w:trPr>
         <w:tc>
           <w:tcPr/>
           <w:p>
             <w:pPr>
               <w:pStyle w:val="Compact"/>
               <w:jc w:val="left"/>
+              <w:keepNext/>
             </w:pPr>
             <w:r>
               <w:t xml:space="preserve">control</w:t>
@@ -8444,6 +8708,7 @@
             <w:pPr>
               <w:pStyle w:val="Compact"/>
               <w:jc w:val="right"/>
+              <w:keepNext/>
             </w:pPr>
             <w:r>
               <w:t xml:space="preserve">100.0% [98.7, 100.0]</w:t>
@@ -8456,6 +8721,7 @@
             <w:pPr>
               <w:pStyle w:val="Compact"/>
               <w:jc w:val="right"/>
+              <w:keepNext/>
             </w:pPr>
             <w:r>
               <w:t xml:space="preserve">0.0% [0.0, 1.3]</w:t>
@@ -8468,6 +8734,7 @@
             <w:pPr>
               <w:pStyle w:val="Compact"/>
               <w:jc w:val="right"/>
+              <w:keepNext/>
             </w:pPr>
             <w:r>
               <w:t xml:space="preserve">99.7%</w:t>
@@ -8480,6 +8747,7 @@
             <w:pPr>
               <w:pStyle w:val="Compact"/>
               <w:jc w:val="right"/>
+              <w:keepNext/>
             </w:pPr>
             <w:r>
               <w:t xml:space="preserve">3818 ms</w:t>
@@ -8492,6 +8760,7 @@
             <w:pPr>
               <w:pStyle w:val="Compact"/>
               <w:jc w:val="right"/>
+              <w:keepNext/>
             </w:pPr>
             <w:r>
               <w:t xml:space="preserve">3936 ms</w:t>
@@ -8500,12 +8769,16 @@
         </w:tc>
       </w:tr>
       <w:tr>
+        <w:trPr>
+          <w:cantSplit/>
+        </w:trPr>
         <w:tc>
           <w:tcPr/>
           <w:p>
             <w:pPr>
               <w:pStyle w:val="Compact"/>
               <w:jc w:val="left"/>
+              <w:keepNext/>
             </w:pPr>
             <w:r>
               <w:t xml:space="preserve">regional</w:t>
@@ -8518,6 +8791,7 @@
             <w:pPr>
               <w:pStyle w:val="Compact"/>
               <w:jc w:val="right"/>
+              <w:keepNext/>
             </w:pPr>
             <w:r>
               <w:t xml:space="preserve">100.0% [98.7, 100.0]</w:t>
@@ -8530,6 +8804,7 @@
             <w:pPr>
               <w:pStyle w:val="Compact"/>
               <w:jc w:val="right"/>
+              <w:keepNext/>
             </w:pPr>
             <w:r>
               <w:t xml:space="preserve">0.0% [0.0, 1.3]</w:t>
@@ -8542,6 +8817,7 @@
             <w:pPr>
               <w:pStyle w:val="Compact"/>
               <w:jc w:val="right"/>
+              <w:keepNext/>
             </w:pPr>
             <w:r>
               <w:t xml:space="preserve">100.0%</w:t>
@@ -8554,6 +8830,7 @@
             <w:pPr>
               <w:pStyle w:val="Compact"/>
               <w:jc w:val="right"/>
+              <w:keepNext/>
             </w:pPr>
             <w:r>
               <w:t xml:space="preserve">3841 ms</w:t>
@@ -8566,6 +8843,7 @@
             <w:pPr>
               <w:pStyle w:val="Compact"/>
               <w:jc w:val="right"/>
+              <w:keepNext/>
             </w:pPr>
             <w:r>
               <w:t xml:space="preserve">3908 ms</w:t>
@@ -8574,12 +8852,16 @@
         </w:tc>
       </w:tr>
       <w:tr>
+        <w:trPr>
+          <w:cantSplit/>
+        </w:trPr>
         <w:tc>
           <w:tcPr/>
           <w:p>
             <w:pPr>
               <w:pStyle w:val="Compact"/>
               <w:jc w:val="left"/>
+              <w:keepNext/>
             </w:pPr>
             <w:r>
               <w:t xml:space="preserve">global</w:t>
@@ -8592,6 +8874,7 @@
             <w:pPr>
               <w:pStyle w:val="Compact"/>
               <w:jc w:val="right"/>
+              <w:keepNext/>
             </w:pPr>
             <w:r>
               <w:t xml:space="preserve">100.0% [98.7, 100.0]</w:t>
@@ -8604,6 +8887,7 @@
             <w:pPr>
               <w:pStyle w:val="Compact"/>
               <w:jc w:val="right"/>
+              <w:keepNext/>
             </w:pPr>
             <w:r>
               <w:t xml:space="preserve">0.0% [0.0, 1.3]</w:t>
@@ -8616,6 +8900,7 @@
             <w:pPr>
               <w:pStyle w:val="Compact"/>
               <w:jc w:val="right"/>
+              <w:keepNext/>
             </w:pPr>
             <w:r>
               <w:t xml:space="preserve">100.0%</w:t>
@@ -8628,6 +8913,7 @@
             <w:pPr>
               <w:pStyle w:val="Compact"/>
               <w:jc w:val="right"/>
+              <w:keepNext/>
             </w:pPr>
             <w:r>
               <w:t xml:space="preserve">3875 ms</w:t>
@@ -8640,6 +8926,7 @@
             <w:pPr>
               <w:pStyle w:val="Compact"/>
               <w:jc w:val="right"/>
+              <w:keepNext/>
             </w:pPr>
             <w:r>
               <w:t xml:space="preserve">4016 ms</w:t>
@@ -8648,12 +8935,16 @@
         </w:tc>
       </w:tr>
       <w:tr>
+        <w:trPr>
+          <w:cantSplit/>
+        </w:trPr>
         <w:tc>
           <w:tcPr/>
           <w:p>
             <w:pPr>
               <w:pStyle w:val="Compact"/>
               <w:jc w:val="left"/>
+              <w:keepNext/>
             </w:pPr>
             <w:r>
               <w:t xml:space="preserve">global loss2</w:t>
@@ -8666,6 +8957,7 @@
             <w:pPr>
               <w:pStyle w:val="Compact"/>
               <w:jc w:val="right"/>
+              <w:keepNext/>
             </w:pPr>
             <w:r>
               <w:t xml:space="preserve">71.7% [66.3, 76.5]</w:t>
@@ -8678,6 +8970,7 @@
             <w:pPr>
               <w:pStyle w:val="Compact"/>
               <w:jc w:val="right"/>
+              <w:keepNext/>
             </w:pPr>
             <w:r>
               <w:t xml:space="preserve">0.0% [0.0, 1.3]</w:t>
@@ -8690,6 +8983,7 @@
             <w:pPr>
               <w:pStyle w:val="Compact"/>
               <w:jc w:val="right"/>
+              <w:keepNext/>
             </w:pPr>
             <w:r>
               <w:t xml:space="preserve">100.0%</w:t>
@@ -8702,6 +8996,7 @@
             <w:pPr>
               <w:pStyle w:val="Compact"/>
               <w:jc w:val="right"/>
+              <w:keepNext/>
             </w:pPr>
             <w:r>
               <w:t xml:space="preserve">3829 ms</w:t>
@@ -8714,6 +9009,7 @@
             <w:pPr>
               <w:pStyle w:val="Compact"/>
               <w:jc w:val="right"/>
+              <w:keepNext/>
             </w:pPr>
             <w:r>
               <w:t xml:space="preserve">3886 ms</w:t>
@@ -8722,12 +9018,16 @@
         </w:tc>
       </w:tr>
       <w:tr>
+        <w:trPr>
+          <w:cantSplit/>
+        </w:trPr>
         <w:tc>
           <w:tcPr/>
           <w:p>
             <w:pPr>
               <w:pStyle w:val="Compact"/>
               <w:jc w:val="left"/>
+              <w:keepNext/>
             </w:pPr>
             <w:r>
               <w:t xml:space="preserve">global crash10</w:t>
@@ -8740,6 +9040,7 @@
             <w:pPr>
               <w:pStyle w:val="Compact"/>
               <w:jc w:val="right"/>
+              <w:keepNext/>
             </w:pPr>
             <w:r>
               <w:t xml:space="preserve">2.3% [1.1, 4.7]</w:t>
@@ -8752,6 +9053,7 @@
             <w:pPr>
               <w:pStyle w:val="Compact"/>
               <w:jc w:val="right"/>
+              <w:keepNext/>
             </w:pPr>
             <w:r>
               <w:t xml:space="preserve">0.0% [0.0, 1.3]</w:t>
@@ -8764,6 +9066,7 @@
             <w:pPr>
               <w:pStyle w:val="Compact"/>
               <w:jc w:val="right"/>
+              <w:keepNext/>
             </w:pPr>
             <w:r>
               <w:t xml:space="preserve">100.0%</w:t>
@@ -8776,6 +9079,7 @@
             <w:pPr>
               <w:pStyle w:val="Compact"/>
               <w:jc w:val="right"/>
+              <w:keepNext/>
             </w:pPr>
             <w:r>
               <w:t xml:space="preserve">3692 ms</w:t>
@@ -8788,6 +9092,7 @@
             <w:pPr>
               <w:pStyle w:val="Compact"/>
               <w:jc w:val="right"/>
+              <w:keepNext/>
             </w:pPr>
             <w:r>
               <w:t xml:space="preserve">3775 ms</w:t>
@@ -8796,12 +9101,16 @@
         </w:tc>
       </w:tr>
       <w:tr>
+        <w:trPr>
+          <w:cantSplit/>
+        </w:trPr>
         <w:tc>
           <w:tcPr/>
           <w:p>
             <w:pPr>
               <w:pStyle w:val="Compact"/>
               <w:jc w:val="left"/>
+              <w:keepNext/>
             </w:pPr>
             <w:r>
               <w:t xml:space="preserve">global crash11</w:t>
@@ -8814,6 +9123,7 @@
             <w:pPr>
               <w:pStyle w:val="Compact"/>
               <w:jc w:val="right"/>
+              <w:keepNext/>
             </w:pPr>
             <w:r>
               <w:t xml:space="preserve">1.7% [0.7, 3.8]</w:t>
@@ -8826,6 +9136,7 @@
             <w:pPr>
               <w:pStyle w:val="Compact"/>
               <w:jc w:val="right"/>
+              <w:keepNext/>
             </w:pPr>
             <w:r>
               <w:t xml:space="preserve">0.0% [0.0, 1.3]</w:t>
@@ -8838,6 +9149,7 @@
             <w:pPr>
               <w:pStyle w:val="Compact"/>
               <w:jc w:val="right"/>
+              <w:keepNext/>
             </w:pPr>
             <w:r>
               <w:t xml:space="preserve">0.0%</w:t>
@@ -8850,6 +9162,7 @@
             <w:pPr>
               <w:pStyle w:val="Compact"/>
               <w:jc w:val="right"/>
+              <w:keepNext/>
             </w:pPr>
             <w:r>
               <w:t xml:space="preserve">–</w:t>
@@ -8862,6 +9175,7 @@
             <w:pPr>
               <w:pStyle w:val="Compact"/>
               <w:jc w:val="right"/>
+              <w:keepNext/>
             </w:pPr>
             <w:r>
               <w:t xml:space="preserve">–</w:t>
@@ -8870,12 +9184,16 @@
         </w:tc>
       </w:tr>
       <w:tr>
+        <w:trPr>
+          <w:cantSplit/>
+        </w:trPr>
         <w:tc>
           <w:tcPr/>
           <w:p>
             <w:pPr>
               <w:pStyle w:val="Compact"/>
               <w:jc w:val="left"/>
+              <w:keepNext/>
             </w:pPr>
             <w:r>
               <w:t xml:space="preserve">global domain outage</w:t>
@@ -8888,6 +9206,7 @@
             <w:pPr>
               <w:pStyle w:val="Compact"/>
               <w:jc w:val="right"/>
+              <w:keepNext/>
             </w:pPr>
             <w:r>
               <w:t xml:space="preserve">5.7% [3.6, 8.9]</w:t>
@@ -8900,6 +9219,7 @@
             <w:pPr>
               <w:pStyle w:val="Compact"/>
               <w:jc w:val="right"/>
+              <w:keepNext/>
             </w:pPr>
             <w:r>
               <w:t xml:space="preserve">0.0% [0.0, 1.3]</w:t>
@@ -8912,6 +9232,7 @@
             <w:pPr>
               <w:pStyle w:val="Compact"/>
               <w:jc w:val="right"/>
+              <w:keepNext/>
             </w:pPr>
             <w:r>
               <w:t xml:space="preserve">100.0%</w:t>
@@ -8924,6 +9245,7 @@
             <w:pPr>
               <w:pStyle w:val="Compact"/>
               <w:jc w:val="right"/>
+              <w:keepNext/>
             </w:pPr>
             <w:r>
               <w:t xml:space="preserve">3700 ms</w:t>
@@ -8936,6 +9258,7 @@
             <w:pPr>
               <w:pStyle w:val="Compact"/>
               <w:jc w:val="right"/>
+              <w:keepNext/>
             </w:pPr>
             <w:r>
               <w:t xml:space="preserve">3780 ms</w:t>
@@ -8944,6 +9267,9 @@
         </w:tc>
       </w:tr>
       <w:tr>
+        <w:trPr>
+          <w:cantSplit/>
+        </w:trPr>
         <w:tc>
           <w:tcPr/>
           <w:p>
@@ -9018,7 +9344,7 @@
         </w:tc>
       </w:tr>
     </w:tbl>
-    <w:bookmarkEnd w:id="42"/>
+    <w:bookmarkEnd w:id="39"/>
     <w:p>
       <w:pPr>
         <w:pStyle w:val="BodyText"/>
@@ -9076,7 +9402,7 @@
         <w:t xml:space="preserve">) with 94.8%, and two domains of sixteen, which violate the cap, with only 81.0%. These are exact values under a declared synthetic model; real domain labels and their independence are assumptions.</w:t>
       </w:r>
     </w:p>
-    <w:bookmarkStart w:id="46" w:name="fig:correlation"/>
+    <w:bookmarkStart w:id="43" w:name="fig:correlation"/>
     <w:p>
       <w:pPr>
         <w:pStyle w:val="CaptionedFigure"/>
@@ -9086,18 +9412,18 @@
           <wp:inline>
             <wp:extent cx="5334000" cy="2462530"/>
             <wp:effectExtent b="0" l="0" r="0" t="0"/>
-            <wp:docPr descr="" title="" id="44" name="Picture"/>
+            <wp:docPr descr="" title="" id="41" name="Picture"/>
             <a:graphic>
               <a:graphicData uri="http://schemas.openxmlformats.org/drawingml/2006/picture">
                 <pic:pic>
                   <pic:nvPicPr>
-                    <pic:cNvPr descr="figures/fig4_iid_vs_correlated.png" id="45" name="Picture"/>
+                    <pic:cNvPr descr="figures/fig4_iid_vs_correlated.png" id="42" name="Picture"/>
                     <pic:cNvPicPr>
                       <a:picLocks noChangeArrowheads="1" noChangeAspect="1"/>
                     </pic:cNvPicPr>
                   </pic:nvPicPr>
                   <pic:blipFill>
-                    <a:blip r:embed="rId43"/>
+                    <a:blip r:embed="rId40"/>
                     <a:stretch>
                       <a:fillRect/>
                     </a:stretch>
@@ -9243,8 +9569,8 @@
         <w:t xml:space="preserve">.</w:t>
       </w:r>
     </w:p>
-    <w:bookmarkEnd w:id="46"/>
-    <w:bookmarkStart w:id="50" w:name="fig:withholding"/>
+    <w:bookmarkEnd w:id="43"/>
+    <w:bookmarkStart w:id="47" w:name="fig:withholding"/>
     <w:p>
       <w:pPr>
         <w:pStyle w:val="CaptionedFigure"/>
@@ -9254,18 +9580,18 @@
           <wp:inline>
             <wp:extent cx="3033728" cy="2305878"/>
             <wp:effectExtent b="0" l="0" r="0" t="0"/>
-            <wp:docPr descr="" title="" id="48" name="Picture"/>
+            <wp:docPr descr="" title="" id="45" name="Picture"/>
             <a:graphic>
               <a:graphicData uri="http://schemas.openxmlformats.org/drawingml/2006/picture">
                 <pic:pic>
                   <pic:nvPicPr>
-                    <pic:cNvPr descr="figures/fig5_audit_vs_dispute_withholding.png" id="49" name="Picture"/>
+                    <pic:cNvPr descr="figures/fig5_audit_vs_dispute_withholding.png" id="46" name="Picture"/>
                     <pic:cNvPicPr>
                       <a:picLocks noChangeArrowheads="1" noChangeAspect="1"/>
                     </pic:cNvPicPr>
                   </pic:nvPicPr>
                   <pic:blipFill>
-                    <a:blip r:embed="rId47"/>
+                    <a:blip r:embed="rId44"/>
                     <a:stretch>
                       <a:fillRect/>
                     </a:stretch>
@@ -9343,9 +9669,9 @@
         <w:t xml:space="preserve">072-draw simulation cell.</w:t>
       </w:r>
     </w:p>
-    <w:bookmarkEnd w:id="50"/>
-    <w:bookmarkEnd w:id="51"/>
-    <w:bookmarkStart w:id="56" w:name="deadline-liveness-in-an-emulated-testbed"/>
+    <w:bookmarkEnd w:id="47"/>
+    <w:bookmarkEnd w:id="48"/>
+    <w:bookmarkStart w:id="53" w:name="deadline-liveness-in-an-emulated-testbed"/>
     <w:p>
       <w:pPr>
         <w:pStyle w:val="Heading2"/>
@@ -9550,7 +9876,7 @@
         <w:t xml:space="preserve">proofs at the combiner. We did not measure optimized, batched or parallel verification, which would shorten this term.</w:t>
       </w:r>
     </w:p>
-    <w:bookmarkStart w:id="55" w:name="fig:acceptance"/>
+    <w:bookmarkStart w:id="52" w:name="fig:acceptance"/>
     <w:p>
       <w:pPr>
         <w:pStyle w:val="CaptionedFigure"/>
@@ -9560,18 +9886,18 @@
           <wp:inline>
             <wp:extent cx="3015379" cy="2376216"/>
             <wp:effectExtent b="0" l="0" r="0" t="0"/>
-            <wp:docPr descr="" title="" id="53" name="Picture"/>
+            <wp:docPr descr="" title="" id="50" name="Picture"/>
             <a:graphic>
               <a:graphicData uri="http://schemas.openxmlformats.org/drawingml/2006/picture">
                 <pic:pic>
                   <pic:nvPicPr>
-                    <pic:cNvPr descr="figures/fig6_acceptance_tradeoff.png" id="54" name="Picture"/>
+                    <pic:cNvPr descr="figures/fig6_acceptance_tradeoff.png" id="51" name="Picture"/>
                     <pic:cNvPicPr>
                       <a:picLocks noChangeArrowheads="1" noChangeAspect="1"/>
                     </pic:cNvPicPr>
                   </pic:nvPicPr>
                   <pic:blipFill>
-                    <a:blip r:embed="rId52"/>
+                    <a:blip r:embed="rId49"/>
                     <a:stretch>
                       <a:fillRect/>
                     </a:stretch>
@@ -9637,9 +9963,9 @@
         <w:t xml:space="preserve">; one curve per sample size. Exact values from Table 2 and its full source grid.</w:t>
       </w:r>
     </w:p>
-    <w:bookmarkEnd w:id="55"/>
-    <w:bookmarkEnd w:id="56"/>
-    <w:bookmarkStart w:id="60" w:name="performance-and-scalability"/>
+    <w:bookmarkEnd w:id="52"/>
+    <w:bookmarkEnd w:id="53"/>
+    <w:bookmarkStart w:id="57" w:name="performance-and-scalability"/>
     <w:p>
       <w:pPr>
         <w:pStyle w:val="Heading2"/>
@@ -9698,10 +10024,11 @@
         <w:t xml:space="preserve">. Table 8 reports the bulletin-board gas costs measured in the Foundry harness.</w:t>
       </w:r>
     </w:p>
-    <w:bookmarkStart w:id="57" w:name="tab:scalability"/>
+    <w:bookmarkStart w:id="54" w:name="tab:scalability"/>
     <w:p>
       <w:pPr>
         <w:pStyle w:val="TableCaption"/>
+        <w:keepNext/>
       </w:pPr>
       <w:r>
         <w:t xml:space="preserve">Table 6. Scalability with</w:t>
@@ -9872,44 +10199,52 @@
         <w:gridCol w:w="990"/>
       </w:tblGrid>
       <w:tr>
-        <w:tc>
-          <w:tcPr/>
-          <w:p>
-            <w:pPr>
-              <w:pStyle w:val="Compact"/>
-            </w:pPr>
-          </w:p>
-        </w:tc>
-        <w:tc>
-          <w:tcPr/>
-          <w:p>
-            <w:pPr>
-              <w:pStyle w:val="Compact"/>
-            </w:pPr>
-          </w:p>
-        </w:tc>
-        <w:tc>
-          <w:tcPr/>
-          <w:p>
-            <w:pPr>
-              <w:pStyle w:val="Compact"/>
-            </w:pPr>
-          </w:p>
-        </w:tc>
-        <w:tc>
-          <w:tcPr/>
-          <w:p>
-            <w:pPr>
-              <w:pStyle w:val="Compact"/>
-            </w:pPr>
-          </w:p>
-        </w:tc>
-        <w:tc>
-          <w:tcPr/>
-          <w:p>
-            <w:pPr>
-              <w:pStyle w:val="Compact"/>
-              <w:jc w:val="right"/>
+        <w:trPr>
+          <w:cantSplit/>
+        </w:trPr>
+        <w:tc>
+          <w:tcPr/>
+          <w:p>
+            <w:pPr>
+              <w:pStyle w:val="Compact"/>
+              <w:keepNext/>
+            </w:pPr>
+          </w:p>
+        </w:tc>
+        <w:tc>
+          <w:tcPr/>
+          <w:p>
+            <w:pPr>
+              <w:pStyle w:val="Compact"/>
+              <w:keepNext/>
+            </w:pPr>
+          </w:p>
+        </w:tc>
+        <w:tc>
+          <w:tcPr/>
+          <w:p>
+            <w:pPr>
+              <w:pStyle w:val="Compact"/>
+              <w:keepNext/>
+            </w:pPr>
+          </w:p>
+        </w:tc>
+        <w:tc>
+          <w:tcPr/>
+          <w:p>
+            <w:pPr>
+              <w:pStyle w:val="Compact"/>
+              <w:keepNext/>
+            </w:pPr>
+          </w:p>
+        </w:tc>
+        <w:tc>
+          <w:tcPr/>
+          <w:p>
+            <w:pPr>
+              <w:pStyle w:val="Compact"/>
+              <w:jc w:val="right"/>
+              <w:keepNext/>
             </w:pPr>
             <w:r>
               <w:t xml:space="preserve">Audit, ffdhe2048</w:t>
@@ -9921,15 +10256,17 @@
           <w:p>
             <w:pPr>
               <w:pStyle w:val="Compact"/>
-            </w:pPr>
-          </w:p>
-        </w:tc>
-        <w:tc>
-          <w:tcPr/>
-          <w:p>
-            <w:pPr>
-              <w:pStyle w:val="Compact"/>
-              <w:jc w:val="right"/>
+              <w:keepNext/>
+            </w:pPr>
+          </w:p>
+        </w:tc>
+        <w:tc>
+          <w:tcPr/>
+          <w:p>
+            <w:pPr>
+              <w:pStyle w:val="Compact"/>
+              <w:jc w:val="right"/>
+              <w:keepNext/>
             </w:pPr>
             <w:r>
               <w:t xml:space="preserve">Dispute: verify</w:t>
@@ -9955,17 +10292,22 @@
           <w:p>
             <w:pPr>
               <w:pStyle w:val="Compact"/>
+              <w:keepNext/>
             </w:pPr>
           </w:p>
         </w:tc>
       </w:tr>
       <w:tr>
-        <w:tc>
-          <w:tcPr/>
-          <w:p>
-            <w:pPr>
-              <w:pStyle w:val="Compact"/>
-              <w:jc w:val="right"/>
+        <w:trPr>
+          <w:cantSplit/>
+        </w:trPr>
+        <w:tc>
+          <w:tcPr/>
+          <w:p>
+            <w:pPr>
+              <w:pStyle w:val="Compact"/>
+              <w:jc w:val="right"/>
+              <w:keepNext/>
             </w:pPr>
             <m:oMath>
               <m:r>
@@ -9983,6 +10325,7 @@
             <w:pPr>
               <w:pStyle w:val="Compact"/>
               <w:jc w:val="right"/>
+              <w:keepNext/>
             </w:pPr>
             <m:oMath>
               <m:r>
@@ -10000,6 +10343,7 @@
             <w:pPr>
               <w:pStyle w:val="Compact"/>
               <w:jc w:val="right"/>
+              <w:keepNext/>
             </w:pPr>
             <m:oMath>
               <m:r>
@@ -10017,6 +10361,7 @@
             <w:pPr>
               <w:pStyle w:val="Compact"/>
               <w:jc w:val="right"/>
+              <w:keepNext/>
             </w:pPr>
             <w:r>
               <w:t xml:space="preserve">Detection</w:t>
@@ -10029,6 +10374,7 @@
             <w:pPr>
               <w:pStyle w:val="Compact"/>
               <w:jc w:val="right"/>
+              <w:keepNext/>
             </w:pPr>
             <w:r>
               <w:t xml:space="preserve">CPU</w:t>
@@ -10041,6 +10387,7 @@
             <w:pPr>
               <w:pStyle w:val="Compact"/>
               <w:jc w:val="right"/>
+              <w:keepNext/>
             </w:pPr>
             <w:r>
               <w:t xml:space="preserve">Bytes</w:t>
@@ -10053,6 +10400,7 @@
             <w:pPr>
               <w:pStyle w:val="Compact"/>
               <w:jc w:val="right"/>
+              <w:keepNext/>
             </w:pPr>
             <w:r>
               <w:t xml:space="preserve">ffdhe2048</w:t>
@@ -10065,6 +10413,7 @@
             <w:pPr>
               <w:pStyle w:val="Compact"/>
               <w:jc w:val="right"/>
+              <w:keepNext/>
             </w:pPr>
             <w:r>
               <w:t xml:space="preserve">ffdhe3072</w:t>
@@ -10073,12 +10422,16 @@
         </w:tc>
       </w:tr>
       <w:tr>
-        <w:tc>
-          <w:tcPr/>
-          <w:p>
-            <w:pPr>
-              <w:pStyle w:val="Compact"/>
-              <w:jc w:val="right"/>
+        <w:trPr>
+          <w:cantSplit/>
+        </w:trPr>
+        <w:tc>
+          <w:tcPr/>
+          <w:p>
+            <w:pPr>
+              <w:pStyle w:val="Compact"/>
+              <w:jc w:val="right"/>
+              <w:keepNext/>
             </w:pPr>
             <w:r>
               <w:t xml:space="preserve">16</w:t>
@@ -10091,6 +10444,7 @@
             <w:pPr>
               <w:pStyle w:val="Compact"/>
               <w:jc w:val="right"/>
+              <w:keepNext/>
             </w:pPr>
             <w:r>
               <w:t xml:space="preserve">11</w:t>
@@ -10103,6 +10457,7 @@
             <w:pPr>
               <w:pStyle w:val="Compact"/>
               <w:jc w:val="right"/>
+              <w:keepNext/>
             </w:pPr>
             <w:r>
               <w:t xml:space="preserve">4</w:t>
@@ -10115,6 +10470,7 @@
             <w:pPr>
               <w:pStyle w:val="Compact"/>
               <w:jc w:val="right"/>
+              <w:keepNext/>
             </w:pPr>
             <w:r>
               <w:t xml:space="preserve">88.46%</w:t>
@@ -10127,6 +10483,7 @@
             <w:pPr>
               <w:pStyle w:val="Compact"/>
               <w:jc w:val="right"/>
+              <w:keepNext/>
             </w:pPr>
             <w:r>
               <w:t xml:space="preserve">1063 ms</w:t>
@@ -10139,6 +10496,7 @@
             <w:pPr>
               <w:pStyle w:val="Compact"/>
               <w:jc w:val="right"/>
+              <w:keepNext/>
             </w:pPr>
             <w:r>
               <w:t xml:space="preserve">4,819</w:t>
@@ -10151,6 +10509,7 @@
             <w:pPr>
               <w:pStyle w:val="Compact"/>
               <w:jc w:val="right"/>
+              <w:keepNext/>
             </w:pPr>
             <w:r>
               <w:t xml:space="preserve">1585 ms</w:t>
@@ -10163,6 +10522,7 @@
             <w:pPr>
               <w:pStyle w:val="Compact"/>
               <w:jc w:val="right"/>
+              <w:keepNext/>
             </w:pPr>
             <w:r>
               <w:t xml:space="preserve">5040 ms</w:t>
@@ -10171,12 +10531,16 @@
         </w:tc>
       </w:tr>
       <w:tr>
-        <w:tc>
-          <w:tcPr/>
-          <w:p>
-            <w:pPr>
-              <w:pStyle w:val="Compact"/>
-              <w:jc w:val="right"/>
+        <w:trPr>
+          <w:cantSplit/>
+        </w:trPr>
+        <w:tc>
+          <w:tcPr/>
+          <w:p>
+            <w:pPr>
+              <w:pStyle w:val="Compact"/>
+              <w:jc w:val="right"/>
+              <w:keepNext/>
             </w:pPr>
             <w:r>
               <w:t xml:space="preserve">32</w:t>
@@ -10189,6 +10553,7 @@
             <w:pPr>
               <w:pStyle w:val="Compact"/>
               <w:jc w:val="right"/>
+              <w:keepNext/>
             </w:pPr>
             <w:r>
               <w:t xml:space="preserve">22</w:t>
@@ -10201,6 +10566,7 @@
             <w:pPr>
               <w:pStyle w:val="Compact"/>
               <w:jc w:val="right"/>
+              <w:keepNext/>
             </w:pPr>
             <w:r>
               <w:t xml:space="preserve">8</w:t>
@@ -10213,6 +10579,7 @@
             <w:pPr>
               <w:pStyle w:val="Compact"/>
               <w:jc w:val="right"/>
+              <w:keepNext/>
             </w:pPr>
             <w:r>
               <w:t xml:space="preserve">98.07%</w:t>
@@ -10225,6 +10592,7 @@
             <w:pPr>
               <w:pStyle w:val="Compact"/>
               <w:jc w:val="right"/>
+              <w:keepNext/>
             </w:pPr>
             <w:r>
               <w:t xml:space="preserve">2125 ms</w:t>
@@ -10237,6 +10605,7 @@
             <w:pPr>
               <w:pStyle w:val="Compact"/>
               <w:jc w:val="right"/>
+              <w:keepNext/>
             </w:pPr>
             <w:r>
               <w:t xml:space="preserve">9,415</w:t>
@@ -10249,6 +10618,7 @@
             <w:pPr>
               <w:pStyle w:val="Compact"/>
               <w:jc w:val="right"/>
+              <w:keepNext/>
             </w:pPr>
             <w:r>
               <w:t xml:space="preserve">3213 ms</w:t>
@@ -10261,6 +10631,7 @@
             <w:pPr>
               <w:pStyle w:val="Compact"/>
               <w:jc w:val="right"/>
+              <w:keepNext/>
             </w:pPr>
             <w:r>
               <w:t xml:space="preserve">10201 ms</w:t>
@@ -10269,12 +10640,16 @@
         </w:tc>
       </w:tr>
       <w:tr>
-        <w:tc>
-          <w:tcPr/>
-          <w:p>
-            <w:pPr>
-              <w:pStyle w:val="Compact"/>
-              <w:jc w:val="right"/>
+        <w:trPr>
+          <w:cantSplit/>
+        </w:trPr>
+        <w:tc>
+          <w:tcPr/>
+          <w:p>
+            <w:pPr>
+              <w:pStyle w:val="Compact"/>
+              <w:jc w:val="right"/>
+              <w:keepNext/>
             </w:pPr>
             <w:r>
               <w:t xml:space="preserve">64</w:t>
@@ -10287,6 +10662,7 @@
             <w:pPr>
               <w:pStyle w:val="Compact"/>
               <w:jc w:val="right"/>
+              <w:keepNext/>
             </w:pPr>
             <w:r>
               <w:t xml:space="preserve">43</w:t>
@@ -10299,6 +10675,7 @@
             <w:pPr>
               <w:pStyle w:val="Compact"/>
               <w:jc w:val="right"/>
+              <w:keepNext/>
             </w:pPr>
             <w:r>
               <w:t xml:space="preserve">12</w:t>
@@ -10311,6 +10688,7 @@
             <w:pPr>
               <w:pStyle w:val="Compact"/>
               <w:jc w:val="right"/>
+              <w:keepNext/>
             </w:pPr>
             <w:r>
               <w:t xml:space="preserve">99.66%</w:t>
@@ -10323,6 +10701,7 @@
             <w:pPr>
               <w:pStyle w:val="Compact"/>
               <w:jc w:val="right"/>
+              <w:keepNext/>
             </w:pPr>
             <w:r>
               <w:t xml:space="preserve">3188 ms</w:t>
@@ -10335,6 +10714,7 @@
             <w:pPr>
               <w:pStyle w:val="Compact"/>
               <w:jc w:val="right"/>
+              <w:keepNext/>
             </w:pPr>
             <w:r>
               <w:t xml:space="preserve">14,011</w:t>
@@ -10347,6 +10727,7 @@
             <w:pPr>
               <w:pStyle w:val="Compact"/>
               <w:jc w:val="right"/>
+              <w:keepNext/>
             </w:pPr>
             <w:r>
               <w:t xml:space="preserve">6230 ms</w:t>
@@ -10359,6 +10740,7 @@
             <w:pPr>
               <w:pStyle w:val="Compact"/>
               <w:jc w:val="right"/>
+              <w:keepNext/>
             </w:pPr>
             <w:r>
               <w:t xml:space="preserve">20086 ms</w:t>
@@ -10367,6 +10749,9 @@
         </w:tc>
       </w:tr>
       <w:tr>
+        <w:trPr>
+          <w:cantSplit/>
+        </w:trPr>
         <w:tc>
           <w:tcPr/>
           <w:p>
@@ -10465,12 +10850,13 @@
         </w:tc>
       </w:tr>
     </w:tbl>
-    <w:bookmarkEnd w:id="57"/>
+    <w:bookmarkEnd w:id="54"/>
     <w:p/>
-    <w:bookmarkStart w:id="58" w:name="tab:operations"/>
+    <w:bookmarkStart w:id="55" w:name="tab:operations"/>
     <w:p>
       <w:pPr>
         <w:pStyle w:val="TableCaption"/>
+        <w:keepNext/>
       </w:pPr>
       <w:r>
         <w:t xml:space="preserve">Table 7. Median wall time per operation, CPython 3.13 on an Apple M4 Pro; RFC 7919 groups</w:t>
@@ -10557,6 +10943,7 @@
       <w:tr>
         <w:trPr>
           <w:tblHeader w:val="on"/>
+          <w:cantSplit/>
         </w:trPr>
         <w:tc>
           <w:tcPr/>
@@ -10564,6 +10951,7 @@
             <w:pPr>
               <w:pStyle w:val="Compact"/>
               <w:jc w:val="left"/>
+              <w:keepNext/>
             </w:pPr>
             <w:r>
               <w:t xml:space="preserve">Operation (median, ms)</w:t>
@@ -10576,6 +10964,7 @@
             <w:pPr>
               <w:pStyle w:val="Compact"/>
               <w:jc w:val="right"/>
+              <w:keepNext/>
             </w:pPr>
             <w:r>
               <w:t xml:space="preserve">256-bit prototype</w:t>
@@ -10588,6 +10977,7 @@
             <w:pPr>
               <w:pStyle w:val="Compact"/>
               <w:jc w:val="right"/>
+              <w:keepNext/>
             </w:pPr>
             <w:r>
               <w:t xml:space="preserve">ffdhe2048</w:t>
@@ -10600,6 +10990,7 @@
             <w:pPr>
               <w:pStyle w:val="Compact"/>
               <w:jc w:val="right"/>
+              <w:keepNext/>
             </w:pPr>
             <w:r>
               <w:t xml:space="preserve">ffdhe3072</w:t>
@@ -10608,12 +10999,16 @@
         </w:tc>
       </w:tr>
       <w:tr>
+        <w:trPr>
+          <w:cantSplit/>
+        </w:trPr>
         <w:tc>
           <w:tcPr/>
           <w:p>
             <w:pPr>
               <w:pStyle w:val="Compact"/>
               <w:jc w:val="left"/>
+              <w:keepNext/>
             </w:pPr>
             <w:r>
               <w:t xml:space="preserve">Canary derivation</w:t>
@@ -10643,6 +11038,7 @@
             <w:pPr>
               <w:pStyle w:val="Compact"/>
               <w:jc w:val="right"/>
+              <w:keepNext/>
             </w:pPr>
             <w:r>
               <w:t xml:space="preserve">0.08</w:t>
@@ -10655,6 +11051,7 @@
             <w:pPr>
               <w:pStyle w:val="Compact"/>
               <w:jc w:val="right"/>
+              <w:keepNext/>
             </w:pPr>
             <w:r>
               <w:t xml:space="preserve">16.99</w:t>
@@ -10667,6 +11064,7 @@
             <w:pPr>
               <w:pStyle w:val="Compact"/>
               <w:jc w:val="right"/>
+              <w:keepNext/>
             </w:pPr>
             <w:r>
               <w:t xml:space="preserve">54.32</w:t>
@@ -10675,12 +11073,16 @@
         </w:tc>
       </w:tr>
       <w:tr>
+        <w:trPr>
+          <w:cantSplit/>
+        </w:trPr>
         <w:tc>
           <w:tcPr/>
           <w:p>
             <w:pPr>
               <w:pStyle w:val="Compact"/>
               <w:jc w:val="left"/>
+              <w:keepNext/>
             </w:pPr>
             <w:r>
               <w:t xml:space="preserve">Partial decryption + DLEQ proof</w:t>
@@ -10693,6 +11095,7 @@
             <w:pPr>
               <w:pStyle w:val="Compact"/>
               <w:jc w:val="right"/>
+              <w:keepNext/>
             </w:pPr>
             <w:r>
               <w:t xml:space="preserve">0.58</w:t>
@@ -10705,6 +11108,7 @@
             <w:pPr>
               <w:pStyle w:val="Compact"/>
               <w:jc w:val="right"/>
+              <w:keepNext/>
             </w:pPr>
             <w:r>
               <w:t xml:space="preserve">130.30</w:t>
@@ -10717,6 +11121,7 @@
             <w:pPr>
               <w:pStyle w:val="Compact"/>
               <w:jc w:val="right"/>
+              <w:keepNext/>
             </w:pPr>
             <w:r>
               <w:t xml:space="preserve">420.54</w:t>
@@ -10725,12 +11130,16 @@
         </w:tc>
       </w:tr>
       <w:tr>
+        <w:trPr>
+          <w:cantSplit/>
+        </w:trPr>
         <w:tc>
           <w:tcPr/>
           <w:p>
             <w:pPr>
               <w:pStyle w:val="Compact"/>
               <w:jc w:val="left"/>
+              <w:keepNext/>
             </w:pPr>
             <w:r>
               <w:t xml:space="preserve">DLEQ verification</w:t>
@@ -10743,6 +11152,7 @@
             <w:pPr>
               <w:pStyle w:val="Compact"/>
               <w:jc w:val="right"/>
+              <w:keepNext/>
             </w:pPr>
             <w:r>
               <w:t xml:space="preserve">0.75</w:t>
@@ -10755,6 +11165,7 @@
             <w:pPr>
               <w:pStyle w:val="Compact"/>
               <w:jc w:val="right"/>
+              <w:keepNext/>
             </w:pPr>
             <w:r>
               <w:t xml:space="preserve">135.36</w:t>
@@ -10767,6 +11178,7 @@
             <w:pPr>
               <w:pStyle w:val="Compact"/>
               <w:jc w:val="right"/>
+              <w:keepNext/>
             </w:pPr>
             <w:r>
               <w:t xml:space="preserve">430.58</w:t>
@@ -10775,12 +11187,16 @@
         </w:tc>
       </w:tr>
       <w:tr>
+        <w:trPr>
+          <w:cantSplit/>
+        </w:trPr>
         <w:tc>
           <w:tcPr/>
           <w:p>
             <w:pPr>
               <w:pStyle w:val="Compact"/>
               <w:jc w:val="left"/>
+              <w:keepNext/>
             </w:pPr>
             <w:r>
               <w:t xml:space="preserve">Seal 1 KiB record</w:t>
@@ -10793,6 +11209,7 @@
             <w:pPr>
               <w:pStyle w:val="Compact"/>
               <w:jc w:val="right"/>
+              <w:keepNext/>
             </w:pPr>
             <w:r>
               <w:t xml:space="preserve">0.22</w:t>
@@ -10805,6 +11222,7 @@
             <w:pPr>
               <w:pStyle w:val="Compact"/>
               <w:jc w:val="right"/>
+              <w:keepNext/>
             </w:pPr>
             <w:r>
               <w:t xml:space="preserve">48.32</w:t>
@@ -10817,6 +11235,7 @@
             <w:pPr>
               <w:pStyle w:val="Compact"/>
               <w:jc w:val="right"/>
+              <w:keepNext/>
             </w:pPr>
             <w:r>
               <w:t xml:space="preserve">156.48</w:t>
@@ -10825,6 +11244,9 @@
         </w:tc>
       </w:tr>
       <w:tr>
+        <w:trPr>
+          <w:cantSplit/>
+        </w:trPr>
         <w:tc>
           <w:tcPr/>
           <w:p>
@@ -10875,12 +11297,13 @@
         </w:tc>
       </w:tr>
     </w:tbl>
-    <w:bookmarkEnd w:id="58"/>
+    <w:bookmarkEnd w:id="55"/>
     <w:p/>
-    <w:bookmarkStart w:id="59" w:name="tab:gas"/>
+    <w:bookmarkStart w:id="56" w:name="tab:gas"/>
     <w:p>
       <w:pPr>
         <w:pStyle w:val="TableCaption"/>
+        <w:keepNext/>
       </w:pPr>
       <w:r>
         <w:t xml:space="preserve">Table 8. Bulletin-board gas per operation, re-measured for this revision with Foundry 1.5.1 and Solidity 0.8.24 (test-body gas; fixture setup excluded). Each operation was measured in the small harness committee named in the scope column; values are deterministic and identical to the earlier snapshot.</w:t>
@@ -10901,6 +11324,7 @@
       <w:tr>
         <w:trPr>
           <w:tblHeader w:val="on"/>
+          <w:cantSplit/>
         </w:trPr>
         <w:tc>
           <w:tcPr/>
@@ -10908,6 +11332,7 @@
             <w:pPr>
               <w:pStyle w:val="Compact"/>
               <w:jc w:val="left"/>
+              <w:keepNext/>
             </w:pPr>
             <w:r>
               <w:t xml:space="preserve">Bulletin-board operation</w:t>
@@ -10920,6 +11345,7 @@
             <w:pPr>
               <w:pStyle w:val="Compact"/>
               <w:jc w:val="right"/>
+              <w:keepNext/>
             </w:pPr>
             <w:r>
               <w:t xml:space="preserve">Gas</w:t>
@@ -10932,6 +11358,7 @@
             <w:pPr>
               <w:pStyle w:val="Compact"/>
               <w:jc w:val="left"/>
+              <w:keepNext/>
             </w:pPr>
             <w:r>
               <w:t xml:space="preserve">Harness scope</w:t>
@@ -10940,12 +11367,16 @@
         </w:tc>
       </w:tr>
       <w:tr>
+        <w:trPr>
+          <w:cantSplit/>
+        </w:trPr>
         <w:tc>
           <w:tcPr/>
           <w:p>
             <w:pPr>
               <w:pStyle w:val="Compact"/>
               <w:jc w:val="left"/>
+              <w:keepNext/>
             </w:pPr>
             <w:r>
               <w:t xml:space="preserve">Register epoch</w:t>
@@ -10958,6 +11389,7 @@
             <w:pPr>
               <w:pStyle w:val="Compact"/>
               <w:jc w:val="right"/>
+              <w:keepNext/>
             </w:pPr>
             <w:r>
               <w:t xml:space="preserve">223,629</w:t>
@@ -10970,6 +11402,7 @@
             <w:pPr>
               <w:pStyle w:val="Compact"/>
               <w:jc w:val="left"/>
+              <w:keepNext/>
             </w:pPr>
             <w:r>
               <w:t xml:space="preserve">n=5, t=3; duplicate-identity validation enabled</w:t>
@@ -10978,12 +11411,16 @@
         </w:tc>
       </w:tr>
       <w:tr>
+        <w:trPr>
+          <w:cantSplit/>
+        </w:trPr>
         <w:tc>
           <w:tcPr/>
           <w:p>
             <w:pPr>
               <w:pStyle w:val="Compact"/>
               <w:jc w:val="left"/>
+              <w:keepNext/>
             </w:pPr>
             <w:r>
               <w:t xml:space="preserve">Open audit</w:t>
@@ -10996,6 +11433,7 @@
             <w:pPr>
               <w:pStyle w:val="Compact"/>
               <w:jc w:val="right"/>
+              <w:keepNext/>
             </w:pPr>
             <w:r>
               <w:t xml:space="preserve">125,107</w:t>
@@ -11008,6 +11446,7 @@
             <w:pPr>
               <w:pStyle w:val="Compact"/>
               <w:jc w:val="left"/>
+              <w:keepNext/>
             </w:pPr>
             <w:r>
               <w:t xml:space="preserve">three sampled members; q=3</w:t>
@@ -11016,12 +11455,16 @@
         </w:tc>
       </w:tr>
       <w:tr>
+        <w:trPr>
+          <w:cantSplit/>
+        </w:trPr>
         <w:tc>
           <w:tcPr/>
           <w:p>
             <w:pPr>
               <w:pStyle w:val="Compact"/>
               <w:jc w:val="left"/>
+              <w:keepNext/>
             </w:pPr>
             <w:r>
               <w:t xml:space="preserve">Submit audit response</w:t>
@@ -11034,6 +11477,7 @@
             <w:pPr>
               <w:pStyle w:val="Compact"/>
               <w:jc w:val="right"/>
+              <w:keepNext/>
             </w:pPr>
             <w:r>
               <w:t xml:space="preserve">57,882</w:t>
@@ -11046,6 +11490,7 @@
             <w:pPr>
               <w:pStyle w:val="Compact"/>
               <w:jc w:val="left"/>
+              <w:keepNext/>
             </w:pPr>
             <w:r>
               <w:t xml:space="preserve">first commitment from one sampled custodian</w:t>
@@ -11054,12 +11499,16 @@
         </w:tc>
       </w:tr>
       <w:tr>
+        <w:trPr>
+          <w:cantSplit/>
+        </w:trPr>
         <w:tc>
           <w:tcPr/>
           <w:p>
             <w:pPr>
               <w:pStyle w:val="Compact"/>
               <w:jc w:val="left"/>
+              <w:keepNext/>
             </w:pPr>
             <w:r>
               <w:t xml:space="preserve">Mark invalid response</w:t>
@@ -11072,6 +11521,7 @@
             <w:pPr>
               <w:pStyle w:val="Compact"/>
               <w:jc w:val="right"/>
+              <w:keepNext/>
             </w:pPr>
             <w:r>
               <w:t xml:space="preserve">27,704</w:t>
@@ -11084,6 +11534,7 @@
             <w:pPr>
               <w:pStyle w:val="Compact"/>
               <w:jc w:val="left"/>
+              <w:keepNext/>
             </w:pPr>
             <w:r>
               <w:t xml:space="preserve">admin records a non-zero evidence hash</w:t>
@@ -11092,12 +11543,16 @@
         </w:tc>
       </w:tr>
       <w:tr>
+        <w:trPr>
+          <w:cantSplit/>
+        </w:trPr>
         <w:tc>
           <w:tcPr/>
           <w:p>
             <w:pPr>
               <w:pStyle w:val="Compact"/>
               <w:jc w:val="left"/>
+              <w:keepNext/>
             </w:pPr>
             <w:r>
               <w:t xml:space="preserve">Record equivocation</w:t>
@@ -11110,6 +11565,7 @@
             <w:pPr>
               <w:pStyle w:val="Compact"/>
               <w:jc w:val="right"/>
+              <w:keepNext/>
             </w:pPr>
             <w:r>
               <w:t xml:space="preserve">51,710</w:t>
@@ -11122,6 +11578,7 @@
             <w:pPr>
               <w:pStyle w:val="Compact"/>
               <w:jc w:val="left"/>
+              <w:keepNext/>
             </w:pPr>
             <w:r>
               <w:t xml:space="preserve">second conflicting commitment from one custodian</w:t>
@@ -11130,12 +11587,16 @@
         </w:tc>
       </w:tr>
       <w:tr>
+        <w:trPr>
+          <w:cantSplit/>
+        </w:trPr>
         <w:tc>
           <w:tcPr/>
           <w:p>
             <w:pPr>
               <w:pStyle w:val="Compact"/>
               <w:jc w:val="left"/>
+              <w:keepNext/>
             </w:pPr>
             <w:r>
               <w:t xml:space="preserve">Finalize audit</w:t>
@@ -11148,6 +11609,7 @@
             <w:pPr>
               <w:pStyle w:val="Compact"/>
               <w:jc w:val="right"/>
+              <w:keepNext/>
             </w:pPr>
             <w:r>
               <w:t xml:space="preserve">29,142</w:t>
@@ -11160,6 +11622,7 @@
             <w:pPr>
               <w:pStyle w:val="Compact"/>
               <w:jc w:val="left"/>
+              <w:keepNext/>
             </w:pPr>
             <w:r>
               <w:t xml:space="preserve">two responses for a three-member sample after deadline</w:t>
@@ -11168,12 +11631,16 @@
         </w:tc>
       </w:tr>
       <w:tr>
+        <w:trPr>
+          <w:cantSplit/>
+        </w:trPr>
         <w:tc>
           <w:tcPr/>
           <w:p>
             <w:pPr>
               <w:pStyle w:val="Compact"/>
               <w:jc w:val="left"/>
+              <w:keepNext/>
             </w:pPr>
             <w:r>
               <w:t xml:space="preserve">Open dispute</w:t>
@@ -11186,6 +11653,7 @@
             <w:pPr>
               <w:pStyle w:val="Compact"/>
               <w:jc w:val="right"/>
+              <w:keepNext/>
             </w:pPr>
             <w:r>
               <w:t xml:space="preserve">144,149</w:t>
@@ -11198,6 +11666,7 @@
             <w:pPr>
               <w:pStyle w:val="Compact"/>
               <w:jc w:val="left"/>
+              <w:keepNext/>
             </w:pPr>
             <w:r>
               <w:t xml:space="preserve">n=5, t=3; all members eligible</w:t>
@@ -11206,6 +11675,9 @@
         </w:tc>
       </w:tr>
       <w:tr>
+        <w:trPr>
+          <w:cantSplit/>
+        </w:trPr>
         <w:tc>
           <w:tcPr/>
           <w:p>
@@ -11244,10 +11716,10 @@
         </w:tc>
       </w:tr>
     </w:tbl>
-    <w:bookmarkEnd w:id="59"/>
-    <w:bookmarkEnd w:id="60"/>
-    <w:bookmarkEnd w:id="61"/>
-    <w:bookmarkStart w:id="62" w:name="discussion"/>
+    <w:bookmarkEnd w:id="56"/>
+    <w:bookmarkEnd w:id="57"/>
+    <w:bookmarkEnd w:id="58"/>
+    <w:bookmarkStart w:id="59" w:name="discussion"/>
     <w:p>
       <w:pPr>
         <w:pStyle w:val="Heading1"/>
@@ -11375,8 +11847,8 @@
         <w:t xml:space="preserve">proofs at the combiner; in our prototype that term exceeded the injected network delay by more than an order of magnitude. Non-response proves absence from the transcript, not malice, so penalties should distinguish warning, temporary inactivity, replacement and slashing.</w:t>
       </w:r>
     </w:p>
-    <w:bookmarkEnd w:id="62"/>
-    <w:bookmarkStart w:id="63" w:name="limitations"/>
+    <w:bookmarkEnd w:id="59"/>
+    <w:bookmarkStart w:id="60" w:name="limitations"/>
     <w:p>
       <w:pPr>
         <w:pStyle w:val="Heading1"/>
@@ -11549,8 +12021,8 @@
         <w:t xml:space="preserve">The hypothesis should be rejected or reframed if a predecessor already makes the same dispute-specific property and readiness probe explicit, or if independent reproduction fails to recover the property separations reported here.</w:t>
       </w:r>
     </w:p>
-    <w:bookmarkEnd w:id="63"/>
-    <w:bookmarkStart w:id="64" w:name="conclusion"/>
+    <w:bookmarkEnd w:id="60"/>
+    <w:bookmarkStart w:id="61" w:name="conclusion"/>
     <w:p>
       <w:pPr>
         <w:pStyle w:val="Heading1"/>
@@ -11576,8 +12048,8 @@
         <w:t xml:space="preserve">KEYSTONE isolates a failure mode that ciphertext data availability does not address: the threshold service needed for an authorized encrypted-rollup dispute may be unavailable, slow or uncooperative at the deadline. It decomposes the relevant properties, instantiates a non-production canary audit from established components, and gives an exact static detection bound. The evaluation shows that the audit detects catastrophic states, that its acceptance rule needs tuning to avoid benign alarms, that it cannot detect selective withholding, and that in an emulated 32-custodian committee every reconstructable dispute completes within five seconds, a budget set by proof verification rather than by the network. KEYSTONE measures present sampled serviceability under declared assumptions; it does not prove future availability or introduce a new threshold-decryption primitive.</w:t>
       </w:r>
     </w:p>
-    <w:bookmarkEnd w:id="64"/>
-    <w:bookmarkStart w:id="106" w:name="declarations"/>
+    <w:bookmarkEnd w:id="61"/>
+    <w:bookmarkStart w:id="103" w:name="declarations"/>
     <w:p>
       <w:pPr>
         <w:pStyle w:val="Heading1"/>
@@ -11624,7 +12096,7 @@
       <w:r>
         <w:t xml:space="preserve"> </w:t>
       </w:r>
-      <w:hyperlink r:id="rId65">
+      <w:hyperlink r:id="rId62">
         <w:r>
           <w:rPr>
             <w:rStyle w:val="Hyperlink"/>
@@ -11675,8 +12147,8 @@
         <w:t xml:space="preserve">AI assistance was used for drafting, code integration, experiment scripting and figure generation. The author is responsible for the scientific content, verification and submission.</w:t>
       </w:r>
     </w:p>
-    <w:bookmarkStart w:id="105" w:name="refs"/>
-    <w:bookmarkStart w:id="67" w:name="ref-eip7594"/>
+    <w:bookmarkStart w:id="102" w:name="refs"/>
+    <w:bookmarkStart w:id="64" w:name="ref-eip7594"/>
     <w:p>
       <w:pPr>
         <w:pStyle w:val="Bibliography"/>
@@ -11705,7 +12177,7 @@
       <w:r>
         <w:t xml:space="preserve"> </w:t>
       </w:r>
-      <w:hyperlink r:id="rId66">
+      <w:hyperlink r:id="rId63">
         <w:r>
           <w:rPr>
             <w:rStyle w:val="Hyperlink"/>
@@ -11714,8 +12186,8 @@
         </w:r>
       </w:hyperlink>
     </w:p>
-    <w:bookmarkEnd w:id="67"/>
-    <w:bookmarkStart w:id="69" w:name="ref-boneh2006threshold"/>
+    <w:bookmarkEnd w:id="64"/>
+    <w:bookmarkStart w:id="66" w:name="ref-boneh2006threshold"/>
     <w:p>
       <w:pPr>
         <w:pStyle w:val="Bibliography"/>
@@ -11776,7 +12248,7 @@
       <w:r>
         <w:t xml:space="preserve"> </w:t>
       </w:r>
-      <w:hyperlink r:id="rId68">
+      <w:hyperlink r:id="rId65">
         <w:r>
           <w:rPr>
             <w:rStyle w:val="Hyperlink"/>
@@ -11785,8 +12257,8 @@
         </w:r>
       </w:hyperlink>
     </w:p>
-    <w:bookmarkEnd w:id="69"/>
-    <w:bookmarkStart w:id="71" w:name="ref-feldman1987vss"/>
+    <w:bookmarkEnd w:id="66"/>
+    <w:bookmarkStart w:id="68" w:name="ref-feldman1987vss"/>
     <w:p>
       <w:pPr>
         <w:pStyle w:val="Bibliography"/>
@@ -11819,7 +12291,7 @@
       <w:r>
         <w:t xml:space="preserve"> </w:t>
       </w:r>
-      <w:hyperlink r:id="rId70">
+      <w:hyperlink r:id="rId67">
         <w:r>
           <w:rPr>
             <w:rStyle w:val="Hyperlink"/>
@@ -11828,8 +12300,8 @@
         </w:r>
       </w:hyperlink>
     </w:p>
-    <w:bookmarkEnd w:id="71"/>
-    <w:bookmarkStart w:id="73" w:name="ref-schoenmakers1999pvss"/>
+    <w:bookmarkEnd w:id="68"/>
+    <w:bookmarkStart w:id="70" w:name="ref-schoenmakers1999pvss"/>
     <w:p>
       <w:pPr>
         <w:pStyle w:val="Bibliography"/>
@@ -11862,7 +12334,7 @@
       <w:r>
         <w:t xml:space="preserve"> </w:t>
       </w:r>
-      <w:hyperlink r:id="rId72">
+      <w:hyperlink r:id="rId69">
         <w:r>
           <w:rPr>
             <w:rStyle w:val="Hyperlink"/>
@@ -11871,8 +12343,8 @@
         </w:r>
       </w:hyperlink>
     </w:p>
-    <w:bookmarkEnd w:id="73"/>
-    <w:bookmarkStart w:id="74" w:name="ref-herzberg1995proactive"/>
+    <w:bookmarkEnd w:id="70"/>
+    <w:bookmarkStart w:id="71" w:name="ref-herzberg1995proactive"/>
     <w:p>
       <w:pPr>
         <w:pStyle w:val="Bibliography"/>
@@ -11903,8 +12375,8 @@
         <w:t xml:space="preserve">. 1995, 339–352</w:t>
       </w:r>
     </w:p>
-    <w:bookmarkEnd w:id="74"/>
-    <w:bookmarkStart w:id="76" w:name="ref-yurek2023dpss"/>
+    <w:bookmarkEnd w:id="71"/>
+    <w:bookmarkStart w:id="73" w:name="ref-yurek2023dpss"/>
     <w:p>
       <w:pPr>
         <w:pStyle w:val="Bibliography"/>
@@ -11949,7 +12421,7 @@
       <w:r>
         <w:t xml:space="preserve"> </w:t>
       </w:r>
-      <w:hyperlink r:id="rId75">
+      <w:hyperlink r:id="rId72">
         <w:r>
           <w:rPr>
             <w:rStyle w:val="Hyperlink"/>
@@ -11958,8 +12430,8 @@
         </w:r>
       </w:hyperlink>
     </w:p>
-    <w:bookmarkEnd w:id="76"/>
-    <w:bookmarkStart w:id="78" w:name="ref-stengele2021ethtid"/>
+    <w:bookmarkEnd w:id="73"/>
+    <w:bookmarkStart w:id="75" w:name="ref-stengele2021ethtid"/>
     <w:p>
       <w:pPr>
         <w:pStyle w:val="Bibliography"/>
@@ -12024,7 +12496,7 @@
       <w:r>
         <w:t xml:space="preserve"> </w:t>
       </w:r>
-      <w:hyperlink r:id="rId77">
+      <w:hyperlink r:id="rId74">
         <w:r>
           <w:rPr>
             <w:rStyle w:val="Hyperlink"/>
@@ -12033,8 +12505,8 @@
         </w:r>
       </w:hyperlink>
     </w:p>
-    <w:bookmarkEnd w:id="78"/>
-    <w:bookmarkStart w:id="80" w:name="ref-bebel2022ferveo"/>
+    <w:bookmarkEnd w:id="75"/>
+    <w:bookmarkStart w:id="77" w:name="ref-bebel2022ferveo"/>
     <w:p>
       <w:pPr>
         <w:pStyle w:val="Bibliography"/>
@@ -12078,7 +12550,7 @@
       <w:r>
         <w:t xml:space="preserve"> </w:t>
       </w:r>
-      <w:hyperlink r:id="rId79">
+      <w:hyperlink r:id="rId76">
         <w:r>
           <w:rPr>
             <w:rStyle w:val="Hyperlink"/>
@@ -12087,8 +12559,8 @@
         </w:r>
       </w:hyperlink>
     </w:p>
-    <w:bookmarkEnd w:id="80"/>
-    <w:bookmarkStart w:id="82" w:name="ref-bormet2025epochless"/>
+    <w:bookmarkEnd w:id="77"/>
+    <w:bookmarkStart w:id="79" w:name="ref-bormet2025epochless"/>
     <w:p>
       <w:pPr>
         <w:pStyle w:val="Bibliography"/>
@@ -12142,7 +12614,7 @@
       <w:r>
         <w:t xml:space="preserve"> </w:t>
       </w:r>
-      <w:hyperlink r:id="rId81">
+      <w:hyperlink r:id="rId78">
         <w:r>
           <w:rPr>
             <w:rStyle w:val="Hyperlink"/>
@@ -12151,8 +12623,8 @@
         </w:r>
       </w:hyperlink>
     </w:p>
-    <w:bookmarkEnd w:id="82"/>
-    <w:bookmarkStart w:id="84" w:name="ref-cerulli2023vetkeys"/>
+    <w:bookmarkEnd w:id="79"/>
+    <w:bookmarkStart w:id="81" w:name="ref-cerulli2023vetkeys"/>
     <w:p>
       <w:pPr>
         <w:pStyle w:val="Bibliography"/>
@@ -12193,7 +12665,7 @@
       <w:r>
         <w:t xml:space="preserve"> </w:t>
       </w:r>
-      <w:hyperlink r:id="rId83">
+      <w:hyperlink r:id="rId80">
         <w:r>
           <w:rPr>
             <w:rStyle w:val="Hyperlink"/>
@@ -12202,8 +12674,8 @@
         </w:r>
       </w:hyperlink>
     </w:p>
-    <w:bookmarkEnd w:id="84"/>
-    <w:bookmarkStart w:id="86" w:name="ref-agarwal2025ttles"/>
+    <w:bookmarkEnd w:id="81"/>
+    <w:bookmarkStart w:id="83" w:name="ref-agarwal2025ttles"/>
     <w:p>
       <w:pPr>
         <w:pStyle w:val="Bibliography"/>
@@ -12235,7 +12707,7 @@
       <w:r>
         <w:t xml:space="preserve"> </w:t>
       </w:r>
-      <w:hyperlink r:id="rId85">
+      <w:hyperlink r:id="rId82">
         <w:r>
           <w:rPr>
             <w:rStyle w:val="Hyperlink"/>
@@ -12244,8 +12716,8 @@
         </w:r>
       </w:hyperlink>
     </w:p>
-    <w:bookmarkEnd w:id="86"/>
-    <w:bookmarkStart w:id="88" w:name="ref-boneh2025context"/>
+    <w:bookmarkEnd w:id="83"/>
+    <w:bookmarkStart w:id="85" w:name="ref-boneh2025context"/>
     <w:p>
       <w:pPr>
         <w:pStyle w:val="Bibliography"/>
@@ -12277,7 +12749,7 @@
       <w:r>
         <w:t xml:space="preserve"> </w:t>
       </w:r>
-      <w:hyperlink r:id="rId87">
+      <w:hyperlink r:id="rId84">
         <w:r>
           <w:rPr>
             <w:rStyle w:val="Hyperlink"/>
@@ -12286,8 +12758,8 @@
         </w:r>
       </w:hyperlink>
     </w:p>
-    <w:bookmarkEnd w:id="88"/>
-    <w:bookmarkStart w:id="90" w:name="ref-eigenai2026"/>
+    <w:bookmarkEnd w:id="85"/>
+    <w:bookmarkStart w:id="87" w:name="ref-eigenai2026"/>
     <w:p>
       <w:pPr>
         <w:pStyle w:val="Bibliography"/>
@@ -12329,7 +12801,7 @@
       <w:r>
         <w:t xml:space="preserve"> </w:t>
       </w:r>
-      <w:hyperlink r:id="rId89">
+      <w:hyperlink r:id="rId86">
         <w:r>
           <w:rPr>
             <w:rStyle w:val="Hyperlink"/>
@@ -12338,8 +12810,8 @@
         </w:r>
       </w:hyperlink>
     </w:p>
-    <w:bookmarkEnd w:id="90"/>
-    <w:bookmarkStart w:id="92" w:name="ref-boneh2023accountability"/>
+    <w:bookmarkEnd w:id="87"/>
+    <w:bookmarkStart w:id="89" w:name="ref-boneh2023accountability"/>
     <w:p>
       <w:pPr>
         <w:pStyle w:val="Bibliography"/>
@@ -12371,7 +12843,7 @@
       <w:r>
         <w:t xml:space="preserve"> </w:t>
       </w:r>
-      <w:hyperlink r:id="rId91">
+      <w:hyperlink r:id="rId88">
         <w:r>
           <w:rPr>
             <w:rStyle w:val="Hyperlink"/>
@@ -12380,8 +12852,8 @@
         </w:r>
       </w:hyperlink>
     </w:p>
-    <w:bookmarkEnd w:id="92"/>
-    <w:bookmarkStart w:id="94" w:name="ref-lewis2025accountable"/>
+    <w:bookmarkEnd w:id="89"/>
+    <w:bookmarkStart w:id="91" w:name="ref-lewis2025accountable"/>
     <w:p>
       <w:pPr>
         <w:pStyle w:val="Bibliography"/>
@@ -12414,7 +12886,7 @@
       <w:r>
         <w:t xml:space="preserve"> </w:t>
       </w:r>
-      <w:hyperlink r:id="rId93">
+      <w:hyperlink r:id="rId90">
         <w:r>
           <w:rPr>
             <w:rStyle w:val="Hyperlink"/>
@@ -12423,8 +12895,8 @@
         </w:r>
       </w:hyperlink>
     </w:p>
-    <w:bookmarkEnd w:id="94"/>
-    <w:bookmarkStart w:id="96" w:name="ref-chaum1992dleq"/>
+    <w:bookmarkEnd w:id="91"/>
+    <w:bookmarkStart w:id="93" w:name="ref-chaum1992dleq"/>
     <w:p>
       <w:pPr>
         <w:pStyle w:val="Bibliography"/>
@@ -12485,7 +12957,7 @@
       <w:r>
         <w:t xml:space="preserve"> </w:t>
       </w:r>
-      <w:hyperlink r:id="rId95">
+      <w:hyperlink r:id="rId92">
         <w:r>
           <w:rPr>
             <w:rStyle w:val="Hyperlink"/>
@@ -12494,8 +12966,8 @@
         </w:r>
       </w:hyperlink>
     </w:p>
-    <w:bookmarkEnd w:id="96"/>
-    <w:bookmarkStart w:id="98" w:name="ref-rfc9380"/>
+    <w:bookmarkEnd w:id="93"/>
+    <w:bookmarkStart w:id="95" w:name="ref-rfc9380"/>
     <w:p>
       <w:pPr>
         <w:pStyle w:val="Bibliography"/>
@@ -12515,7 +12987,7 @@
       <w:r>
         <w:t xml:space="preserve"> </w:t>
       </w:r>
-      <w:hyperlink r:id="rId97">
+      <w:hyperlink r:id="rId94">
         <w:r>
           <w:rPr>
             <w:rStyle w:val="Hyperlink"/>
@@ -12524,8 +12996,8 @@
         </w:r>
       </w:hyperlink>
     </w:p>
-    <w:bookmarkEnd w:id="98"/>
-    <w:bookmarkStart w:id="100" w:name="ref-hoeffding1963"/>
+    <w:bookmarkEnd w:id="95"/>
+    <w:bookmarkStart w:id="97" w:name="ref-hoeffding1963"/>
     <w:p>
       <w:pPr>
         <w:pStyle w:val="Bibliography"/>
@@ -12558,7 +13030,7 @@
       <w:r>
         <w:t xml:space="preserve"> </w:t>
       </w:r>
-      <w:hyperlink r:id="rId99">
+      <w:hyperlink r:id="rId96">
         <w:r>
           <w:rPr>
             <w:rStyle w:val="Hyperlink"/>
@@ -12567,8 +13039,8 @@
         </w:r>
       </w:hyperlink>
     </w:p>
-    <w:bookmarkEnd w:id="100"/>
-    <w:bookmarkStart w:id="102" w:name="ref-wilson1927"/>
+    <w:bookmarkEnd w:id="97"/>
+    <w:bookmarkStart w:id="99" w:name="ref-wilson1927"/>
     <w:p>
       <w:pPr>
         <w:pStyle w:val="Bibliography"/>
@@ -12601,7 +13073,7 @@
       <w:r>
         <w:t xml:space="preserve"> </w:t>
       </w:r>
-      <w:hyperlink r:id="rId101">
+      <w:hyperlink r:id="rId98">
         <w:r>
           <w:rPr>
             <w:rStyle w:val="Hyperlink"/>
@@ -12610,8 +13082,8 @@
         </w:r>
       </w:hyperlink>
     </w:p>
-    <w:bookmarkEnd w:id="102"/>
-    <w:bookmarkStart w:id="104" w:name="ref-rfc7919"/>
+    <w:bookmarkEnd w:id="99"/>
+    <w:bookmarkStart w:id="101" w:name="ref-rfc7919"/>
     <w:p>
       <w:pPr>
         <w:pStyle w:val="Bibliography"/>
@@ -12649,7 +13121,7 @@
       <w:r>
         <w:t xml:space="preserve"> </w:t>
       </w:r>
-      <w:hyperlink r:id="rId103">
+      <w:hyperlink r:id="rId100">
         <w:r>
           <w:rPr>
             <w:rStyle w:val="Hyperlink"/>
@@ -12658,9 +13130,9 @@
         </w:r>
       </w:hyperlink>
     </w:p>
-    <w:bookmarkEnd w:id="104"/>
-    <w:bookmarkEnd w:id="105"/>
-    <w:bookmarkEnd w:id="106"/>
+    <w:bookmarkEnd w:id="101"/>
+    <w:bookmarkEnd w:id="102"/>
+    <w:bookmarkEnd w:id="103"/>
     <w:sectPr>
       <w:footnotePr>
         <w:numRestart w:val="eachSect"/>

</xml_diff>

<commit_message>
fix: place R1 figures and tables next to their text
Floats used top-only placement and piled up after the References. Use
!htbp placement, relaxed float limits and section float barriers, move the
deadline subsection before robustness so Figure 3 sits with its text, and
close the robustness subsection with Figure 6. Numbering is unchanged.
Rebuild the DOCX and its Word-rendered PDF to match.
</commit_message>
<xml_diff>
--- a/paper/r1/KEYSTONE_R1.docx
+++ b/paper/r1/KEYSTONE_R1.docx
@@ -5769,7 +5769,7 @@
         <w:t xml:space="preserve">Evaluation</w:t>
       </w:r>
     </w:p>
-    <w:bookmarkStart w:id="36" w:name="method-and-evidence-labels"/>
+    <w:bookmarkStart w:id="32" w:name="method-and-evidence-labels"/>
     <w:p>
       <w:pPr>
         <w:pStyle w:val="Heading2"/>
@@ -7177,7 +7177,784 @@
       </w:tr>
     </w:tbl>
     <w:bookmarkEnd w:id="31"/>
-    <w:bookmarkStart w:id="35" w:name="fig:deadline"/>
+    <w:bookmarkEnd w:id="32"/>
+    <w:bookmarkStart w:id="34" w:name="comparison-with-readiness-baselines"/>
+    <w:p>
+      <w:pPr>
+        <w:pStyle w:val="Heading2"/>
+      </w:pPr>
+      <w:r>
+        <w:rPr>
+          <w:rStyle w:val="SectionNumber"/>
+        </w:rPr>
+        <w:t xml:space="preserve">6.2</w:t>
+      </w:r>
+      <w:r>
+        <w:tab/>
+      </w:r>
+      <w:r>
+        <w:t xml:space="preserve">Comparison with readiness baselines</w:t>
+      </w:r>
+    </w:p>
+    <w:p>
+      <w:pPr>
+        <w:pStyle w:val="FirstParagraph"/>
+      </w:pPr>
+      <w:r>
+        <w:t xml:space="preserve">Table 4 compares the canary audit with the obvious alternatives. A heartbeat confirms only that a process responds; a custodian that has lost its share still answers, so a static catastrophic state of</w:t>
+      </w:r>
+      <w:r>
+        <w:t xml:space="preserve"> </w:t>
+      </w:r>
+      <m:oMath>
+        <m:r>
+          <m:t>t</m:t>
+        </m:r>
+        <m:r>
+          <m:rPr>
+            <m:sty m:val="p"/>
+          </m:rPr>
+          <m:t>−</m:t>
+        </m:r>
+        <m:r>
+          <m:t>1</m:t>
+        </m:r>
+      </m:oMath>
+      <w:r>
+        <w:t xml:space="preserve"> </w:t>
+      </w:r>
+      <w:r>
+        <w:t xml:space="preserve">share-holders is invisible to it. Share registration is checked once and says nothing about later share loss. Decrypting a real record would test the right capability but discloses a production record. A full-committee canary probe detects every static catastrophic state at four times KEYSTONE’s per-round cost at</w:t>
+      </w:r>
+      <w:r>
+        <w:t xml:space="preserve"> </w:t>
+      </w:r>
+      <m:oMath>
+        <m:r>
+          <m:t>n</m:t>
+        </m:r>
+        <m:r>
+          <m:rPr>
+            <m:sty m:val="p"/>
+          </m:rPr>
+          <m:t>=</m:t>
+        </m:r>
+        <m:r>
+          <m:t>32</m:t>
+        </m:r>
+      </m:oMath>
+      <w:r>
+        <w:t xml:space="preserve">; KEYSTONE trades that cost for the detection probability of Eq. (2).</w:t>
+      </w:r>
+    </w:p>
+    <w:bookmarkStart w:id="33" w:name="tab:baselines"/>
+    <w:p>
+      <w:pPr>
+        <w:pStyle w:val="TableCaption"/>
+        <w:keepNext/>
+      </w:pPr>
+      <w:r>
+        <w:t xml:space="preserve">Table 4. Readiness checks compared. Costs are measured medians for ffdhe2048 in the prototype (Table 7); bytes are canonical request plus response transcripts.</w:t>
+      </w:r>
+    </w:p>
+    <w:tbl>
+      <w:tblPr>
+        <w:tblStyle w:val="Table"/>
+        <w:tblW w:type="auto" w:w="0"/>
+        <w:tblLook w:firstRow="1" w:lastRow="0" w:firstColumn="0" w:lastColumn="0" w:noHBand="0" w:noVBand="0" w:val="0020"/>
+        <w:tblCaption w:val="Table 4. Readiness checks compared. Costs are measured medians for ffdhe2048 in the prototype (Table 7); bytes are canonical request plus response transcripts."/>
+      </w:tblPr>
+      <w:tblGrid>
+        <w:gridCol w:w="1584"/>
+        <w:gridCol w:w="1584"/>
+        <w:gridCol w:w="1584"/>
+        <w:gridCol w:w="1584"/>
+        <w:gridCol w:w="1584"/>
+      </w:tblGrid>
+      <w:tr>
+        <w:trPr>
+          <w:tblHeader w:val="on"/>
+          <w:cantSplit/>
+        </w:trPr>
+        <w:tc>
+          <w:tcPr/>
+          <w:p>
+            <w:pPr>
+              <w:pStyle w:val="Compact"/>
+              <w:jc w:val="left"/>
+              <w:keepNext/>
+            </w:pPr>
+            <w:r>
+              <w:t xml:space="preserve">Readiness check</w:t>
+            </w:r>
+          </w:p>
+        </w:tc>
+        <w:tc>
+          <w:tcPr/>
+          <w:p>
+            <w:pPr>
+              <w:pStyle w:val="Compact"/>
+              <w:jc w:val="left"/>
+              <w:keepNext/>
+            </w:pPr>
+            <w:r>
+              <w:t xml:space="preserve">Exercises the secret share?</w:t>
+            </w:r>
+          </w:p>
+        </w:tc>
+        <w:tc>
+          <w:tcPr/>
+          <w:p>
+            <w:pPr>
+              <w:pStyle w:val="Compact"/>
+              <w:jc w:val="left"/>
+              <w:keepNext/>
+            </w:pPr>
+            <w:r>
+              <w:t xml:space="preserve">Touches production ciphertext?</w:t>
+            </w:r>
+          </w:p>
+        </w:tc>
+        <w:tc>
+          <w:tcPr/>
+          <w:p>
+            <w:pPr>
+              <w:pStyle w:val="Compact"/>
+              <w:jc w:val="left"/>
+              <w:keepNext/>
+            </w:pPr>
+            <w:r>
+              <w:t xml:space="preserve">Detects a static state with</w:t>
+            </w:r>
+            <w:r>
+              <w:t xml:space="preserve"> </w:t>
+            </w:r>
+            <m:oMath>
+              <m:r>
+                <m:t>r</m:t>
+              </m:r>
+              <m:r>
+                <m:rPr>
+                  <m:sty m:val="p"/>
+                </m:rPr>
+                <m:t>=</m:t>
+              </m:r>
+              <m:r>
+                <m:t>t</m:t>
+              </m:r>
+              <m:r>
+                <m:rPr>
+                  <m:sty m:val="p"/>
+                </m:rPr>
+                <m:t>−</m:t>
+              </m:r>
+              <m:r>
+                <m:t>1</m:t>
+              </m:r>
+            </m:oMath>
+            <w:r>
+              <w:t xml:space="preserve"> </w:t>
+            </w:r>
+            <w:r>
+              <w:t xml:space="preserve">ready shares</w:t>
+            </w:r>
+          </w:p>
+        </w:tc>
+        <w:tc>
+          <w:tcPr/>
+          <w:p>
+            <w:pPr>
+              <w:pStyle w:val="Compact"/>
+              <w:jc w:val="left"/>
+              <w:keepNext/>
+            </w:pPr>
+            <w:r>
+              <w:t xml:space="preserve">Cost per check (</w:t>
+            </w:r>
+            <m:oMath>
+              <m:r>
+                <m:t>n</m:t>
+              </m:r>
+              <m:r>
+                <m:rPr>
+                  <m:sty m:val="p"/>
+                </m:rPr>
+                <m:t>=</m:t>
+              </m:r>
+              <m:r>
+                <m:t>32</m:t>
+              </m:r>
+            </m:oMath>
+            <w:r>
+              <w:t xml:space="preserve">, ffdhe2048, measured)</w:t>
+            </w:r>
+          </w:p>
+        </w:tc>
+      </w:tr>
+      <w:tr>
+        <w:trPr>
+          <w:cantSplit/>
+        </w:trPr>
+        <w:tc>
+          <w:tcPr/>
+          <w:p>
+            <w:pPr>
+              <w:pStyle w:val="Compact"/>
+              <w:jc w:val="left"/>
+              <w:keepNext/>
+            </w:pPr>
+            <w:r>
+              <w:t xml:space="preserve">Liveness heartbeat</w:t>
+            </w:r>
+          </w:p>
+        </w:tc>
+        <w:tc>
+          <w:tcPr/>
+          <w:p>
+            <w:pPr>
+              <w:pStyle w:val="Compact"/>
+              <w:jc w:val="left"/>
+              <w:keepNext/>
+            </w:pPr>
+            <w:r>
+              <w:t xml:space="preserve">No</w:t>
+            </w:r>
+          </w:p>
+        </w:tc>
+        <w:tc>
+          <w:tcPr/>
+          <w:p>
+            <w:pPr>
+              <w:pStyle w:val="Compact"/>
+              <w:jc w:val="left"/>
+              <w:keepNext/>
+            </w:pPr>
+            <w:r>
+              <w:t xml:space="preserve">No</w:t>
+            </w:r>
+          </w:p>
+        </w:tc>
+        <w:tc>
+          <w:tcPr/>
+          <w:p>
+            <w:pPr>
+              <w:pStyle w:val="Compact"/>
+              <w:jc w:val="left"/>
+              <w:keepNext/>
+            </w:pPr>
+            <w:r>
+              <w:t xml:space="preserve">No: a node that lost its share still answers</w:t>
+            </w:r>
+          </w:p>
+        </w:tc>
+        <w:tc>
+          <w:tcPr/>
+          <w:p>
+            <w:pPr>
+              <w:pStyle w:val="Compact"/>
+              <w:jc w:val="left"/>
+              <w:keepNext/>
+            </w:pPr>
+            <w:r>
+              <w:t xml:space="preserve">1 message per node; no group operations</w:t>
+            </w:r>
+          </w:p>
+        </w:tc>
+      </w:tr>
+      <w:tr>
+        <w:trPr>
+          <w:cantSplit/>
+        </w:trPr>
+        <w:tc>
+          <w:tcPr/>
+          <w:p>
+            <w:pPr>
+              <w:pStyle w:val="Compact"/>
+              <w:jc w:val="left"/>
+              <w:keepNext/>
+            </w:pPr>
+            <w:r>
+              <w:t xml:space="preserve">Share registration (Feldman/PVSS check)</w:t>
+            </w:r>
+          </w:p>
+        </w:tc>
+        <w:tc>
+          <w:tcPr/>
+          <w:p>
+            <w:pPr>
+              <w:pStyle w:val="Compact"/>
+              <w:jc w:val="left"/>
+              <w:keepNext/>
+            </w:pPr>
+            <w:r>
+              <w:t xml:space="preserve">Once, at setup</w:t>
+            </w:r>
+          </w:p>
+        </w:tc>
+        <w:tc>
+          <w:tcPr/>
+          <w:p>
+            <w:pPr>
+              <w:pStyle w:val="Compact"/>
+              <w:jc w:val="left"/>
+              <w:keepNext/>
+            </w:pPr>
+            <w:r>
+              <w:t xml:space="preserve">No</w:t>
+            </w:r>
+          </w:p>
+        </w:tc>
+        <w:tc>
+          <w:tcPr/>
+          <w:p>
+            <w:pPr>
+              <w:pStyle w:val="Compact"/>
+              <w:jc w:val="left"/>
+              <w:keepNext/>
+            </w:pPr>
+            <w:r>
+              <w:t xml:space="preserve">No: says nothing about later share loss</w:t>
+            </w:r>
+          </w:p>
+        </w:tc>
+        <w:tc>
+          <w:tcPr/>
+          <w:p>
+            <w:pPr>
+              <w:pStyle w:val="Compact"/>
+              <w:jc w:val="left"/>
+              <w:keepNext/>
+            </w:pPr>
+            <w:r>
+              <w:t xml:space="preserve">One-time</w:t>
+            </w:r>
+            <w:r>
+              <w:t xml:space="preserve"> </w:t>
+            </w:r>
+            <m:oMath>
+              <m:r>
+                <m:t>O</m:t>
+              </m:r>
+              <m:r>
+                <m:rPr>
+                  <m:sty m:val="p"/>
+                </m:rPr>
+                <m:t>(</m:t>
+              </m:r>
+              <m:r>
+                <m:t>n</m:t>
+              </m:r>
+              <m:r>
+                <m:t>t</m:t>
+              </m:r>
+              <m:r>
+                <m:rPr>
+                  <m:sty m:val="p"/>
+                </m:rPr>
+                <m:t>)</m:t>
+              </m:r>
+            </m:oMath>
+            <w:r>
+              <w:t xml:space="preserve"> </w:t>
+            </w:r>
+            <w:r>
+              <w:t xml:space="preserve">exponentiations at epoch setup</w:t>
+            </w:r>
+          </w:p>
+        </w:tc>
+      </w:tr>
+      <w:tr>
+        <w:trPr>
+          <w:cantSplit/>
+        </w:trPr>
+        <w:tc>
+          <w:tcPr/>
+          <w:p>
+            <w:pPr>
+              <w:pStyle w:val="Compact"/>
+              <w:jc w:val="left"/>
+              <w:keepNext/>
+            </w:pPr>
+            <w:r>
+              <w:t xml:space="preserve">Full-committee canary probe</w:t>
+            </w:r>
+          </w:p>
+        </w:tc>
+        <w:tc>
+          <w:tcPr/>
+          <w:p>
+            <w:pPr>
+              <w:pStyle w:val="Compact"/>
+              <w:jc w:val="left"/>
+              <w:keepNext/>
+            </w:pPr>
+            <w:r>
+              <w:t xml:space="preserve">Yes</w:t>
+            </w:r>
+          </w:p>
+        </w:tc>
+        <w:tc>
+          <w:tcPr/>
+          <w:p>
+            <w:pPr>
+              <w:pStyle w:val="Compact"/>
+              <w:jc w:val="left"/>
+              <w:keepNext/>
+            </w:pPr>
+            <w:r>
+              <w:t xml:space="preserve">No (canary)</w:t>
+            </w:r>
+          </w:p>
+        </w:tc>
+        <w:tc>
+          <w:tcPr/>
+          <w:p>
+            <w:pPr>
+              <w:pStyle w:val="Compact"/>
+              <w:jc w:val="left"/>
+              <w:keepNext/>
+            </w:pPr>
+            <w:r>
+              <w:t xml:space="preserve">Yes, with probability 1</w:t>
+            </w:r>
+          </w:p>
+        </w:tc>
+        <w:tc>
+          <w:tcPr/>
+          <w:p>
+            <w:pPr>
+              <w:pStyle w:val="Compact"/>
+              <w:jc w:val="left"/>
+              <w:keepNext/>
+            </w:pPr>
+            <w:r>
+              <w:t xml:space="preserve">32 proofs + 32 verifications; 8501 ms CPU; 36,991 B</w:t>
+            </w:r>
+          </w:p>
+        </w:tc>
+      </w:tr>
+      <w:tr>
+        <w:trPr>
+          <w:cantSplit/>
+        </w:trPr>
+        <w:tc>
+          <w:tcPr/>
+          <w:p>
+            <w:pPr>
+              <w:pStyle w:val="Compact"/>
+              <w:jc w:val="left"/>
+              <w:keepNext/>
+            </w:pPr>
+            <w:r>
+              <w:t xml:space="preserve">KEYSTONE sampled canary (</w:t>
+            </w:r>
+            <m:oMath>
+              <m:r>
+                <m:t>s</m:t>
+              </m:r>
+              <m:r>
+                <m:rPr>
+                  <m:sty m:val="p"/>
+                </m:rPr>
+                <m:t>=</m:t>
+              </m:r>
+              <m:r>
+                <m:t>q</m:t>
+              </m:r>
+              <m:r>
+                <m:rPr>
+                  <m:sty m:val="p"/>
+                </m:rPr>
+                <m:t>=</m:t>
+              </m:r>
+              <m:r>
+                <m:t>8</m:t>
+              </m:r>
+            </m:oMath>
+            <w:r>
+              <w:t xml:space="preserve">)</w:t>
+            </w:r>
+          </w:p>
+        </w:tc>
+        <w:tc>
+          <w:tcPr/>
+          <w:p>
+            <w:pPr>
+              <w:pStyle w:val="Compact"/>
+              <w:jc w:val="left"/>
+              <w:keepNext/>
+            </w:pPr>
+            <w:r>
+              <w:t xml:space="preserve">Yes, for the sampled members</w:t>
+            </w:r>
+          </w:p>
+        </w:tc>
+        <w:tc>
+          <w:tcPr/>
+          <w:p>
+            <w:pPr>
+              <w:pStyle w:val="Compact"/>
+              <w:jc w:val="left"/>
+              <w:keepNext/>
+            </w:pPr>
+            <w:r>
+              <w:t xml:space="preserve">No (canary)</w:t>
+            </w:r>
+          </w:p>
+        </w:tc>
+        <w:tc>
+          <w:tcPr/>
+          <w:p>
+            <w:pPr>
+              <w:pStyle w:val="Compact"/>
+              <w:jc w:val="left"/>
+              <w:keepNext/>
+            </w:pPr>
+            <w:r>
+              <w:t xml:space="preserve">Yes, with probability 0.9807 (Eq. 2)</w:t>
+            </w:r>
+          </w:p>
+        </w:tc>
+        <w:tc>
+          <w:tcPr/>
+          <w:p>
+            <w:pPr>
+              <w:pStyle w:val="Compact"/>
+              <w:jc w:val="left"/>
+              <w:keepNext/>
+            </w:pPr>
+            <w:r>
+              <w:t xml:space="preserve">8 proofs + 8 verifications; 2125 ms CPU; 9,415 B</w:t>
+            </w:r>
+          </w:p>
+        </w:tc>
+      </w:tr>
+      <w:tr>
+        <w:trPr>
+          <w:cantSplit/>
+        </w:trPr>
+        <w:tc>
+          <w:tcPr/>
+          <w:p>
+            <w:pPr>
+              <w:pStyle w:val="Compact"/>
+              <w:jc w:val="left"/>
+            </w:pPr>
+            <w:r>
+              <w:t xml:space="preserve">Decrypt a real record as a test</w:t>
+            </w:r>
+          </w:p>
+        </w:tc>
+        <w:tc>
+          <w:tcPr/>
+          <w:p>
+            <w:pPr>
+              <w:pStyle w:val="Compact"/>
+              <w:jc w:val="left"/>
+            </w:pPr>
+            <w:r>
+              <w:t xml:space="preserve">Yes</w:t>
+            </w:r>
+          </w:p>
+        </w:tc>
+        <w:tc>
+          <w:tcPr/>
+          <w:p>
+            <w:pPr>
+              <w:pStyle w:val="Compact"/>
+              <w:jc w:val="left"/>
+            </w:pPr>
+            <w:r>
+              <w:t xml:space="preserve">Yes: exposes a production record</w:t>
+            </w:r>
+          </w:p>
+        </w:tc>
+        <w:tc>
+          <w:tcPr/>
+          <w:p>
+            <w:pPr>
+              <w:pStyle w:val="Compact"/>
+              <w:jc w:val="left"/>
+            </w:pPr>
+            <w:r>
+              <w:t xml:space="preserve">Yes</w:t>
+            </w:r>
+          </w:p>
+        </w:tc>
+        <w:tc>
+          <w:tcPr/>
+          <w:p>
+            <w:pPr>
+              <w:pStyle w:val="Compact"/>
+              <w:jc w:val="left"/>
+            </w:pPr>
+            <m:oMath>
+              <m:r>
+                <m:t>t</m:t>
+              </m:r>
+            </m:oMath>
+            <w:r>
+              <w:t xml:space="preserve"> </w:t>
+            </w:r>
+            <w:r>
+              <w:t xml:space="preserve">verifications plus a real disclosure; excluded by design</w:t>
+            </w:r>
+          </w:p>
+        </w:tc>
+      </w:tr>
+    </w:tbl>
+    <w:bookmarkEnd w:id="33"/>
+    <w:bookmarkEnd w:id="34"/>
+    <w:bookmarkStart w:id="39" w:name="deadline-liveness-in-an-emulated-testbed"/>
+    <w:p>
+      <w:pPr>
+        <w:pStyle w:val="Heading2"/>
+      </w:pPr>
+      <w:r>
+        <w:rPr>
+          <w:rStyle w:val="SectionNumber"/>
+        </w:rPr>
+        <w:t xml:space="preserve">6.3</w:t>
+      </w:r>
+      <w:r>
+        <w:tab/>
+      </w:r>
+      <w:r>
+        <w:t xml:space="preserve">Deadline liveness in an emulated testbed</w:t>
+      </w:r>
+    </w:p>
+    <w:p>
+      <w:pPr>
+        <w:pStyle w:val="FirstParagraph"/>
+      </w:pPr>
+      <w:r>
+        <w:t xml:space="preserve">The testbed runs 32 custodian processes, each an asyncio TCP server holding only its own ffdhe2048 share, and one combiner on the same host. Each trace performs one canary audit and one authorized dispute over a freshly sealed 1 KiB record. The combiner verifies each DLEQ proof on arrival, stops at</w:t>
+      </w:r>
+      <w:r>
+        <w:t xml:space="preserve"> </w:t>
+      </w:r>
+      <m:oMath>
+        <m:r>
+          <m:t>t</m:t>
+        </m:r>
+        <m:r>
+          <m:rPr>
+            <m:sty m:val="p"/>
+          </m:rPr>
+          <m:t>=</m:t>
+        </m:r>
+        <m:r>
+          <m:t>22</m:t>
+        </m:r>
+      </m:oMath>
+      <w:r>
+        <w:t xml:space="preserve"> </w:t>
+      </w:r>
+      <w:r>
+        <w:t xml:space="preserve">valid partials, combines, unwraps</w:t>
+      </w:r>
+      <w:r>
+        <w:t xml:space="preserve"> </w:t>
+      </w:r>
+      <m:oMath>
+        <m:sSub>
+          <m:e>
+            <m:r>
+              <m:t>K</m:t>
+            </m:r>
+          </m:e>
+          <m:sub>
+            <m:r>
+              <m:t>r</m:t>
+            </m:r>
+          </m:sub>
+        </m:sSub>
+      </m:oMath>
+      <w:r>
+        <w:t xml:space="preserve"> </w:t>
+      </w:r>
+      <w:r>
+        <w:t xml:space="preserve">and checks the decrypted plaintext. One-way delays are drawn per message from a lognormal law with the profile’s median; loss drops a message with no retransmission; crashed custodians never answer. Each of eight profiles ran 300 traces with seeds fixed before execution.</w:t>
+      </w:r>
+    </w:p>
+    <w:p>
+      <w:pPr>
+        <w:pStyle w:val="BodyText"/>
+      </w:pPr>
+      <w:r>
+        <w:t xml:space="preserve">Figure 3 and Table 5(b) report the results. The prespecified primary endpoint, success by</w:t>
+      </w:r>
+      <w:r>
+        <w:t xml:space="preserve"> </w:t>
+      </w:r>
+      <m:oMath>
+        <m:sSub>
+          <m:e>
+            <m:r>
+              <m:rPr>
+                <m:sty m:val="p"/>
+              </m:rPr>
+              <m:t>Δ</m:t>
+            </m:r>
+          </m:e>
+          <m:sub>
+            <m:r>
+              <m:t>d</m:t>
+            </m:r>
+          </m:sub>
+        </m:sSub>
+        <m:r>
+          <m:rPr>
+            <m:sty m:val="p"/>
+          </m:rPr>
+          <m:t>=</m:t>
+        </m:r>
+        <m:r>
+          <m:t>2</m:t>
+        </m:r>
+      </m:oMath>
+      <w:r>
+        <w:t xml:space="preserve"> s, was</w:t>
+      </w:r>
+      <w:r>
+        <w:t xml:space="preserve"> </w:t>
+      </w:r>
+      <m:oMath>
+        <m:r>
+          <m:t>0</m:t>
+        </m:r>
+        <m:r>
+          <m:rPr>
+            <m:sty m:val="p"/>
+          </m:rPr>
+          <m:t>%</m:t>
+        </m:r>
+      </m:oMath>
+      <w:r>
+        <w:t xml:space="preserve"> </w:t>
+      </w:r>
+      <w:r>
+        <w:t xml:space="preserve">in every profile: no dispute finished in under 3.5 s. Every reconstructable dispute finished within 5 s, with medians from 3.69 to 3.88 s and a slowest success of 4.48 s. Completion time is dominated by computation, not by the network. With no injected delay the median is 3818 ms, close to 22 serial proof verifications at the 135.4 ms measured in Table 7; adding a 120 ms-median one-way delay moved the median only to 3875 ms, because responses arrive while the combiner is still verifying earlier ones. A heavy-tailed delay law (</w:t>
+      </w:r>
+      <m:oMath>
+        <m:r>
+          <m:t>σ</m:t>
+        </m:r>
+        <m:r>
+          <m:rPr>
+            <m:sty m:val="p"/>
+          </m:rPr>
+          <m:t>=</m:t>
+        </m:r>
+        <m:r>
+          <m:t>1.2</m:t>
+        </m:r>
+      </m:oMath>
+      <w:r>
+        <w:t xml:space="preserve">) did not lengthen completion (95th percentile 3850 ms). Ten crashes (median 3692 ms) and a full domain outage (median 3700 ms) completed slightly faster than the fault-free global profile, which we attribute to fewer custodian processes competing for the shared host CPU. Eleven crashes defeated every dispute (0/300 succeeded).</w:t>
+      </w:r>
+    </w:p>
+    <w:bookmarkStart w:id="38" w:name="fig:deadline"/>
     <w:p>
       <w:pPr>
         <w:pStyle w:val="CaptionedFigure"/>
@@ -7187,18 +7964,18 @@
           <wp:inline>
             <wp:extent cx="5334000" cy="2515315"/>
             <wp:effectExtent b="0" l="0" r="0" t="0"/>
-            <wp:docPr descr="" title="" id="33" name="Picture"/>
+            <wp:docPr descr="" title="" id="36" name="Picture"/>
             <a:graphic>
               <a:graphicData uri="http://schemas.openxmlformats.org/drawingml/2006/picture">
                 <pic:pic>
                   <pic:nvPicPr>
-                    <pic:cNvPr descr="figures/fig3_dispute_success_vs_deadline.png" id="34" name="Picture"/>
+                    <pic:cNvPr descr="figures/fig3_dispute_success_vs_deadline.png" id="37" name="Picture"/>
                     <pic:cNvPicPr>
                       <a:picLocks noChangeArrowheads="1" noChangeAspect="1"/>
                     </pic:cNvPicPr>
                   </pic:nvPicPr>
                   <pic:blipFill>
-                    <a:blip r:embed="rId32"/>
+                    <a:blip r:embed="rId35"/>
                     <a:stretch>
                       <a:fillRect/>
                     </a:stretch>
@@ -7314,9 +8091,65 @@
         <w:t xml:space="preserve"> s.</w:t>
       </w:r>
     </w:p>
-    <w:bookmarkEnd w:id="35"/>
-    <w:bookmarkEnd w:id="36"/>
-    <w:bookmarkStart w:id="38" w:name="comparison-with-readiness-baselines"/>
+    <w:bookmarkEnd w:id="38"/>
+    <w:p>
+      <w:pPr>
+        <w:pStyle w:val="BodyText"/>
+      </w:pPr>
+      <w:r>
+        <w:t xml:space="preserve">The audit side reproduces Eq. (1) on real cryptography. A single audit took 1.24–1.43 s at the median. With ten crashed custodians the strict audit passed in 2.3% of traces against an exact expectation of 3.0%; with one domain down, 5.7% against 7.0%; with 2% message loss, 71.7% against 72.4%. In the crash and outage profiles the dispute nevertheless succeeded in every trace, the benign-alarm pattern of Section 5. One control trace timed out because the combiner was slowed by unrelated activity on the shared host; it is counted as a failure.</w:t>
+      </w:r>
+    </w:p>
+    <w:p>
+      <w:pPr>
+        <w:pStyle w:val="BodyText"/>
+      </w:pPr>
+      <w:r>
+        <w:t xml:space="preserve">The design implication is that</w:t>
+      </w:r>
+      <w:r>
+        <w:t xml:space="preserve"> </w:t>
+      </w:r>
+      <m:oMath>
+        <m:sSub>
+          <m:e>
+            <m:r>
+              <m:rPr>
+                <m:sty m:val="p"/>
+              </m:rPr>
+              <m:t>Δ</m:t>
+            </m:r>
+          </m:e>
+          <m:sub>
+            <m:r>
+              <m:t>d</m:t>
+            </m:r>
+          </m:sub>
+        </m:sSub>
+      </m:oMath>
+      <w:r>
+        <w:t xml:space="preserve"> </w:t>
+      </w:r>
+      <w:r>
+        <w:t xml:space="preserve">must budget for verifying</w:t>
+      </w:r>
+      <w:r>
+        <w:t xml:space="preserve"> </w:t>
+      </w:r>
+      <m:oMath>
+        <m:r>
+          <m:t>t</m:t>
+        </m:r>
+      </m:oMath>
+      <w:r>
+        <w:t xml:space="preserve"> </w:t>
+      </w:r>
+      <w:r>
+        <w:t xml:space="preserve">proofs at the combiner. We did not measure optimized, batched or parallel verification, which would shorten this term.</w:t>
+      </w:r>
+    </w:p>
+    <w:bookmarkEnd w:id="39"/>
+    <w:bookmarkStart w:id="53" w:name="robustness-under-failure-scenarios"/>
     <w:p>
       <w:pPr>
         <w:pStyle w:val="Heading2"/>
@@ -7325,13 +8158,13 @@
         <w:rPr>
           <w:rStyle w:val="SectionNumber"/>
         </w:rPr>
-        <w:t xml:space="preserve">6.2</w:t>
+        <w:t xml:space="preserve">6.4</w:t>
       </w:r>
       <w:r>
         <w:tab/>
       </w:r>
       <w:r>
-        <w:t xml:space="preserve">Comparison with readiness baselines</w:t>
+        <w:t xml:space="preserve">Robustness under failure scenarios</w:t>
       </w:r>
     </w:p>
     <w:p>
@@ -7339,637 +8172,10 @@
         <w:pStyle w:val="FirstParagraph"/>
       </w:pPr>
       <w:r>
-        <w:t xml:space="preserve">Table 4 compares the canary audit with the obvious alternatives. A heartbeat confirms only that a process responds; a custodian that has lost its share still answers, so a static catastrophic state of</w:t>
-      </w:r>
-      <w:r>
-        <w:t xml:space="preserve"> </w:t>
-      </w:r>
-      <m:oMath>
-        <m:r>
-          <m:t>t</m:t>
-        </m:r>
-        <m:r>
-          <m:rPr>
-            <m:sty m:val="p"/>
-          </m:rPr>
-          <m:t>−</m:t>
-        </m:r>
-        <m:r>
-          <m:t>1</m:t>
-        </m:r>
-      </m:oMath>
-      <w:r>
-        <w:t xml:space="preserve"> </w:t>
-      </w:r>
-      <w:r>
-        <w:t xml:space="preserve">share-holders is invisible to it. Share registration is checked once and says nothing about later share loss. Decrypting a real record would test the right capability but discloses a production record. A full-committee canary probe detects every static catastrophic state at four times KEYSTONE’s per-round cost at</w:t>
-      </w:r>
-      <w:r>
-        <w:t xml:space="preserve"> </w:t>
-      </w:r>
-      <m:oMath>
-        <m:r>
-          <m:t>n</m:t>
-        </m:r>
-        <m:r>
-          <m:rPr>
-            <m:sty m:val="p"/>
-          </m:rPr>
-          <m:t>=</m:t>
-        </m:r>
-        <m:r>
-          <m:t>32</m:t>
-        </m:r>
-      </m:oMath>
-      <w:r>
-        <w:t xml:space="preserve">; KEYSTONE trades that cost for the detection probability of Eq. (2).</w:t>
+        <w:t xml:space="preserve">Table 5(a) reports the prespecified simulation cells. Under 10% independent unavailability the committee reconstructs in 99.98% of draws, yet the strict audit passes in only 43.1%: the audit is a sensitive alarm, not an accurate health score. Under 20% domain outages, fixed-quota stratified sampling raised conditional detection of catastrophic draws from 99.89% to 100.00% and lowered the benign pass rate from 37.3% to 34.9%. The prespecified primary endpoint, the paired difference in detected catastrophes per draw, was 0.00021 (Hoeffding half-width 0.0075; all 28 discordant pairs favored stratification), so stratification’s benefit is real but small in this cell. With eleven selective withholders, audits passed in 100.0% of draws and disputes succeeded in 0.0% (upper 95% bound 0.0029%), confirming the second non-implication witness at the prespecified sample size.</w:t>
       </w:r>
     </w:p>
-    <w:bookmarkStart w:id="37" w:name="tab:baselines"/>
-    <w:p>
-      <w:pPr>
-        <w:pStyle w:val="TableCaption"/>
-        <w:keepNext/>
-      </w:pPr>
-      <w:r>
-        <w:t xml:space="preserve">Table 4. Readiness checks compared. Costs are measured medians for ffdhe2048 in the prototype (Table 7); bytes are canonical request plus response transcripts.</w:t>
-      </w:r>
-    </w:p>
-    <w:tbl>
-      <w:tblPr>
-        <w:tblStyle w:val="Table"/>
-        <w:tblW w:type="auto" w:w="0"/>
-        <w:tblLook w:firstRow="1" w:lastRow="0" w:firstColumn="0" w:lastColumn="0" w:noHBand="0" w:noVBand="0" w:val="0020"/>
-        <w:tblCaption w:val="Table 4. Readiness checks compared. Costs are measured medians for ffdhe2048 in the prototype (Table 7); bytes are canonical request plus response transcripts."/>
-      </w:tblPr>
-      <w:tblGrid>
-        <w:gridCol w:w="1584"/>
-        <w:gridCol w:w="1584"/>
-        <w:gridCol w:w="1584"/>
-        <w:gridCol w:w="1584"/>
-        <w:gridCol w:w="1584"/>
-      </w:tblGrid>
-      <w:tr>
-        <w:trPr>
-          <w:tblHeader w:val="on"/>
-          <w:cantSplit/>
-        </w:trPr>
-        <w:tc>
-          <w:tcPr/>
-          <w:p>
-            <w:pPr>
-              <w:pStyle w:val="Compact"/>
-              <w:jc w:val="left"/>
-              <w:keepNext/>
-            </w:pPr>
-            <w:r>
-              <w:t xml:space="preserve">Readiness check</w:t>
-            </w:r>
-          </w:p>
-        </w:tc>
-        <w:tc>
-          <w:tcPr/>
-          <w:p>
-            <w:pPr>
-              <w:pStyle w:val="Compact"/>
-              <w:jc w:val="left"/>
-              <w:keepNext/>
-            </w:pPr>
-            <w:r>
-              <w:t xml:space="preserve">Exercises the secret share?</w:t>
-            </w:r>
-          </w:p>
-        </w:tc>
-        <w:tc>
-          <w:tcPr/>
-          <w:p>
-            <w:pPr>
-              <w:pStyle w:val="Compact"/>
-              <w:jc w:val="left"/>
-              <w:keepNext/>
-            </w:pPr>
-            <w:r>
-              <w:t xml:space="preserve">Touches production ciphertext?</w:t>
-            </w:r>
-          </w:p>
-        </w:tc>
-        <w:tc>
-          <w:tcPr/>
-          <w:p>
-            <w:pPr>
-              <w:pStyle w:val="Compact"/>
-              <w:jc w:val="left"/>
-              <w:keepNext/>
-            </w:pPr>
-            <w:r>
-              <w:t xml:space="preserve">Detects a static state with</w:t>
-            </w:r>
-            <w:r>
-              <w:t xml:space="preserve"> </w:t>
-            </w:r>
-            <m:oMath>
-              <m:r>
-                <m:t>r</m:t>
-              </m:r>
-              <m:r>
-                <m:rPr>
-                  <m:sty m:val="p"/>
-                </m:rPr>
-                <m:t>=</m:t>
-              </m:r>
-              <m:r>
-                <m:t>t</m:t>
-              </m:r>
-              <m:r>
-                <m:rPr>
-                  <m:sty m:val="p"/>
-                </m:rPr>
-                <m:t>−</m:t>
-              </m:r>
-              <m:r>
-                <m:t>1</m:t>
-              </m:r>
-            </m:oMath>
-            <w:r>
-              <w:t xml:space="preserve"> </w:t>
-            </w:r>
-            <w:r>
-              <w:t xml:space="preserve">ready shares</w:t>
-            </w:r>
-          </w:p>
-        </w:tc>
-        <w:tc>
-          <w:tcPr/>
-          <w:p>
-            <w:pPr>
-              <w:pStyle w:val="Compact"/>
-              <w:jc w:val="left"/>
-              <w:keepNext/>
-            </w:pPr>
-            <w:r>
-              <w:t xml:space="preserve">Cost per check (</w:t>
-            </w:r>
-            <m:oMath>
-              <m:r>
-                <m:t>n</m:t>
-              </m:r>
-              <m:r>
-                <m:rPr>
-                  <m:sty m:val="p"/>
-                </m:rPr>
-                <m:t>=</m:t>
-              </m:r>
-              <m:r>
-                <m:t>32</m:t>
-              </m:r>
-            </m:oMath>
-            <w:r>
-              <w:t xml:space="preserve">, ffdhe2048, measured)</w:t>
-            </w:r>
-          </w:p>
-        </w:tc>
-      </w:tr>
-      <w:tr>
-        <w:trPr>
-          <w:cantSplit/>
-        </w:trPr>
-        <w:tc>
-          <w:tcPr/>
-          <w:p>
-            <w:pPr>
-              <w:pStyle w:val="Compact"/>
-              <w:jc w:val="left"/>
-              <w:keepNext/>
-            </w:pPr>
-            <w:r>
-              <w:t xml:space="preserve">Liveness heartbeat</w:t>
-            </w:r>
-          </w:p>
-        </w:tc>
-        <w:tc>
-          <w:tcPr/>
-          <w:p>
-            <w:pPr>
-              <w:pStyle w:val="Compact"/>
-              <w:jc w:val="left"/>
-              <w:keepNext/>
-            </w:pPr>
-            <w:r>
-              <w:t xml:space="preserve">No</w:t>
-            </w:r>
-          </w:p>
-        </w:tc>
-        <w:tc>
-          <w:tcPr/>
-          <w:p>
-            <w:pPr>
-              <w:pStyle w:val="Compact"/>
-              <w:jc w:val="left"/>
-              <w:keepNext/>
-            </w:pPr>
-            <w:r>
-              <w:t xml:space="preserve">No</w:t>
-            </w:r>
-          </w:p>
-        </w:tc>
-        <w:tc>
-          <w:tcPr/>
-          <w:p>
-            <w:pPr>
-              <w:pStyle w:val="Compact"/>
-              <w:jc w:val="left"/>
-              <w:keepNext/>
-            </w:pPr>
-            <w:r>
-              <w:t xml:space="preserve">No: a node that lost its share still answers</w:t>
-            </w:r>
-          </w:p>
-        </w:tc>
-        <w:tc>
-          <w:tcPr/>
-          <w:p>
-            <w:pPr>
-              <w:pStyle w:val="Compact"/>
-              <w:jc w:val="left"/>
-              <w:keepNext/>
-            </w:pPr>
-            <w:r>
-              <w:t xml:space="preserve">1 message per node; no group operations</w:t>
-            </w:r>
-          </w:p>
-        </w:tc>
-      </w:tr>
-      <w:tr>
-        <w:trPr>
-          <w:cantSplit/>
-        </w:trPr>
-        <w:tc>
-          <w:tcPr/>
-          <w:p>
-            <w:pPr>
-              <w:pStyle w:val="Compact"/>
-              <w:jc w:val="left"/>
-              <w:keepNext/>
-            </w:pPr>
-            <w:r>
-              <w:t xml:space="preserve">Share registration (Feldman/PVSS check)</w:t>
-            </w:r>
-          </w:p>
-        </w:tc>
-        <w:tc>
-          <w:tcPr/>
-          <w:p>
-            <w:pPr>
-              <w:pStyle w:val="Compact"/>
-              <w:jc w:val="left"/>
-              <w:keepNext/>
-            </w:pPr>
-            <w:r>
-              <w:t xml:space="preserve">Once, at setup</w:t>
-            </w:r>
-          </w:p>
-        </w:tc>
-        <w:tc>
-          <w:tcPr/>
-          <w:p>
-            <w:pPr>
-              <w:pStyle w:val="Compact"/>
-              <w:jc w:val="left"/>
-              <w:keepNext/>
-            </w:pPr>
-            <w:r>
-              <w:t xml:space="preserve">No</w:t>
-            </w:r>
-          </w:p>
-        </w:tc>
-        <w:tc>
-          <w:tcPr/>
-          <w:p>
-            <w:pPr>
-              <w:pStyle w:val="Compact"/>
-              <w:jc w:val="left"/>
-              <w:keepNext/>
-            </w:pPr>
-            <w:r>
-              <w:t xml:space="preserve">No: says nothing about later share loss</w:t>
-            </w:r>
-          </w:p>
-        </w:tc>
-        <w:tc>
-          <w:tcPr/>
-          <w:p>
-            <w:pPr>
-              <w:pStyle w:val="Compact"/>
-              <w:jc w:val="left"/>
-              <w:keepNext/>
-            </w:pPr>
-            <w:r>
-              <w:t xml:space="preserve">One-time</w:t>
-            </w:r>
-            <w:r>
-              <w:t xml:space="preserve"> </w:t>
-            </w:r>
-            <m:oMath>
-              <m:r>
-                <m:t>O</m:t>
-              </m:r>
-              <m:r>
-                <m:rPr>
-                  <m:sty m:val="p"/>
-                </m:rPr>
-                <m:t>(</m:t>
-              </m:r>
-              <m:r>
-                <m:t>n</m:t>
-              </m:r>
-              <m:r>
-                <m:t>t</m:t>
-              </m:r>
-              <m:r>
-                <m:rPr>
-                  <m:sty m:val="p"/>
-                </m:rPr>
-                <m:t>)</m:t>
-              </m:r>
-            </m:oMath>
-            <w:r>
-              <w:t xml:space="preserve"> </w:t>
-            </w:r>
-            <w:r>
-              <w:t xml:space="preserve">exponentiations at epoch setup</w:t>
-            </w:r>
-          </w:p>
-        </w:tc>
-      </w:tr>
-      <w:tr>
-        <w:trPr>
-          <w:cantSplit/>
-        </w:trPr>
-        <w:tc>
-          <w:tcPr/>
-          <w:p>
-            <w:pPr>
-              <w:pStyle w:val="Compact"/>
-              <w:jc w:val="left"/>
-              <w:keepNext/>
-            </w:pPr>
-            <w:r>
-              <w:t xml:space="preserve">Full-committee canary probe</w:t>
-            </w:r>
-          </w:p>
-        </w:tc>
-        <w:tc>
-          <w:tcPr/>
-          <w:p>
-            <w:pPr>
-              <w:pStyle w:val="Compact"/>
-              <w:jc w:val="left"/>
-              <w:keepNext/>
-            </w:pPr>
-            <w:r>
-              <w:t xml:space="preserve">Yes</w:t>
-            </w:r>
-          </w:p>
-        </w:tc>
-        <w:tc>
-          <w:tcPr/>
-          <w:p>
-            <w:pPr>
-              <w:pStyle w:val="Compact"/>
-              <w:jc w:val="left"/>
-              <w:keepNext/>
-            </w:pPr>
-            <w:r>
-              <w:t xml:space="preserve">No (canary)</w:t>
-            </w:r>
-          </w:p>
-        </w:tc>
-        <w:tc>
-          <w:tcPr/>
-          <w:p>
-            <w:pPr>
-              <w:pStyle w:val="Compact"/>
-              <w:jc w:val="left"/>
-              <w:keepNext/>
-            </w:pPr>
-            <w:r>
-              <w:t xml:space="preserve">Yes, with probability 1</w:t>
-            </w:r>
-          </w:p>
-        </w:tc>
-        <w:tc>
-          <w:tcPr/>
-          <w:p>
-            <w:pPr>
-              <w:pStyle w:val="Compact"/>
-              <w:jc w:val="left"/>
-              <w:keepNext/>
-            </w:pPr>
-            <w:r>
-              <w:t xml:space="preserve">32 proofs + 32 verifications; 8501 ms CPU; 36,991 B</w:t>
-            </w:r>
-          </w:p>
-        </w:tc>
-      </w:tr>
-      <w:tr>
-        <w:trPr>
-          <w:cantSplit/>
-        </w:trPr>
-        <w:tc>
-          <w:tcPr/>
-          <w:p>
-            <w:pPr>
-              <w:pStyle w:val="Compact"/>
-              <w:jc w:val="left"/>
-              <w:keepNext/>
-            </w:pPr>
-            <w:r>
-              <w:t xml:space="preserve">KEYSTONE sampled canary (</w:t>
-            </w:r>
-            <m:oMath>
-              <m:r>
-                <m:t>s</m:t>
-              </m:r>
-              <m:r>
-                <m:rPr>
-                  <m:sty m:val="p"/>
-                </m:rPr>
-                <m:t>=</m:t>
-              </m:r>
-              <m:r>
-                <m:t>q</m:t>
-              </m:r>
-              <m:r>
-                <m:rPr>
-                  <m:sty m:val="p"/>
-                </m:rPr>
-                <m:t>=</m:t>
-              </m:r>
-              <m:r>
-                <m:t>8</m:t>
-              </m:r>
-            </m:oMath>
-            <w:r>
-              <w:t xml:space="preserve">)</w:t>
-            </w:r>
-          </w:p>
-        </w:tc>
-        <w:tc>
-          <w:tcPr/>
-          <w:p>
-            <w:pPr>
-              <w:pStyle w:val="Compact"/>
-              <w:jc w:val="left"/>
-              <w:keepNext/>
-            </w:pPr>
-            <w:r>
-              <w:t xml:space="preserve">Yes, for the sampled members</w:t>
-            </w:r>
-          </w:p>
-        </w:tc>
-        <w:tc>
-          <w:tcPr/>
-          <w:p>
-            <w:pPr>
-              <w:pStyle w:val="Compact"/>
-              <w:jc w:val="left"/>
-              <w:keepNext/>
-            </w:pPr>
-            <w:r>
-              <w:t xml:space="preserve">No (canary)</w:t>
-            </w:r>
-          </w:p>
-        </w:tc>
-        <w:tc>
-          <w:tcPr/>
-          <w:p>
-            <w:pPr>
-              <w:pStyle w:val="Compact"/>
-              <w:jc w:val="left"/>
-              <w:keepNext/>
-            </w:pPr>
-            <w:r>
-              <w:t xml:space="preserve">Yes, with probability 0.9807 (Eq. 2)</w:t>
-            </w:r>
-          </w:p>
-        </w:tc>
-        <w:tc>
-          <w:tcPr/>
-          <w:p>
-            <w:pPr>
-              <w:pStyle w:val="Compact"/>
-              <w:jc w:val="left"/>
-              <w:keepNext/>
-            </w:pPr>
-            <w:r>
-              <w:t xml:space="preserve">8 proofs + 8 verifications; 2125 ms CPU; 9,415 B</w:t>
-            </w:r>
-          </w:p>
-        </w:tc>
-      </w:tr>
-      <w:tr>
-        <w:trPr>
-          <w:cantSplit/>
-        </w:trPr>
-        <w:tc>
-          <w:tcPr/>
-          <w:p>
-            <w:pPr>
-              <w:pStyle w:val="Compact"/>
-              <w:jc w:val="left"/>
-            </w:pPr>
-            <w:r>
-              <w:t xml:space="preserve">Decrypt a real record as a test</w:t>
-            </w:r>
-          </w:p>
-        </w:tc>
-        <w:tc>
-          <w:tcPr/>
-          <w:p>
-            <w:pPr>
-              <w:pStyle w:val="Compact"/>
-              <w:jc w:val="left"/>
-            </w:pPr>
-            <w:r>
-              <w:t xml:space="preserve">Yes</w:t>
-            </w:r>
-          </w:p>
-        </w:tc>
-        <w:tc>
-          <w:tcPr/>
-          <w:p>
-            <w:pPr>
-              <w:pStyle w:val="Compact"/>
-              <w:jc w:val="left"/>
-            </w:pPr>
-            <w:r>
-              <w:t xml:space="preserve">Yes: exposes a production record</w:t>
-            </w:r>
-          </w:p>
-        </w:tc>
-        <w:tc>
-          <w:tcPr/>
-          <w:p>
-            <w:pPr>
-              <w:pStyle w:val="Compact"/>
-              <w:jc w:val="left"/>
-            </w:pPr>
-            <w:r>
-              <w:t xml:space="preserve">Yes</w:t>
-            </w:r>
-          </w:p>
-        </w:tc>
-        <w:tc>
-          <w:tcPr/>
-          <w:p>
-            <w:pPr>
-              <w:pStyle w:val="Compact"/>
-              <w:jc w:val="left"/>
-            </w:pPr>
-            <m:oMath>
-              <m:r>
-                <m:t>t</m:t>
-              </m:r>
-            </m:oMath>
-            <w:r>
-              <w:t xml:space="preserve"> </w:t>
-            </w:r>
-            <w:r>
-              <w:t xml:space="preserve">verifications plus a real disclosure; excluded by design</w:t>
-            </w:r>
-          </w:p>
-        </w:tc>
-      </w:tr>
-    </w:tbl>
-    <w:bookmarkEnd w:id="37"/>
-    <w:bookmarkEnd w:id="38"/>
-    <w:bookmarkStart w:id="48" w:name="robustness-under-failure-scenarios"/>
-    <w:p>
-      <w:pPr>
-        <w:pStyle w:val="Heading2"/>
-      </w:pPr>
-      <w:r>
-        <w:rPr>
-          <w:rStyle w:val="SectionNumber"/>
-        </w:rPr>
-        <w:t xml:space="preserve">6.3</w:t>
-      </w:r>
-      <w:r>
-        <w:tab/>
-      </w:r>
-      <w:r>
-        <w:t xml:space="preserve">Robustness under failure scenarios</w:t>
-      </w:r>
-    </w:p>
-    <w:p>
-      <w:pPr>
-        <w:pStyle w:val="FirstParagraph"/>
-      </w:pPr>
-      <w:r>
-        <w:t xml:space="preserve">Table 5(a) reports the prespecified simulation cells. Under 10% independent unavailability the committee reconstructs in 99.98% of draws, yet the strict audit passes in only 43.1%: the audit is a sensitive alarm, not an accurate health score. Under 20% domain outages, fixed-quota stratified sampling raised conditional detection of catastrophic draws from 99.89% to 100.00% and lowered the benign pass rate from 37.3% to 34.9%. The prespecified primary endpoint, the paired difference in detected catastrophes per draw, was 0.00021 (Hoeffding half-width 0.0075; all 28 discordant pairs favored stratification), so stratification’s benefit is real but small in this cell. With eleven selective withholders, audits passed in 100.0% of draws and disputes succeeded in 0.0% (upper 95% bound 0.0029%), confirming the second non-implication witness at the prespecified sample size.</w:t>
-      </w:r>
-    </w:p>
-    <w:bookmarkStart w:id="39" w:name="tab:robustness"/>
+    <w:bookmarkStart w:id="40" w:name="tab:robustness"/>
     <w:p>
       <w:pPr>
         <w:pStyle w:val="TableCaption"/>
@@ -9344,7 +9550,7 @@
         </w:tc>
       </w:tr>
     </w:tbl>
-    <w:bookmarkEnd w:id="39"/>
+    <w:bookmarkEnd w:id="40"/>
     <w:p>
       <w:pPr>
         <w:pStyle w:val="BodyText"/>
@@ -9402,7 +9608,7 @@
         <w:t xml:space="preserve">) with 94.8%, and two domains of sixteen, which violate the cap, with only 81.0%. These are exact values under a declared synthetic model; real domain labels and their independence are assumptions.</w:t>
       </w:r>
     </w:p>
-    <w:bookmarkStart w:id="43" w:name="fig:correlation"/>
+    <w:bookmarkStart w:id="44" w:name="fig:correlation"/>
     <w:p>
       <w:pPr>
         <w:pStyle w:val="CaptionedFigure"/>
@@ -9412,18 +9618,18 @@
           <wp:inline>
             <wp:extent cx="5334000" cy="2462530"/>
             <wp:effectExtent b="0" l="0" r="0" t="0"/>
-            <wp:docPr descr="" title="" id="41" name="Picture"/>
+            <wp:docPr descr="" title="" id="42" name="Picture"/>
             <a:graphic>
               <a:graphicData uri="http://schemas.openxmlformats.org/drawingml/2006/picture">
                 <pic:pic>
                   <pic:nvPicPr>
-                    <pic:cNvPr descr="figures/fig4_iid_vs_correlated.png" id="42" name="Picture"/>
+                    <pic:cNvPr descr="figures/fig4_iid_vs_correlated.png" id="43" name="Picture"/>
                     <pic:cNvPicPr>
                       <a:picLocks noChangeArrowheads="1" noChangeAspect="1"/>
                     </pic:cNvPicPr>
                   </pic:nvPicPr>
                   <pic:blipFill>
-                    <a:blip r:embed="rId40"/>
+                    <a:blip r:embed="rId41"/>
                     <a:stretch>
                       <a:fillRect/>
                     </a:stretch>
@@ -9569,8 +9775,8 @@
         <w:t xml:space="preserve">.</w:t>
       </w:r>
     </w:p>
-    <w:bookmarkEnd w:id="43"/>
-    <w:bookmarkStart w:id="47" w:name="fig:withholding"/>
+    <w:bookmarkEnd w:id="44"/>
+    <w:bookmarkStart w:id="48" w:name="fig:withholding"/>
     <w:p>
       <w:pPr>
         <w:pStyle w:val="CaptionedFigure"/>
@@ -9580,18 +9786,18 @@
           <wp:inline>
             <wp:extent cx="3033728" cy="2305878"/>
             <wp:effectExtent b="0" l="0" r="0" t="0"/>
-            <wp:docPr descr="" title="" id="45" name="Picture"/>
+            <wp:docPr descr="" title="" id="46" name="Picture"/>
             <a:graphic>
               <a:graphicData uri="http://schemas.openxmlformats.org/drawingml/2006/picture">
                 <pic:pic>
                   <pic:nvPicPr>
-                    <pic:cNvPr descr="figures/fig5_audit_vs_dispute_withholding.png" id="46" name="Picture"/>
+                    <pic:cNvPr descr="figures/fig5_audit_vs_dispute_withholding.png" id="47" name="Picture"/>
                     <pic:cNvPicPr>
                       <a:picLocks noChangeArrowheads="1" noChangeAspect="1"/>
                     </pic:cNvPicPr>
                   </pic:nvPicPr>
                   <pic:blipFill>
-                    <a:blip r:embed="rId44"/>
+                    <a:blip r:embed="rId45"/>
                     <a:stretch>
                       <a:fillRect/>
                     </a:stretch>
@@ -9669,213 +9875,7 @@
         <w:t xml:space="preserve">072-draw simulation cell.</w:t>
       </w:r>
     </w:p>
-    <w:bookmarkEnd w:id="47"/>
     <w:bookmarkEnd w:id="48"/>
-    <w:bookmarkStart w:id="53" w:name="deadline-liveness-in-an-emulated-testbed"/>
-    <w:p>
-      <w:pPr>
-        <w:pStyle w:val="Heading2"/>
-      </w:pPr>
-      <w:r>
-        <w:rPr>
-          <w:rStyle w:val="SectionNumber"/>
-        </w:rPr>
-        <w:t xml:space="preserve">6.4</w:t>
-      </w:r>
-      <w:r>
-        <w:tab/>
-      </w:r>
-      <w:r>
-        <w:t xml:space="preserve">Deadline liveness in an emulated testbed</w:t>
-      </w:r>
-    </w:p>
-    <w:p>
-      <w:pPr>
-        <w:pStyle w:val="FirstParagraph"/>
-      </w:pPr>
-      <w:r>
-        <w:t xml:space="preserve">The testbed runs 32 custodian processes, each an asyncio TCP server holding only its own ffdhe2048 share, and one combiner on the same host. Each trace performs one canary audit and one authorized dispute over a freshly sealed 1 KiB record. The combiner verifies each DLEQ proof on arrival, stops at</w:t>
-      </w:r>
-      <w:r>
-        <w:t xml:space="preserve"> </w:t>
-      </w:r>
-      <m:oMath>
-        <m:r>
-          <m:t>t</m:t>
-        </m:r>
-        <m:r>
-          <m:rPr>
-            <m:sty m:val="p"/>
-          </m:rPr>
-          <m:t>=</m:t>
-        </m:r>
-        <m:r>
-          <m:t>22</m:t>
-        </m:r>
-      </m:oMath>
-      <w:r>
-        <w:t xml:space="preserve"> </w:t>
-      </w:r>
-      <w:r>
-        <w:t xml:space="preserve">valid partials, combines, unwraps</w:t>
-      </w:r>
-      <w:r>
-        <w:t xml:space="preserve"> </w:t>
-      </w:r>
-      <m:oMath>
-        <m:sSub>
-          <m:e>
-            <m:r>
-              <m:t>K</m:t>
-            </m:r>
-          </m:e>
-          <m:sub>
-            <m:r>
-              <m:t>r</m:t>
-            </m:r>
-          </m:sub>
-        </m:sSub>
-      </m:oMath>
-      <w:r>
-        <w:t xml:space="preserve"> </w:t>
-      </w:r>
-      <w:r>
-        <w:t xml:space="preserve">and checks the decrypted plaintext. One-way delays are drawn per message from a lognormal law with the profile’s median; loss drops a message with no retransmission; crashed custodians never answer. Each of eight profiles ran 300 traces with seeds fixed before execution.</w:t>
-      </w:r>
-    </w:p>
-    <w:p>
-      <w:pPr>
-        <w:pStyle w:val="BodyText"/>
-      </w:pPr>
-      <w:r>
-        <w:t xml:space="preserve">Figure 3 and Table 5(b) report the results. The prespecified primary endpoint, success by</w:t>
-      </w:r>
-      <w:r>
-        <w:t xml:space="preserve"> </w:t>
-      </w:r>
-      <m:oMath>
-        <m:sSub>
-          <m:e>
-            <m:r>
-              <m:rPr>
-                <m:sty m:val="p"/>
-              </m:rPr>
-              <m:t>Δ</m:t>
-            </m:r>
-          </m:e>
-          <m:sub>
-            <m:r>
-              <m:t>d</m:t>
-            </m:r>
-          </m:sub>
-        </m:sSub>
-        <m:r>
-          <m:rPr>
-            <m:sty m:val="p"/>
-          </m:rPr>
-          <m:t>=</m:t>
-        </m:r>
-        <m:r>
-          <m:t>2</m:t>
-        </m:r>
-      </m:oMath>
-      <w:r>
-        <w:t xml:space="preserve"> s, was</w:t>
-      </w:r>
-      <w:r>
-        <w:t xml:space="preserve"> </w:t>
-      </w:r>
-      <m:oMath>
-        <m:r>
-          <m:t>0</m:t>
-        </m:r>
-        <m:r>
-          <m:rPr>
-            <m:sty m:val="p"/>
-          </m:rPr>
-          <m:t>%</m:t>
-        </m:r>
-      </m:oMath>
-      <w:r>
-        <w:t xml:space="preserve"> </w:t>
-      </w:r>
-      <w:r>
-        <w:t xml:space="preserve">in every profile: no dispute finished in under 3.5 s. Every reconstructable dispute finished within 5 s, with medians from 3.69 to 3.88 s and a slowest success of 4.48 s. Completion time is dominated by computation, not by the network. With no injected delay the median is 3818 ms, close to 22 serial proof verifications at the 135.4 ms measured in Table 7; adding a 120 ms-median one-way delay moved the median only to 3875 ms, because responses arrive while the combiner is still verifying earlier ones. A heavy-tailed delay law (</w:t>
-      </w:r>
-      <m:oMath>
-        <m:r>
-          <m:t>σ</m:t>
-        </m:r>
-        <m:r>
-          <m:rPr>
-            <m:sty m:val="p"/>
-          </m:rPr>
-          <m:t>=</m:t>
-        </m:r>
-        <m:r>
-          <m:t>1.2</m:t>
-        </m:r>
-      </m:oMath>
-      <w:r>
-        <w:t xml:space="preserve">) did not lengthen completion (95th percentile 3850 ms). Ten crashes (median 3692 ms) and a full domain outage (median 3700 ms) completed slightly faster than the fault-free global profile, which we attribute to fewer custodian processes competing for the shared host CPU. Eleven crashes defeated every dispute (0/300 succeeded).</w:t>
-      </w:r>
-    </w:p>
-    <w:p>
-      <w:pPr>
-        <w:pStyle w:val="BodyText"/>
-      </w:pPr>
-      <w:r>
-        <w:t xml:space="preserve">The audit side reproduces Eq. (1) on real cryptography. A single audit took 1.24–1.43 s at the median. With ten crashed custodians the strict audit passed in 2.3% of traces against an exact expectation of 3.0%; with one domain down, 5.7% against 7.0%; with 2% message loss, 71.7% against 72.4%. In the crash and outage profiles the dispute nevertheless succeeded in every trace, the benign-alarm pattern of Section 5. One control trace timed out because the combiner was slowed by unrelated activity on the shared host; it is counted as a failure.</w:t>
-      </w:r>
-    </w:p>
-    <w:p>
-      <w:pPr>
-        <w:pStyle w:val="BodyText"/>
-      </w:pPr>
-      <w:r>
-        <w:t xml:space="preserve">The design implication is that</w:t>
-      </w:r>
-      <w:r>
-        <w:t xml:space="preserve"> </w:t>
-      </w:r>
-      <m:oMath>
-        <m:sSub>
-          <m:e>
-            <m:r>
-              <m:rPr>
-                <m:sty m:val="p"/>
-              </m:rPr>
-              <m:t>Δ</m:t>
-            </m:r>
-          </m:e>
-          <m:sub>
-            <m:r>
-              <m:t>d</m:t>
-            </m:r>
-          </m:sub>
-        </m:sSub>
-      </m:oMath>
-      <w:r>
-        <w:t xml:space="preserve"> </w:t>
-      </w:r>
-      <w:r>
-        <w:t xml:space="preserve">must budget for verifying</w:t>
-      </w:r>
-      <w:r>
-        <w:t xml:space="preserve"> </w:t>
-      </w:r>
-      <m:oMath>
-        <m:r>
-          <m:t>t</m:t>
-        </m:r>
-      </m:oMath>
-      <w:r>
-        <w:t xml:space="preserve"> </w:t>
-      </w:r>
-      <w:r>
-        <w:t xml:space="preserve">proofs at the combiner. We did not measure optimized, batched or parallel verification, which would shorten this term.</w:t>
-      </w:r>
-    </w:p>
     <w:bookmarkStart w:id="52" w:name="fig:acceptance"/>
     <w:p>
       <w:pPr>

</xml_diff>